<commit_message>
Polish Tata Motors report for internship: logo, history, products
- Premium cover and TATA Motors brand logo graphics
- Detailed history timeline (1945-2025) with section 4.1-4.6
- Product showcase images and internship value section for ECE
- Executive summary and FY25 research from public disclosures
- Regenerated Word, PDF, and ZIP downloads

Co-authored-by: Sumit Kaktwan <Sumit211995@users.noreply.github.com>
</commit_message>
<xml_diff>
--- a/tata-motors-project/output/TATA_Motors_Diploma_Project.docx
+++ b/tata-motors-project/output/TATA_Motors_Diploma_Project.docx
@@ -9,7 +9,7 @@
       <w:r>
         <w:drawing>
           <wp:inline xmlns:a="http://schemas.openxmlformats.org/drawingml/2006/main" xmlns:pic="http://schemas.openxmlformats.org/drawingml/2006/picture">
-            <wp:extent cx="5943600" cy="1981200"/>
+            <wp:extent cx="6217920" cy="2309513"/>
             <wp:docPr id="1" name="Picture 1"/>
             <wp:cNvGraphicFramePr>
               <a:graphicFrameLocks noChangeAspect="1"/>
@@ -18,7 +18,7 @@
               <a:graphicData uri="http://schemas.openxmlformats.org/drawingml/2006/picture">
                 <pic:pic>
                   <pic:nvPicPr>
-                    <pic:cNvPr id="0" name="cover_banner.png"/>
+                    <pic:cNvPr id="0" name="cover_premium.png"/>
                     <pic:cNvPicPr/>
                   </pic:nvPicPr>
                   <pic:blipFill>
@@ -30,7 +30,46 @@
                   <pic:spPr>
                     <a:xfrm>
                       <a:off x="0" y="0"/>
-                      <a:ext cx="5943600" cy="1981200"/>
+                      <a:ext cx="6217920" cy="2309513"/>
+                    </a:xfrm>
+                    <a:prstGeom prst="rect"/>
+                  </pic:spPr>
+                </pic:pic>
+              </a:graphicData>
+            </a:graphic>
+          </wp:inline>
+        </w:drawing>
+      </w:r>
+    </w:p>
+    <w:p>
+      <w:pPr>
+        <w:jc w:val="center"/>
+      </w:pPr>
+      <w:r>
+        <w:drawing>
+          <wp:inline xmlns:a="http://schemas.openxmlformats.org/drawingml/2006/main" xmlns:pic="http://schemas.openxmlformats.org/drawingml/2006/picture">
+            <wp:extent cx="2926080" cy="1012874"/>
+            <wp:docPr id="2" name="Picture 2"/>
+            <wp:cNvGraphicFramePr>
+              <a:graphicFrameLocks noChangeAspect="1"/>
+            </wp:cNvGraphicFramePr>
+            <a:graphic>
+              <a:graphicData uri="http://schemas.openxmlformats.org/drawingml/2006/picture">
+                <pic:pic>
+                  <pic:nvPicPr>
+                    <pic:cNvPr id="0" name="tata_logo_brand.png"/>
+                    <pic:cNvPicPr/>
+                  </pic:nvPicPr>
+                  <pic:blipFill>
+                    <a:blip r:embed="rId10"/>
+                    <a:stretch>
+                      <a:fillRect/>
+                    </a:stretch>
+                  </pic:blipFill>
+                  <pic:spPr>
+                    <a:xfrm>
+                      <a:off x="0" y="0"/>
+                      <a:ext cx="2926080" cy="1012874"/>
                     </a:xfrm>
                     <a:prstGeom prst="rect"/>
                   </pic:spPr>
@@ -360,6 +399,99 @@
           <w:color w:val="003366"/>
           <w:sz w:val="32"/>
         </w:rPr>
+        <w:t>Executive Summary</w:t>
+      </w:r>
+    </w:p>
+    <w:p>
+      <w:pPr>
+        <w:spacing w:after="160" w:line="276" w:lineRule="auto"/>
+      </w:pPr>
+      <w:r>
+        <w:rPr>
+          <w:rFonts w:ascii="Calibri" w:hAnsi="Calibri" w:eastAsia="Calibri"/>
+          <w:b w:val="0"/>
+          <w:sz w:val="22"/>
+        </w:rPr>
+        <w:t>Tata Motors Limited is India's flagship automotive company under the Tata Group, with leadership in commercial vehicles, a top-three position in passenger vehicles, and dominant market share in passenger electric vehicles. This report presents a structured study of the company's history, business segments, product portfolio, manufacturing methodologies, research areas, and future opportunities—prepared to support a diploma internship application in Electronics and Communication Engineering.</w:t>
+      </w:r>
+    </w:p>
+    <w:p>
+      <w:pPr>
+        <w:spacing w:after="160" w:line="276" w:lineRule="auto"/>
+      </w:pPr>
+      <w:r>
+        <w:rPr>
+          <w:rFonts w:ascii="Calibri" w:hAnsi="Calibri" w:eastAsia="Calibri"/>
+          <w:b w:val="0"/>
+          <w:sz w:val="22"/>
+        </w:rPr>
+        <w:t>Public disclosures for FY2024–25 highlight milestones such as 6 million cumulative passenger vehicle sales, 200,000+ cumulative EV sales, expansion at Sanand, and groundwork for a new Tamil Nadu manufacturing facility. The company's multi-powertrain strategy (petrol, diesel, CNG, electric, and alternate fuels including hydrogen ICE trucks) aligns with India's mobility and sustainability goals. For ECE students, Tata Motors offers exposure to vehicle electronics, wiring harnesses, ECUs, battery management, production testing, and plant safety systems—making it a strong choice for industrial training.</w:t>
+      </w:r>
+    </w:p>
+    <w:p>
+      <w:pPr>
+        <w:jc w:val="center"/>
+      </w:pPr>
+      <w:r>
+        <w:drawing>
+          <wp:inline xmlns:a="http://schemas.openxmlformats.org/drawingml/2006/main" xmlns:pic="http://schemas.openxmlformats.org/drawingml/2006/picture">
+            <wp:extent cx="5303520" cy="2919916"/>
+            <wp:docPr id="3" name="Picture 3"/>
+            <wp:cNvGraphicFramePr>
+              <a:graphicFrameLocks noChangeAspect="1"/>
+            </wp:cNvGraphicFramePr>
+            <a:graphic>
+              <a:graphicData uri="http://schemas.openxmlformats.org/drawingml/2006/picture">
+                <pic:pic>
+                  <pic:nvPicPr>
+                    <pic:cNvPr id="0" name="internship_value.png"/>
+                    <pic:cNvPicPr/>
+                  </pic:nvPicPr>
+                  <pic:blipFill>
+                    <a:blip r:embed="rId11"/>
+                    <a:stretch>
+                      <a:fillRect/>
+                    </a:stretch>
+                  </pic:blipFill>
+                  <pic:spPr>
+                    <a:xfrm>
+                      <a:off x="0" y="0"/>
+                      <a:ext cx="5303520" cy="2919916"/>
+                    </a:xfrm>
+                    <a:prstGeom prst="rect"/>
+                  </pic:spPr>
+                </pic:pic>
+              </a:graphicData>
+            </a:graphic>
+          </wp:inline>
+        </w:drawing>
+      </w:r>
+    </w:p>
+    <w:p>
+      <w:pPr>
+        <w:jc w:val="center"/>
+      </w:pPr>
+      <w:r>
+        <w:rPr>
+          <w:rFonts w:ascii="Calibri" w:hAnsi="Calibri" w:eastAsia="Calibri"/>
+          <w:b w:val="0"/>
+          <w:color w:val="505050"/>
+          <w:sz w:val="18"/>
+        </w:rPr>
+        <w:t>Figure A: Value of internship at Tata Motors for diploma students</w:t>
+      </w:r>
+    </w:p>
+    <w:p>
+      <w:pPr>
+        <w:spacing w:before="240" w:after="120"/>
+      </w:pPr>
+      <w:r>
+        <w:rPr>
+          <w:rFonts w:ascii="Calibri" w:hAnsi="Calibri" w:eastAsia="Calibri"/>
+          <w:b/>
+          <w:color w:val="003366"/>
+          <w:sz w:val="32"/>
+        </w:rPr>
         <w:t>1. Introduction</w:t>
       </w:r>
     </w:p>
@@ -469,9 +601,14 @@
         <w:tc>
           <w:tcPr>
             <w:tcW w:type="dxa" w:w="4680"/>
+            <w:shd w:fill="003366"/>
           </w:tcPr>
           <w:p>
             <w:r>
+              <w:rPr>
+                <w:b/>
+                <w:color w:val="FFFFFF"/>
+              </w:rPr>
               <w:t>Company name</w:t>
             </w:r>
           </w:p>
@@ -479,9 +616,14 @@
         <w:tc>
           <w:tcPr>
             <w:tcW w:type="dxa" w:w="4680"/>
+            <w:shd w:fill="003366"/>
           </w:tcPr>
           <w:p>
             <w:r>
+              <w:rPr>
+                <w:b/>
+                <w:color w:val="FFFFFF"/>
+              </w:rPr>
               <w:t>Tata Motors Limited (group; segment structure evolved in FY25–26)</w:t>
             </w:r>
           </w:p>
@@ -712,7 +854,7 @@
         <w:drawing>
           <wp:inline xmlns:a="http://schemas.openxmlformats.org/drawingml/2006/main" xmlns:pic="http://schemas.openxmlformats.org/drawingml/2006/picture">
             <wp:extent cx="5303520" cy="2935956"/>
-            <wp:docPr id="2" name="Picture 2"/>
+            <wp:docPr id="4" name="Picture 4"/>
             <wp:cNvGraphicFramePr>
               <a:graphicFrameLocks noChangeAspect="1"/>
             </wp:cNvGraphicFramePr>
@@ -724,7 +866,7 @@
                     <pic:cNvPicPr/>
                   </pic:nvPicPr>
                   <pic:blipFill>
-                    <a:blip r:embed="rId10"/>
+                    <a:blip r:embed="rId12"/>
                     <a:stretch>
                       <a:fillRect/>
                     </a:stretch>
@@ -765,7 +907,7 @@
         <w:drawing>
           <wp:inline xmlns:a="http://schemas.openxmlformats.org/drawingml/2006/main" xmlns:pic="http://schemas.openxmlformats.org/drawingml/2006/picture">
             <wp:extent cx="5303520" cy="3978759"/>
-            <wp:docPr id="3" name="Picture 3"/>
+            <wp:docPr id="5" name="Picture 5"/>
             <wp:cNvGraphicFramePr>
               <a:graphicFrameLocks noChangeAspect="1"/>
             </wp:cNvGraphicFramePr>
@@ -777,7 +919,7 @@
                     <pic:cNvPicPr/>
                   </pic:nvPicPr>
                   <pic:blipFill>
-                    <a:blip r:embed="rId11"/>
+                    <a:blip r:embed="rId13"/>
                     <a:stretch>
                       <a:fillRect/>
                     </a:stretch>
@@ -818,7 +960,7 @@
         <w:drawing>
           <wp:inline xmlns:a="http://schemas.openxmlformats.org/drawingml/2006/main" xmlns:pic="http://schemas.openxmlformats.org/drawingml/2006/picture">
             <wp:extent cx="5303520" cy="2282528"/>
-            <wp:docPr id="4" name="Picture 4"/>
+            <wp:docPr id="6" name="Picture 6"/>
             <wp:cNvGraphicFramePr>
               <a:graphicFrameLocks noChangeAspect="1"/>
             </wp:cNvGraphicFramePr>
@@ -830,7 +972,7 @@
                     <pic:cNvPicPr/>
                   </pic:nvPicPr>
                   <pic:blipFill>
-                    <a:blip r:embed="rId12"/>
+                    <a:blip r:embed="rId14"/>
                     <a:stretch>
                       <a:fillRect/>
                     </a:stretch>
@@ -1122,8 +1264,8 @@
       <w:r>
         <w:drawing>
           <wp:inline xmlns:a="http://schemas.openxmlformats.org/drawingml/2006/main" xmlns:pic="http://schemas.openxmlformats.org/drawingml/2006/picture">
-            <wp:extent cx="5669280" cy="1665184"/>
-            <wp:docPr id="5" name="Picture 5"/>
+            <wp:extent cx="5486400" cy="1611468"/>
+            <wp:docPr id="7" name="Picture 7"/>
             <wp:cNvGraphicFramePr>
               <a:graphicFrameLocks noChangeAspect="1"/>
             </wp:cNvGraphicFramePr>
@@ -1135,7 +1277,7 @@
                     <pic:cNvPicPr/>
                   </pic:nvPicPr>
                   <pic:blipFill>
-                    <a:blip r:embed="rId13"/>
+                    <a:blip r:embed="rId15"/>
                     <a:stretch>
                       <a:fillRect/>
                     </a:stretch>
@@ -1143,7 +1285,7 @@
                   <pic:spPr>
                     <a:xfrm>
                       <a:off x="0" y="0"/>
-                      <a:ext cx="5669280" cy="1665184"/>
+                      <a:ext cx="5486400" cy="1611468"/>
                     </a:xfrm>
                     <a:prstGeom prst="rect"/>
                   </pic:spPr>
@@ -1165,7 +1307,74 @@
           <w:color w:val="505050"/>
           <w:sz w:val="18"/>
         </w:rPr>
-        <w:t>Figure 4: Key milestones in Tata Motors history</w:t>
+        <w:t>Figure 4: Key milestones (overview)</w:t>
+      </w:r>
+    </w:p>
+    <w:p>
+      <w:pPr>
+        <w:jc w:val="center"/>
+      </w:pPr>
+      <w:r>
+        <w:drawing>
+          <wp:inline xmlns:a="http://schemas.openxmlformats.org/drawingml/2006/main" xmlns:pic="http://schemas.openxmlformats.org/drawingml/2006/picture">
+            <wp:extent cx="5669280" cy="6241935"/>
+            <wp:docPr id="8" name="Picture 8"/>
+            <wp:cNvGraphicFramePr>
+              <a:graphicFrameLocks noChangeAspect="1"/>
+            </wp:cNvGraphicFramePr>
+            <a:graphic>
+              <a:graphicData uri="http://schemas.openxmlformats.org/drawingml/2006/picture">
+                <pic:pic>
+                  <pic:nvPicPr>
+                    <pic:cNvPr id="0" name="history_detailed.png"/>
+                    <pic:cNvPicPr/>
+                  </pic:nvPicPr>
+                  <pic:blipFill>
+                    <a:blip r:embed="rId16"/>
+                    <a:stretch>
+                      <a:fillRect/>
+                    </a:stretch>
+                  </pic:blipFill>
+                  <pic:spPr>
+                    <a:xfrm>
+                      <a:off x="0" y="0"/>
+                      <a:ext cx="5669280" cy="6241935"/>
+                    </a:xfrm>
+                    <a:prstGeom prst="rect"/>
+                  </pic:spPr>
+                </pic:pic>
+              </a:graphicData>
+            </a:graphic>
+          </wp:inline>
+        </w:drawing>
+      </w:r>
+    </w:p>
+    <w:p>
+      <w:pPr>
+        <w:jc w:val="center"/>
+      </w:pPr>
+      <w:r>
+        <w:rPr>
+          <w:rFonts w:ascii="Calibri" w:hAnsi="Calibri" w:eastAsia="Calibri"/>
+          <w:b w:val="0"/>
+          <w:color w:val="505050"/>
+          <w:sz w:val="18"/>
+        </w:rPr>
+        <w:t>Figure 5: Detailed historical timeline (1945–2025)</w:t>
+      </w:r>
+    </w:p>
+    <w:p>
+      <w:pPr>
+        <w:spacing w:before="160" w:after="120"/>
+      </w:pPr>
+      <w:r>
+        <w:rPr>
+          <w:rFonts w:ascii="Calibri" w:hAnsi="Calibri" w:eastAsia="Calibri"/>
+          <w:b/>
+          <w:color w:val="003366"/>
+          <w:sz w:val="28"/>
+        </w:rPr>
+        <w:t>4.1 Early foundation: 1945</w:t>
       </w:r>
     </w:p>
     <w:p>
@@ -1178,7 +1387,21 @@
           <w:b w:val="0"/>
           <w:sz w:val="22"/>
         </w:rPr>
-        <w:t>1945 — Tata Engineering and Locomotive Company (TELCO) founded; early focus on locomotives and engineering.</w:t>
+        <w:t>Tata Motors was established in 1945 as Tata Engineering and Locomotive Company Limited (TELCO). Its initial activities were associated with locomotives and engineering products, building industrial capability that later supported vehicle manufacturing.</w:t>
+      </w:r>
+    </w:p>
+    <w:p>
+      <w:pPr>
+        <w:spacing w:before="160" w:after="120"/>
+      </w:pPr>
+      <w:r>
+        <w:rPr>
+          <w:rFonts w:ascii="Calibri" w:hAnsi="Calibri" w:eastAsia="Calibri"/>
+          <w:b/>
+          <w:color w:val="003366"/>
+          <w:sz w:val="28"/>
+        </w:rPr>
+        <w:t>4.2 Entry into commercial vehicles: 1950s</w:t>
       </w:r>
     </w:p>
     <w:p>
@@ -1191,7 +1414,21 @@
           <w:b w:val="0"/>
           <w:sz w:val="22"/>
         </w:rPr>
-        <w:t>1950s — Entry into commercial vehicles through collaboration with Daimler-Benz.</w:t>
+        <w:t>The company entered the commercial vehicle sector through collaboration with Daimler-Benz of Germany (1954), marking the beginning of India's organised truck manufacturing ecosystem.</w:t>
+      </w:r>
+    </w:p>
+    <w:p>
+      <w:pPr>
+        <w:spacing w:before="160" w:after="120"/>
+      </w:pPr>
+      <w:r>
+        <w:rPr>
+          <w:rFonts w:ascii="Calibri" w:hAnsi="Calibri" w:eastAsia="Calibri"/>
+          <w:b/>
+          <w:color w:val="003366"/>
+          <w:sz w:val="28"/>
+        </w:rPr>
+        <w:t>4.3 Expansion into passenger vehicles</w:t>
       </w:r>
     </w:p>
     <w:p>
@@ -1204,7 +1441,21 @@
           <w:b w:val="0"/>
           <w:sz w:val="22"/>
         </w:rPr>
-        <w:t>1998 — Launch of Tata Indica, an important indigenous passenger car milestone.</w:t>
+        <w:t>Passenger vehicles expanded the business beyond commercial transport. The Tata Indica (1998) became a significant milestone as a fully indigenous Indian passenger car. Earlier, Tata Sierra (1991) signalled entry into the passenger segment with an SUV.</w:t>
+      </w:r>
+    </w:p>
+    <w:p>
+      <w:pPr>
+        <w:spacing w:before="160" w:after="120"/>
+      </w:pPr>
+      <w:r>
+        <w:rPr>
+          <w:rFonts w:ascii="Calibri" w:hAnsi="Calibri" w:eastAsia="Calibri"/>
+          <w:b/>
+          <w:color w:val="003366"/>
+          <w:sz w:val="28"/>
+        </w:rPr>
+        <w:t>4.4 International expansion: 2000s</w:t>
       </w:r>
     </w:p>
     <w:p>
@@ -1217,7 +1468,21 @@
           <w:b w:val="0"/>
           <w:sz w:val="22"/>
         </w:rPr>
-        <w:t>2004 — Acquisition of Daewoo Commercial Vehicle Company (South Korea), expanding international CV footprint.</w:t>
+        <w:t>In 2004, Tata Motors acquired Daewoo Commercial Vehicle Company in South Korea. In 2008, it acquired Jaguar Land Rover from Ford Motor Company—a landmark global acquisition that added luxury brands and advanced engineering capabilities.</w:t>
+      </w:r>
+    </w:p>
+    <w:p>
+      <w:pPr>
+        <w:spacing w:before="160" w:after="120"/>
+      </w:pPr>
+      <w:r>
+        <w:rPr>
+          <w:rFonts w:ascii="Calibri" w:hAnsi="Calibri" w:eastAsia="Calibri"/>
+          <w:b/>
+          <w:color w:val="003366"/>
+          <w:sz w:val="28"/>
+        </w:rPr>
+        <w:t>4.5 Development of modern vehicles</w:t>
       </w:r>
     </w:p>
     <w:p>
@@ -1230,7 +1495,21 @@
           <w:b w:val="0"/>
           <w:sz w:val="22"/>
         </w:rPr>
-        <w:t>2008 — Acquisition of Jaguar Land Rover, transforming global brand and technology access.</w:t>
+        <w:t>The company introduced products focused on styling, fuel efficiency, safety, comfort, and technology. IMPACT and IMPACT 2.0 design philosophies shaped models such as Tiago, Nexon, Harrier, Safari, and Punch. Tata Ace (2005) revolutionised last-mile logistics; Tata Ultra (2014) strengthened intermediate commercial trucks.</w:t>
+      </w:r>
+    </w:p>
+    <w:p>
+      <w:pPr>
+        <w:spacing w:before="160" w:after="120"/>
+      </w:pPr>
+      <w:r>
+        <w:rPr>
+          <w:rFonts w:ascii="Calibri" w:hAnsi="Calibri" w:eastAsia="Calibri"/>
+          <w:b/>
+          <w:color w:val="003366"/>
+          <w:sz w:val="28"/>
+        </w:rPr>
+        <w:t>4.6 Electric mobility and digital manufacturing</w:t>
       </w:r>
     </w:p>
     <w:p>
@@ -1243,20 +1522,7 @@
           <w:b w:val="0"/>
           <w:sz w:val="22"/>
         </w:rPr>
-        <w:t>2010s–2020s — Modern PV lineup (Tiago, Nexon, Harrier, Punch), safety focus, and rapid EV scaling.</w:t>
-      </w:r>
-    </w:p>
-    <w:p>
-      <w:pPr>
-        <w:spacing w:after="160" w:line="276" w:lineRule="auto"/>
-      </w:pPr>
-      <w:r>
-        <w:rPr>
-          <w:rFonts w:ascii="Calibri" w:hAnsi="Calibri" w:eastAsia="Calibri"/>
-          <w:b w:val="0"/>
-          <w:sz w:val="22"/>
-        </w:rPr>
-        <w:t>2025 — Business demerger separating CV and PV strategies; continued investment in EV, CNG, and digital manufacturing.</w:t>
+        <w:t>Tata Motors invested in battery-electric vehicles, ZIPTRON powertrain (Nexon EV, 2019), acti.ev platform, charging partnerships, connected features, and smarter factories with automation and AI (as described in FY2024–25 annual reporting). FY25 milestones include 36% CNG+EV share in PV portfolio, hydrogen ICE truck unveil, Curvv launch, and commencement of work on the Tamil Nadu plant.</w:t>
       </w:r>
     </w:p>
     <w:p>
@@ -1281,7 +1547,7 @@
         <w:drawing>
           <wp:inline xmlns:a="http://schemas.openxmlformats.org/drawingml/2006/main" xmlns:pic="http://schemas.openxmlformats.org/drawingml/2006/picture">
             <wp:extent cx="5669280" cy="1374371"/>
-            <wp:docPr id="6" name="Picture 6"/>
+            <wp:docPr id="9" name="Picture 9"/>
             <wp:cNvGraphicFramePr>
               <a:graphicFrameLocks noChangeAspect="1"/>
             </wp:cNvGraphicFramePr>
@@ -1293,7 +1559,7 @@
                     <pic:cNvPicPr/>
                   </pic:nvPicPr>
                   <pic:blipFill>
-                    <a:blip r:embed="rId14"/>
+                    <a:blip r:embed="rId17"/>
                     <a:stretch>
                       <a:fillRect/>
                     </a:stretch>
@@ -1624,9 +1890,14 @@
         <w:tc>
           <w:tcPr>
             <w:tcW w:type="dxa" w:w="3120"/>
+            <w:shd w:fill="003366"/>
           </w:tcPr>
           <w:p>
             <w:r>
+              <w:rPr>
+                <w:b/>
+                <w:color w:val="FFFFFF"/>
+              </w:rPr>
               <w:t>Segment</w:t>
             </w:r>
           </w:p>
@@ -1634,9 +1905,14 @@
         <w:tc>
           <w:tcPr>
             <w:tcW w:type="dxa" w:w="3120"/>
+            <w:shd w:fill="003366"/>
           </w:tcPr>
           <w:p>
             <w:r>
+              <w:rPr>
+                <w:b/>
+                <w:color w:val="FFFFFF"/>
+              </w:rPr>
               <w:t>Category</w:t>
             </w:r>
           </w:p>
@@ -1644,9 +1920,14 @@
         <w:tc>
           <w:tcPr>
             <w:tcW w:type="dxa" w:w="3120"/>
+            <w:shd w:fill="003366"/>
           </w:tcPr>
           <w:p>
             <w:r>
+              <w:rPr>
+                <w:b/>
+                <w:color w:val="FFFFFF"/>
+              </w:rPr>
               <w:t>Examples</w:t>
             </w:r>
           </w:p>
@@ -1815,13 +2096,79 @@
     </w:tbl>
     <w:p>
       <w:pPr>
+        <w:spacing w:after="160" w:line="276" w:lineRule="auto"/>
+      </w:pPr>
+      <w:r>
+        <w:rPr>
+          <w:rFonts w:ascii="Calibri" w:hAnsi="Calibri" w:eastAsia="Calibri"/>
+          <w:b w:val="0"/>
+          <w:sz w:val="22"/>
+        </w:rPr>
+        <w:t>Tata Motors serves individual customers, businesses, logistics operators, and public transport authorities. Passenger offerings span affordable hatchbacks to premium SUVs; commercial offerings span mini-trucks to heavy haulage and electric buses; the EV line supports personal and fleet electrification.</w:t>
+      </w:r>
+    </w:p>
+    <w:p>
+      <w:pPr>
+        <w:jc w:val="center"/>
+      </w:pPr>
+      <w:r>
+        <w:drawing>
+          <wp:inline xmlns:a="http://schemas.openxmlformats.org/drawingml/2006/main" xmlns:pic="http://schemas.openxmlformats.org/drawingml/2006/picture">
+            <wp:extent cx="5852160" cy="3446869"/>
+            <wp:docPr id="10" name="Picture 10"/>
+            <wp:cNvGraphicFramePr>
+              <a:graphicFrameLocks noChangeAspect="1"/>
+            </wp:cNvGraphicFramePr>
+            <a:graphic>
+              <a:graphicData uri="http://schemas.openxmlformats.org/drawingml/2006/picture">
+                <pic:pic>
+                  <pic:nvPicPr>
+                    <pic:cNvPr id="0" name="products_showcase.png"/>
+                    <pic:cNvPicPr/>
+                  </pic:nvPicPr>
+                  <pic:blipFill>
+                    <a:blip r:embed="rId18"/>
+                    <a:stretch>
+                      <a:fillRect/>
+                    </a:stretch>
+                  </pic:blipFill>
+                  <pic:spPr>
+                    <a:xfrm>
+                      <a:off x="0" y="0"/>
+                      <a:ext cx="5852160" cy="3446869"/>
+                    </a:xfrm>
+                    <a:prstGeom prst="rect"/>
+                  </pic:spPr>
+                </pic:pic>
+              </a:graphicData>
+            </a:graphic>
+          </wp:inline>
+        </w:drawing>
+      </w:r>
+    </w:p>
+    <w:p>
+      <w:pPr>
+        <w:jc w:val="center"/>
+      </w:pPr>
+      <w:r>
+        <w:rPr>
+          <w:rFonts w:ascii="Calibri" w:hAnsi="Calibri" w:eastAsia="Calibri"/>
+          <w:b w:val="0"/>
+          <w:color w:val="505050"/>
+          <w:sz w:val="18"/>
+        </w:rPr>
+        <w:t>Figure 6: Key products with segment description (visual catalogue)</w:t>
+      </w:r>
+    </w:p>
+    <w:p>
+      <w:pPr>
         <w:jc w:val="center"/>
       </w:pPr>
       <w:r>
         <w:drawing>
           <wp:inline xmlns:a="http://schemas.openxmlformats.org/drawingml/2006/main" xmlns:pic="http://schemas.openxmlformats.org/drawingml/2006/picture">
             <wp:extent cx="5669280" cy="4399531"/>
-            <wp:docPr id="7" name="Picture 7"/>
+            <wp:docPr id="11" name="Picture 11"/>
             <wp:cNvGraphicFramePr>
               <a:graphicFrameLocks noChangeAspect="1"/>
             </wp:cNvGraphicFramePr>
@@ -1833,7 +2180,7 @@
                     <pic:cNvPicPr/>
                   </pic:nvPicPr>
                   <pic:blipFill>
-                    <a:blip r:embed="rId15"/>
+                    <a:blip r:embed="rId19"/>
                     <a:stretch>
                       <a:fillRect/>
                     </a:stretch>
@@ -1863,7 +2210,7 @@
           <w:color w:val="505050"/>
           <w:sz w:val="18"/>
         </w:rPr>
-        <w:t>Figure 6: Representative product families across segments</w:t>
+        <w:t>Figure 7: Representative product families across segments</w:t>
       </w:r>
     </w:p>
     <w:p>
@@ -1874,7 +2221,7 @@
         <w:drawing>
           <wp:inline xmlns:a="http://schemas.openxmlformats.org/drawingml/2006/main" xmlns:pic="http://schemas.openxmlformats.org/drawingml/2006/picture">
             <wp:extent cx="5303520" cy="2324014"/>
-            <wp:docPr id="8" name="Picture 8"/>
+            <wp:docPr id="12" name="Picture 12"/>
             <wp:cNvGraphicFramePr>
               <a:graphicFrameLocks noChangeAspect="1"/>
             </wp:cNvGraphicFramePr>
@@ -1886,7 +2233,7 @@
                     <pic:cNvPicPr/>
                   </pic:nvPicPr>
                   <pic:blipFill>
-                    <a:blip r:embed="rId16"/>
+                    <a:blip r:embed="rId20"/>
                     <a:stretch>
                       <a:fillRect/>
                     </a:stretch>
@@ -1916,7 +2263,7 @@
           <w:color w:val="505050"/>
           <w:sz w:val="18"/>
         </w:rPr>
-        <w:t>Figure 7: Electric mobility value chain</w:t>
+        <w:t>Figure 8: Electric mobility value chain</w:t>
       </w:r>
     </w:p>
     <w:p>
@@ -2045,7 +2392,7 @@
         <w:drawing>
           <wp:inline xmlns:a="http://schemas.openxmlformats.org/drawingml/2006/main" xmlns:pic="http://schemas.openxmlformats.org/drawingml/2006/picture">
             <wp:extent cx="5029200" cy="3119377"/>
-            <wp:docPr id="9" name="Picture 9"/>
+            <wp:docPr id="13" name="Picture 13"/>
             <wp:cNvGraphicFramePr>
               <a:graphicFrameLocks noChangeAspect="1"/>
             </wp:cNvGraphicFramePr>
@@ -2057,7 +2404,7 @@
                     <pic:cNvPicPr/>
                   </pic:nvPicPr>
                   <pic:blipFill>
-                    <a:blip r:embed="rId17"/>
+                    <a:blip r:embed="rId21"/>
                     <a:stretch>
                       <a:fillRect/>
                     </a:stretch>
@@ -2087,7 +2434,7 @@
           <w:color w:val="505050"/>
           <w:sz w:val="18"/>
         </w:rPr>
-        <w:t>Figure 8: Electronics integration in modern vehicles (ECE perspective)</w:t>
+        <w:t>Figure 9: Electronics integration in modern vehicles (ECE perspective)</w:t>
       </w:r>
     </w:p>
     <w:p>
@@ -2125,7 +2472,7 @@
         <w:drawing>
           <wp:inline xmlns:a="http://schemas.openxmlformats.org/drawingml/2006/main" xmlns:pic="http://schemas.openxmlformats.org/drawingml/2006/picture">
             <wp:extent cx="4754880" cy="5443993"/>
-            <wp:docPr id="10" name="Picture 10"/>
+            <wp:docPr id="14" name="Picture 14"/>
             <wp:cNvGraphicFramePr>
               <a:graphicFrameLocks noChangeAspect="1"/>
             </wp:cNvGraphicFramePr>
@@ -2137,7 +2484,7 @@
                     <pic:cNvPicPr/>
                   </pic:nvPicPr>
                   <pic:blipFill>
-                    <a:blip r:embed="rId18"/>
+                    <a:blip r:embed="rId22"/>
                     <a:stretch>
                       <a:fillRect/>
                     </a:stretch>
@@ -2167,7 +2514,86 @@
           <w:color w:val="505050"/>
           <w:sz w:val="18"/>
         </w:rPr>
-        <w:t>Figure 9: Major Tata Motors locations in India (schematic)</w:t>
+        <w:t>Figure 10: Major Tata Motors locations in India (schematic)</w:t>
+      </w:r>
+    </w:p>
+    <w:p>
+      <w:pPr>
+        <w:spacing w:before="160" w:after="120"/>
+      </w:pPr>
+      <w:r>
+        <w:rPr>
+          <w:rFonts w:ascii="Calibri" w:hAnsi="Calibri" w:eastAsia="Calibri"/>
+          <w:b/>
+          <w:color w:val="003366"/>
+          <w:sz w:val="28"/>
+        </w:rPr>
+        <w:t>6.3 Internship and learning opportunities (ECE)</w:t>
+      </w:r>
+    </w:p>
+    <w:p>
+      <w:pPr>
+        <w:spacing w:after="160" w:line="276" w:lineRule="auto"/>
+      </w:pPr>
+      <w:r>
+        <w:rPr>
+          <w:rFonts w:ascii="Calibri" w:hAnsi="Calibri" w:eastAsia="Calibri"/>
+          <w:b w:val="0"/>
+          <w:sz w:val="22"/>
+        </w:rPr>
+        <w:t>Tata Motors runs structured student programmes (campus hiring, internships, graduate engineer trainees) with exposure to manufacturing, quality, production, and engineering functions. Diploma interns in electronics-related domains may observe trim-and-chassis fitment, electrical harness routing, earthing and safety checks, ECU flashing, heating elements, connector quality, end-of-line electrical testing, and cross-functional coordination with quality and supply chain—similar to industrial projects reported at PV plants in Pune and manufacturing internships at Sanand.</w:t>
+      </w:r>
+    </w:p>
+    <w:p>
+      <w:pPr>
+        <w:spacing w:after="160" w:line="276" w:lineRule="auto"/>
+      </w:pPr>
+      <w:r>
+        <w:rPr>
+          <w:rFonts w:ascii="Calibri" w:hAnsi="Calibri" w:eastAsia="Calibri"/>
+          <w:b w:val="0"/>
+          <w:sz w:val="22"/>
+        </w:rPr>
+        <w:t>Official portal: joinus.tatamotors.com (Student Programmes). Institutes typically coordinate industrial visits and internships through the training and placement cell with company HR.</w:t>
+      </w:r>
+    </w:p>
+    <w:p>
+      <w:pPr>
+        <w:pStyle w:val="ListBullet"/>
+      </w:pPr>
+      <w:r>
+        <w:rPr>
+          <w:rFonts w:ascii="Calibri" w:hAnsi="Calibri" w:eastAsia="Calibri"/>
+          <w:b w:val="0"/>
+          <w:sz w:val="22"/>
+        </w:rPr>
+        <w:t>Suggested internship focus for ECE: wiring harness safety, ECU diagnostics, BMS awareness (EV lines), PLC/automation in body shop.</w:t>
+      </w:r>
+    </w:p>
+    <w:p>
+      <w:pPr>
+        <w:pStyle w:val="ListBullet"/>
+      </w:pPr>
+      <w:r>
+        <w:rPr>
+          <w:rFonts w:ascii="Calibri" w:hAnsi="Calibri" w:eastAsia="Calibri"/>
+          <w:b w:val="0"/>
+          <w:sz w:val="22"/>
+        </w:rPr>
+        <w:t>Soft skills: safety culture, teamwork across departments, documentation and presentation of findings.</w:t>
+      </w:r>
+    </w:p>
+    <w:p>
+      <w:pPr>
+        <w:pStyle w:val="ListBullet"/>
+      </w:pPr>
+      <w:r>
+        <w:rPr>
+          <w:rFonts w:ascii="Calibri" w:hAnsi="Calibri" w:eastAsia="Calibri"/>
+          <w:b w:val="0"/>
+          <w:sz w:val="22"/>
+        </w:rPr>
+        <w:t>Career alignment: production engineering, quality, automotive electronics, and vehicle testing.</w:t>
       </w:r>
     </w:p>
     <w:p>

</xml_diff>

<commit_message>
Rebuild Tata Motors report using student PDF logo and photos
- Extract official Tata Motors logo and images from uploaded reference PDF
- Match clean cover layout and section structure; fix overlapping text
- Product section with image+text rows like original file
- Regenerate Word, PDF, and ZIP downloads

Co-authored-by: Sumit Kaktwan <Sumit211995@users.noreply.github.com>
</commit_message>
<xml_diff>
--- a/tata-motors-project/output/TATA_Motors_Diploma_Project.docx
+++ b/tata-motors-project/output/TATA_Motors_Diploma_Project.docx
@@ -7,38 +7,13 @@
         <w:jc w:val="center"/>
       </w:pPr>
       <w:r>
-        <w:drawing>
-          <wp:inline xmlns:a="http://schemas.openxmlformats.org/drawingml/2006/main" xmlns:pic="http://schemas.openxmlformats.org/drawingml/2006/picture">
-            <wp:extent cx="6217920" cy="2309513"/>
-            <wp:docPr id="1" name="Picture 1"/>
-            <wp:cNvGraphicFramePr>
-              <a:graphicFrameLocks noChangeAspect="1"/>
-            </wp:cNvGraphicFramePr>
-            <a:graphic>
-              <a:graphicData uri="http://schemas.openxmlformats.org/drawingml/2006/picture">
-                <pic:pic>
-                  <pic:nvPicPr>
-                    <pic:cNvPr id="0" name="cover_premium.png"/>
-                    <pic:cNvPicPr/>
-                  </pic:nvPicPr>
-                  <pic:blipFill>
-                    <a:blip r:embed="rId9"/>
-                    <a:stretch>
-                      <a:fillRect/>
-                    </a:stretch>
-                  </pic:blipFill>
-                  <pic:spPr>
-                    <a:xfrm>
-                      <a:off x="0" y="0"/>
-                      <a:ext cx="6217920" cy="2309513"/>
-                    </a:xfrm>
-                    <a:prstGeom prst="rect"/>
-                  </pic:spPr>
-                </pic:pic>
-              </a:graphicData>
-            </a:graphic>
-          </wp:inline>
-        </w:drawing>
+        <w:rPr>
+          <w:rFonts w:ascii="Calibri" w:hAnsi="Calibri" w:eastAsia="Calibri"/>
+          <w:b/>
+          <w:color w:val="003366"/>
+          <w:sz w:val="26"/>
+        </w:rPr>
+        <w:t>DIPLOMA FINAL-YEAR INTERNSHIP</w:t>
       </w:r>
     </w:p>
     <w:p>
@@ -46,38 +21,13 @@
         <w:jc w:val="center"/>
       </w:pPr>
       <w:r>
-        <w:drawing>
-          <wp:inline xmlns:a="http://schemas.openxmlformats.org/drawingml/2006/main" xmlns:pic="http://schemas.openxmlformats.org/drawingml/2006/picture">
-            <wp:extent cx="2926080" cy="1012874"/>
-            <wp:docPr id="2" name="Picture 2"/>
-            <wp:cNvGraphicFramePr>
-              <a:graphicFrameLocks noChangeAspect="1"/>
-            </wp:cNvGraphicFramePr>
-            <a:graphic>
-              <a:graphicData uri="http://schemas.openxmlformats.org/drawingml/2006/picture">
-                <pic:pic>
-                  <pic:nvPicPr>
-                    <pic:cNvPr id="0" name="tata_logo_brand.png"/>
-                    <pic:cNvPicPr/>
-                  </pic:nvPicPr>
-                  <pic:blipFill>
-                    <a:blip r:embed="rId10"/>
-                    <a:stretch>
-                      <a:fillRect/>
-                    </a:stretch>
-                  </pic:blipFill>
-                  <pic:spPr>
-                    <a:xfrm>
-                      <a:off x="0" y="0"/>
-                      <a:ext cx="2926080" cy="1012874"/>
-                    </a:xfrm>
-                    <a:prstGeom prst="rect"/>
-                  </pic:spPr>
-                </pic:pic>
-              </a:graphicData>
-            </a:graphic>
-          </wp:inline>
-        </w:drawing>
+        <w:rPr>
+          <w:rFonts w:ascii="Calibri" w:hAnsi="Calibri" w:eastAsia="Calibri"/>
+          <w:b/>
+          <w:color w:val="505050"/>
+          <w:sz w:val="24"/>
+        </w:rPr>
+        <w:t>COMPANY RESEARCH REPORT</w:t>
       </w:r>
     </w:p>
     <w:p/>
@@ -90,23 +40,7 @@
           <w:rFonts w:ascii="Calibri" w:hAnsi="Calibri" w:eastAsia="Calibri"/>
           <w:b/>
           <w:color w:val="003366"/>
-          <w:sz w:val="28"/>
-        </w:rPr>
-        <w:t>DIPLOMA FINAL-YEAR INTERNSHIP</w:t>
-        <w:br/>
-        <w:t>COMPANY RESEARCH REPORT</w:t>
-      </w:r>
-    </w:p>
-    <w:p>
-      <w:pPr>
-        <w:jc w:val="center"/>
-      </w:pPr>
-      <w:r>
-        <w:rPr>
-          <w:rFonts w:ascii="Calibri" w:hAnsi="Calibri" w:eastAsia="Calibri"/>
-          <w:b/>
-          <w:color w:val="C8102E"/>
-          <w:sz w:val="32"/>
+          <w:sz w:val="36"/>
         </w:rPr>
         <w:t>TATA MOTORS LIMITED</w:t>
       </w:r>
@@ -119,6 +53,7 @@
         <w:rPr>
           <w:rFonts w:ascii="Calibri" w:hAnsi="Calibri" w:eastAsia="Calibri"/>
           <w:b w:val="0"/>
+          <w:color w:val="464646"/>
           <w:sz w:val="22"/>
         </w:rPr>
         <w:t>A Study of Company Development, Automotive Products,</w:t>
@@ -126,78 +61,229 @@
         <w:t>Research and Development, and Manufacturing Methodologies</w:t>
       </w:r>
     </w:p>
+    <w:p/>
+    <w:tbl>
+      <w:tblPr>
+        <w:tblStyle w:val="TableGrid"/>
+        <w:tblW w:type="auto" w:w="0"/>
+        <w:tblLook w:firstColumn="1" w:firstRow="1" w:lastColumn="0" w:lastRow="0" w:noHBand="0" w:noVBand="1" w:val="04A0"/>
+      </w:tblPr>
+      <w:tblGrid>
+        <w:gridCol w:w="4680"/>
+        <w:gridCol w:w="4680"/>
+      </w:tblGrid>
+      <w:tr>
+        <w:tc>
+          <w:tcPr>
+            <w:tcW w:type="dxa" w:w="4680"/>
+            <w:shd w:fill="1F4E79"/>
+          </w:tcPr>
+          <w:p>
+            <w:r>
+              <w:rPr>
+                <w:rFonts w:ascii="Calibri" w:hAnsi="Calibri" w:eastAsia="Calibri"/>
+                <w:b/>
+                <w:color w:val="FFFFFF"/>
+                <w:sz w:val="22"/>
+              </w:rPr>
+              <w:t>Submitted by</w:t>
+            </w:r>
+          </w:p>
+        </w:tc>
+        <w:tc>
+          <w:tcPr>
+            <w:tcW w:type="dxa" w:w="4680"/>
+            <w:shd w:fill="1F4E79"/>
+          </w:tcPr>
+          <w:p>
+            <w:r>
+              <w:rPr>
+                <w:rFonts w:ascii="Calibri" w:hAnsi="Calibri" w:eastAsia="Calibri"/>
+                <w:b/>
+                <w:color w:val="FFFFFF"/>
+                <w:sz w:val="22"/>
+              </w:rPr>
+              <w:t>Nachiket L Karoshi</w:t>
+            </w:r>
+          </w:p>
+        </w:tc>
+      </w:tr>
+      <w:tr>
+        <w:tc>
+          <w:tcPr>
+            <w:tcW w:type="dxa" w:w="4680"/>
+          </w:tcPr>
+          <w:p>
+            <w:r>
+              <w:rPr>
+                <w:rFonts w:ascii="Calibri" w:hAnsi="Calibri" w:eastAsia="Calibri"/>
+                <w:b w:val="0"/>
+                <w:sz w:val="20"/>
+              </w:rPr>
+              <w:t>Diploma / Department</w:t>
+            </w:r>
+          </w:p>
+        </w:tc>
+        <w:tc>
+          <w:tcPr>
+            <w:tcW w:type="dxa" w:w="4680"/>
+          </w:tcPr>
+          <w:p>
+            <w:r>
+              <w:rPr>
+                <w:rFonts w:ascii="Calibri" w:hAnsi="Calibri" w:eastAsia="Calibri"/>
+                <w:b w:val="0"/>
+                <w:sz w:val="20"/>
+              </w:rPr>
+              <w:t>Diploma in Electronics and Communication Engineering</w:t>
+            </w:r>
+          </w:p>
+        </w:tc>
+      </w:tr>
+      <w:tr>
+        <w:tc>
+          <w:tcPr>
+            <w:tcW w:type="dxa" w:w="4680"/>
+            <w:shd w:fill="E8F1FA"/>
+          </w:tcPr>
+          <w:p>
+            <w:r>
+              <w:rPr>
+                <w:rFonts w:ascii="Calibri" w:hAnsi="Calibri" w:eastAsia="Calibri"/>
+                <w:b w:val="0"/>
+                <w:sz w:val="20"/>
+              </w:rPr>
+              <w:t>Institution</w:t>
+            </w:r>
+          </w:p>
+        </w:tc>
+        <w:tc>
+          <w:tcPr>
+            <w:tcW w:type="dxa" w:w="4680"/>
+            <w:shd w:fill="E8F1FA"/>
+          </w:tcPr>
+          <w:p>
+            <w:r>
+              <w:rPr>
+                <w:rFonts w:ascii="Calibri" w:hAnsi="Calibri" w:eastAsia="Calibri"/>
+                <w:b w:val="0"/>
+                <w:sz w:val="20"/>
+              </w:rPr>
+              <w:t>KLE Society's C B Kolli Polytechnic, Haveri</w:t>
+            </w:r>
+          </w:p>
+        </w:tc>
+      </w:tr>
+      <w:tr>
+        <w:tc>
+          <w:tcPr>
+            <w:tcW w:type="dxa" w:w="4680"/>
+          </w:tcPr>
+          <w:p>
+            <w:r>
+              <w:rPr>
+                <w:rFonts w:ascii="Calibri" w:hAnsi="Calibri" w:eastAsia="Calibri"/>
+                <w:b w:val="0"/>
+                <w:sz w:val="20"/>
+              </w:rPr>
+              <w:t>Internship organisation</w:t>
+            </w:r>
+          </w:p>
+        </w:tc>
+        <w:tc>
+          <w:tcPr>
+            <w:tcW w:type="dxa" w:w="4680"/>
+          </w:tcPr>
+          <w:p>
+            <w:r>
+              <w:rPr>
+                <w:rFonts w:ascii="Calibri" w:hAnsi="Calibri" w:eastAsia="Calibri"/>
+                <w:b w:val="0"/>
+                <w:sz w:val="20"/>
+              </w:rPr>
+              <w:t>Tata Motors Limited</w:t>
+            </w:r>
+          </w:p>
+        </w:tc>
+      </w:tr>
+      <w:tr>
+        <w:tc>
+          <w:tcPr>
+            <w:tcW w:type="dxa" w:w="4680"/>
+            <w:shd w:fill="E8F1FA"/>
+          </w:tcPr>
+          <w:p>
+            <w:r>
+              <w:rPr>
+                <w:rFonts w:ascii="Calibri" w:hAnsi="Calibri" w:eastAsia="Calibri"/>
+                <w:b w:val="0"/>
+                <w:sz w:val="20"/>
+              </w:rPr>
+              <w:t>Academic year</w:t>
+            </w:r>
+          </w:p>
+        </w:tc>
+        <w:tc>
+          <w:tcPr>
+            <w:tcW w:type="dxa" w:w="4680"/>
+            <w:shd w:fill="E8F1FA"/>
+          </w:tcPr>
+          <w:p>
+            <w:r>
+              <w:rPr>
+                <w:rFonts w:ascii="Calibri" w:hAnsi="Calibri" w:eastAsia="Calibri"/>
+                <w:b w:val="0"/>
+                <w:sz w:val="20"/>
+              </w:rPr>
+              <w:t>2026–2027</w:t>
+            </w:r>
+          </w:p>
+        </w:tc>
+      </w:tr>
+      <w:tr>
+        <w:tc>
+          <w:tcPr>
+            <w:tcW w:type="dxa" w:w="4680"/>
+          </w:tcPr>
+          <w:p>
+            <w:r>
+              <w:rPr>
+                <w:rFonts w:ascii="Calibri" w:hAnsi="Calibri" w:eastAsia="Calibri"/>
+                <w:b w:val="0"/>
+                <w:sz w:val="20"/>
+              </w:rPr>
+              <w:t>Submission date</w:t>
+            </w:r>
+          </w:p>
+        </w:tc>
+        <w:tc>
+          <w:tcPr>
+            <w:tcW w:type="dxa" w:w="4680"/>
+          </w:tcPr>
+          <w:p>
+            <w:r>
+              <w:rPr>
+                <w:rFonts w:ascii="Calibri" w:hAnsi="Calibri" w:eastAsia="Calibri"/>
+                <w:b w:val="0"/>
+                <w:sz w:val="20"/>
+              </w:rPr>
+              <w:t>14 October 2026</w:t>
+            </w:r>
+          </w:p>
+        </w:tc>
+      </w:tr>
+    </w:tbl>
+    <w:p/>
     <w:p>
       <w:pPr>
-        <w:jc w:val="left"/>
+        <w:jc w:val="center"/>
       </w:pPr>
-    </w:p>
-    <w:p>
       <w:r>
         <w:rPr>
           <w:rFonts w:ascii="Calibri" w:hAnsi="Calibri" w:eastAsia="Calibri"/>
           <w:b w:val="0"/>
-          <w:sz w:val="22"/>
-        </w:rPr>
-        <w:t>Submitted by: Nachiket L Karoshi</w:t>
-      </w:r>
-    </w:p>
-    <w:p>
-      <w:r>
-        <w:rPr>
-          <w:rFonts w:ascii="Calibri" w:hAnsi="Calibri" w:eastAsia="Calibri"/>
-          <w:b w:val="0"/>
-          <w:sz w:val="22"/>
-        </w:rPr>
-        <w:t>Diploma / Department: Diploma in Electronics and Communication Engineering</w:t>
-      </w:r>
-    </w:p>
-    <w:p>
-      <w:r>
-        <w:rPr>
-          <w:rFonts w:ascii="Calibri" w:hAnsi="Calibri" w:eastAsia="Calibri"/>
-          <w:b w:val="0"/>
-          <w:sz w:val="22"/>
-        </w:rPr>
-        <w:t>Institution: KLE Society's C B Kolli Polytechnic, Haveri</w:t>
-      </w:r>
-    </w:p>
-    <w:p>
-      <w:r>
-        <w:rPr>
-          <w:rFonts w:ascii="Calibri" w:hAnsi="Calibri" w:eastAsia="Calibri"/>
-          <w:b w:val="0"/>
-          <w:sz w:val="22"/>
-        </w:rPr>
-        <w:t>Internship organisation: Tata Motors Limited</w:t>
-      </w:r>
-    </w:p>
-    <w:p>
-      <w:r>
-        <w:rPr>
-          <w:rFonts w:ascii="Calibri" w:hAnsi="Calibri" w:eastAsia="Calibri"/>
-          <w:b w:val="0"/>
-          <w:sz w:val="22"/>
-        </w:rPr>
-        <w:t>Academic year: 2026–2027</w:t>
-      </w:r>
-    </w:p>
-    <w:p>
-      <w:r>
-        <w:rPr>
-          <w:rFonts w:ascii="Calibri" w:hAnsi="Calibri" w:eastAsia="Calibri"/>
-          <w:b w:val="0"/>
-          <w:sz w:val="22"/>
-        </w:rPr>
-        <w:t>Submission date: 14 October 2026</w:t>
-      </w:r>
-    </w:p>
-    <w:p/>
-    <w:p>
-      <w:r>
-        <w:rPr>
-          <w:rFonts w:ascii="Calibri" w:hAnsi="Calibri" w:eastAsia="Calibri"/>
-          <w:b w:val="0"/>
-          <w:sz w:val="22"/>
+          <w:color w:val="5A5A5A"/>
+          <w:sz w:val="20"/>
         </w:rPr>
         <w:t>Submitted in partial fulfilment of the requirements for the Diploma final-year internship.</w:t>
       </w:r>
@@ -209,7 +295,7 @@
     </w:p>
     <w:p>
       <w:pPr>
-        <w:spacing w:before="240" w:after="120"/>
+        <w:spacing w:before="200" w:after="120"/>
       </w:pPr>
       <w:r>
         <w:rPr>
@@ -223,7 +309,7 @@
     </w:p>
     <w:p>
       <w:pPr>
-        <w:spacing w:after="160" w:line="276" w:lineRule="auto"/>
+        <w:spacing w:line="288" w:lineRule="auto" w:after="160"/>
       </w:pPr>
       <w:r>
         <w:rPr>
@@ -231,12 +317,12 @@
           <w:b w:val="0"/>
           <w:sz w:val="22"/>
         </w:rPr>
-        <w:t>I hereby declare that this company research report entitled "Tata Motors Limited — Company Research Report" is prepared by me, Nachiket L Karoshi, as part of the final-year diploma internship requirement. The information is compiled from publicly available sources and general industrial knowledge. I have not copied any material without appropriate acknowledgement.</w:t>
+        <w:t>I hereby declare that this report is my original work prepared for the diploma internship. Information is taken from official and public sources with acknowledgement.</w:t>
       </w:r>
     </w:p>
     <w:p>
       <w:pPr>
-        <w:spacing w:after="160" w:line="276" w:lineRule="auto"/>
+        <w:spacing w:line="288" w:lineRule="auto" w:after="160"/>
       </w:pPr>
       <w:r>
         <w:rPr>
@@ -251,7 +337,7 @@
     </w:p>
     <w:p>
       <w:pPr>
-        <w:spacing w:after="160" w:line="276" w:lineRule="auto"/>
+        <w:spacing w:line="288" w:lineRule="auto" w:after="160"/>
       </w:pPr>
       <w:r>
         <w:rPr>
@@ -259,7 +345,7 @@
           <w:b w:val="0"/>
           <w:sz w:val="22"/>
         </w:rPr>
-        <w:t>Signature of student: _______________________</w:t>
+        <w:t>Signature: _______________________</w:t>
         <w:br/>
         <w:t>Name: Nachiket L Karoshi</w:t>
       </w:r>
@@ -271,7 +357,7 @@
     </w:p>
     <w:p>
       <w:pPr>
-        <w:spacing w:before="240" w:after="120"/>
+        <w:spacing w:before="200" w:after="120"/>
       </w:pPr>
       <w:r>
         <w:rPr>
@@ -375,115 +461,12 @@
     </w:p>
     <w:p>
       <w:r>
-        <w:rPr>
-          <w:rFonts w:ascii="Calibri" w:hAnsi="Calibri" w:eastAsia="Calibri"/>
-          <w:b w:val="0"/>
-          <w:sz w:val="22"/>
-        </w:rPr>
-        <w:t>10. References</w:t>
-      </w:r>
-    </w:p>
-    <w:p>
-      <w:r>
         <w:br w:type="page"/>
       </w:r>
     </w:p>
     <w:p>
       <w:pPr>
-        <w:spacing w:before="240" w:after="120"/>
-      </w:pPr>
-      <w:r>
-        <w:rPr>
-          <w:rFonts w:ascii="Calibri" w:hAnsi="Calibri" w:eastAsia="Calibri"/>
-          <w:b/>
-          <w:color w:val="003366"/>
-          <w:sz w:val="32"/>
-        </w:rPr>
-        <w:t>Executive Summary</w:t>
-      </w:r>
-    </w:p>
-    <w:p>
-      <w:pPr>
-        <w:spacing w:after="160" w:line="276" w:lineRule="auto"/>
-      </w:pPr>
-      <w:r>
-        <w:rPr>
-          <w:rFonts w:ascii="Calibri" w:hAnsi="Calibri" w:eastAsia="Calibri"/>
-          <w:b w:val="0"/>
-          <w:sz w:val="22"/>
-        </w:rPr>
-        <w:t>Tata Motors Limited is India's flagship automotive company under the Tata Group, with leadership in commercial vehicles, a top-three position in passenger vehicles, and dominant market share in passenger electric vehicles. This report presents a structured study of the company's history, business segments, product portfolio, manufacturing methodologies, research areas, and future opportunities—prepared to support a diploma internship application in Electronics and Communication Engineering.</w:t>
-      </w:r>
-    </w:p>
-    <w:p>
-      <w:pPr>
-        <w:spacing w:after="160" w:line="276" w:lineRule="auto"/>
-      </w:pPr>
-      <w:r>
-        <w:rPr>
-          <w:rFonts w:ascii="Calibri" w:hAnsi="Calibri" w:eastAsia="Calibri"/>
-          <w:b w:val="0"/>
-          <w:sz w:val="22"/>
-        </w:rPr>
-        <w:t>Public disclosures for FY2024–25 highlight milestones such as 6 million cumulative passenger vehicle sales, 200,000+ cumulative EV sales, expansion at Sanand, and groundwork for a new Tamil Nadu manufacturing facility. The company's multi-powertrain strategy (petrol, diesel, CNG, electric, and alternate fuels including hydrogen ICE trucks) aligns with India's mobility and sustainability goals. For ECE students, Tata Motors offers exposure to vehicle electronics, wiring harnesses, ECUs, battery management, production testing, and plant safety systems—making it a strong choice for industrial training.</w:t>
-      </w:r>
-    </w:p>
-    <w:p>
-      <w:pPr>
-        <w:jc w:val="center"/>
-      </w:pPr>
-      <w:r>
-        <w:drawing>
-          <wp:inline xmlns:a="http://schemas.openxmlformats.org/drawingml/2006/main" xmlns:pic="http://schemas.openxmlformats.org/drawingml/2006/picture">
-            <wp:extent cx="5303520" cy="2919916"/>
-            <wp:docPr id="3" name="Picture 3"/>
-            <wp:cNvGraphicFramePr>
-              <a:graphicFrameLocks noChangeAspect="1"/>
-            </wp:cNvGraphicFramePr>
-            <a:graphic>
-              <a:graphicData uri="http://schemas.openxmlformats.org/drawingml/2006/picture">
-                <pic:pic>
-                  <pic:nvPicPr>
-                    <pic:cNvPr id="0" name="internship_value.png"/>
-                    <pic:cNvPicPr/>
-                  </pic:nvPicPr>
-                  <pic:blipFill>
-                    <a:blip r:embed="rId11"/>
-                    <a:stretch>
-                      <a:fillRect/>
-                    </a:stretch>
-                  </pic:blipFill>
-                  <pic:spPr>
-                    <a:xfrm>
-                      <a:off x="0" y="0"/>
-                      <a:ext cx="5303520" cy="2919916"/>
-                    </a:xfrm>
-                    <a:prstGeom prst="rect"/>
-                  </pic:spPr>
-                </pic:pic>
-              </a:graphicData>
-            </a:graphic>
-          </wp:inline>
-        </w:drawing>
-      </w:r>
-    </w:p>
-    <w:p>
-      <w:pPr>
-        <w:jc w:val="center"/>
-      </w:pPr>
-      <w:r>
-        <w:rPr>
-          <w:rFonts w:ascii="Calibri" w:hAnsi="Calibri" w:eastAsia="Calibri"/>
-          <w:b w:val="0"/>
-          <w:color w:val="505050"/>
-          <w:sz w:val="18"/>
-        </w:rPr>
-        <w:t>Figure A: Value of internship at Tata Motors for diploma students</w:t>
-      </w:r>
-    </w:p>
-    <w:p>
-      <w:pPr>
-        <w:spacing w:before="240" w:after="120"/>
+        <w:spacing w:before="200" w:after="120"/>
       </w:pPr>
       <w:r>
         <w:rPr>
@@ -497,7 +480,46 @@
     </w:p>
     <w:p>
       <w:pPr>
-        <w:spacing w:after="160" w:line="276" w:lineRule="auto"/>
+        <w:jc w:val="center"/>
+      </w:pPr>
+      <w:r>
+        <w:drawing>
+          <wp:inline xmlns:a="http://schemas.openxmlformats.org/drawingml/2006/main" xmlns:pic="http://schemas.openxmlformats.org/drawingml/2006/picture">
+            <wp:extent cx="1463040" cy="935248"/>
+            <wp:docPr id="1" name="Picture 1"/>
+            <wp:cNvGraphicFramePr>
+              <a:graphicFrameLocks noChangeAspect="1"/>
+            </wp:cNvGraphicFramePr>
+            <a:graphic>
+              <a:graphicData uri="http://schemas.openxmlformats.org/drawingml/2006/picture">
+                <pic:pic>
+                  <pic:nvPicPr>
+                    <pic:cNvPr id="0" name="tata_motors_logo.png"/>
+                    <pic:cNvPicPr/>
+                  </pic:nvPicPr>
+                  <pic:blipFill>
+                    <a:blip r:embed="rId9"/>
+                    <a:stretch>
+                      <a:fillRect/>
+                    </a:stretch>
+                  </pic:blipFill>
+                  <pic:spPr>
+                    <a:xfrm>
+                      <a:off x="0" y="0"/>
+                      <a:ext cx="1463040" cy="935248"/>
+                    </a:xfrm>
+                    <a:prstGeom prst="rect"/>
+                  </pic:spPr>
+                </pic:pic>
+              </a:graphicData>
+            </a:graphic>
+          </wp:inline>
+        </w:drawing>
+      </w:r>
+    </w:p>
+    <w:p>
+      <w:pPr>
+        <w:spacing w:line="288" w:lineRule="auto" w:after="160"/>
       </w:pPr>
       <w:r>
         <w:rPr>
@@ -505,12 +527,12 @@
           <w:b w:val="0"/>
           <w:sz w:val="22"/>
         </w:rPr>
-        <w:t>The automobile industry is one of the most important sectors of the Indian economy. It contributes to industrial development, employment generation, technological innovation, infrastructure development, and international trade. Within this industry, Tata Motors has established itself as a major automobile manufacturer with a strong presence in passenger vehicles, commercial vehicles, electric mobility, and premium international brands.</w:t>
+        <w:t>The automobile industry is one of the most important sectors of the Indian economy. It contributes to industrial development, employment generation, technological innovation, infrastructure development, and international trade. Within this industry, Tata Motors has established itself as a major automobile manufacturer with a strong presence in passenger vehicles, commercial vehicles, electric mobility, and vehicle engineering.</w:t>
       </w:r>
     </w:p>
     <w:p>
       <w:pPr>
-        <w:spacing w:after="160" w:line="276" w:lineRule="auto"/>
+        <w:spacing w:line="288" w:lineRule="auto" w:after="160"/>
       </w:pPr>
       <w:r>
         <w:rPr>
@@ -518,12 +540,12 @@
           <w:b w:val="0"/>
           <w:sz w:val="22"/>
         </w:rPr>
-        <w:t>Tata Motors was established in 1945 as Tata Engineering and Locomotive Company Limited (TELCO). Initially, the company focused on locomotives and engineering products. Over time, it expanded into commercial vehicles, passenger cars, sport utility vehicles (SUVs), buses, and electric vehicles. The company has contributed significantly to the development of the Indian automobile industry through indigenous vehicle design, expanded manufacturing capabilities, improved vehicle safety, and investment in sustainable mobility.</w:t>
+        <w:t>Tata Motors was established in 1945 as Tata Engineering and Locomotive Company Limited (TELCO). Initially, the company focused on manufacturing locomotives and engineering products. Over time, it expanded into commercial vehicles, passenger cars, sports utility vehicles (SUVs), buses, and electric vehicles. The company has contributed significantly to the development of the Indian automobile industry by introducing indigenous vehicle designs, expanding manufacturing capabilities, improving vehicle safety, and investing in sustainable mobility.</w:t>
       </w:r>
     </w:p>
     <w:p>
       <w:pPr>
-        <w:spacing w:after="160" w:line="276" w:lineRule="auto"/>
+        <w:spacing w:line="288" w:lineRule="auto" w:after="160"/>
       </w:pPr>
       <w:r>
         <w:rPr>
@@ -531,12 +553,12 @@
           <w:b w:val="0"/>
           <w:sz w:val="22"/>
         </w:rPr>
-        <w:t>This research report examines Tata Motors' background, organisational development, business segments, products, manufacturing processes, research and development areas, achievements, and recent developments. For a diploma student in Electronics and Communication Engineering, the report also highlights how electronic systems, sensors, control units, and connectivity are integrated into modern vehicles.</w:t>
+        <w:t>This research report examines Tata Motors' background, organisational development, products, manufacturing processes, achievements, business progress, and recent developments. It also studies manufacturing methodologies and the importance of continuous improvement in quality, productivity, and customer satisfaction.</w:t>
       </w:r>
     </w:p>
     <w:p>
       <w:pPr>
-        <w:spacing w:before="240" w:after="120"/>
+        <w:spacing w:before="200" w:after="120"/>
       </w:pPr>
       <w:r>
         <w:rPr>
@@ -550,7 +572,46 @@
     </w:p>
     <w:p>
       <w:pPr>
-        <w:spacing w:after="160" w:line="276" w:lineRule="auto"/>
+        <w:jc w:val="center"/>
+      </w:pPr>
+      <w:r>
+        <w:drawing>
+          <wp:inline xmlns:a="http://schemas.openxmlformats.org/drawingml/2006/main" xmlns:pic="http://schemas.openxmlformats.org/drawingml/2006/picture">
+            <wp:extent cx="5303520" cy="2964568"/>
+            <wp:docPr id="2" name="Picture 2"/>
+            <wp:cNvGraphicFramePr>
+              <a:graphicFrameLocks noChangeAspect="1"/>
+            </wp:cNvGraphicFramePr>
+            <a:graphic>
+              <a:graphicData uri="http://schemas.openxmlformats.org/drawingml/2006/picture">
+                <pic:pic>
+                  <pic:nvPicPr>
+                    <pic:cNvPr id="0" name="photo_head_office.jpg"/>
+                    <pic:cNvPicPr/>
+                  </pic:nvPicPr>
+                  <pic:blipFill>
+                    <a:blip r:embed="rId10"/>
+                    <a:stretch>
+                      <a:fillRect/>
+                    </a:stretch>
+                  </pic:blipFill>
+                  <pic:spPr>
+                    <a:xfrm>
+                      <a:off x="0" y="0"/>
+                      <a:ext cx="5303520" cy="2964568"/>
+                    </a:xfrm>
+                    <a:prstGeom prst="rect"/>
+                  </pic:spPr>
+                </pic:pic>
+              </a:graphicData>
+            </a:graphic>
+          </wp:inline>
+        </w:drawing>
+      </w:r>
+    </w:p>
+    <w:p>
+      <w:pPr>
+        <w:spacing w:line="288" w:lineRule="auto" w:after="160"/>
       </w:pPr>
       <w:r>
         <w:rPr>
@@ -558,12 +619,12 @@
           <w:b w:val="0"/>
           <w:sz w:val="22"/>
         </w:rPr>
-        <w:t>Tata Motors is a leading automotive manufacturer associated with the Tata Group, one of India's largest and most respected business conglomerates. Its operations cover the design, development, manufacturing, marketing, and servicing of a wide range of vehicles.</w:t>
+        <w:t>Tata Motors is a well-known automotive manufacturer associated with the Tata Group. Its operations cover the design, development, manufacturing, marketing, and servicing of a wide range of vehicles.</w:t>
       </w:r>
     </w:p>
     <w:p>
       <w:pPr>
-        <w:spacing w:after="160" w:line="276" w:lineRule="auto"/>
+        <w:spacing w:line="288" w:lineRule="auto" w:after="160"/>
       </w:pPr>
       <w:r>
         <w:rPr>
@@ -571,12 +632,12 @@
           <w:b w:val="0"/>
           <w:sz w:val="22"/>
         </w:rPr>
-        <w:t>The company serves individual customers, businesses, logistics operators, public transport organisations, and industrial customers. Its vehicles are used for personal transportation, goods transportation, passenger transport, construction, mining, defence-related mobility, and specialised commercial applications.</w:t>
+        <w:t>The company serves individual customers, businesses, logistics operators, public transport organisations, and industrial customers. Its vehicles are used for personal transportation, goods transportation, passenger transport, construction, and specialised commercial applications.</w:t>
       </w:r>
     </w:p>
     <w:p>
       <w:pPr>
-        <w:spacing w:after="160" w:line="276" w:lineRule="auto"/>
+        <w:spacing w:line="288" w:lineRule="auto" w:after="160"/>
       </w:pPr>
       <w:r>
         <w:rPr>
@@ -584,7 +645,112 @@
           <w:b w:val="0"/>
           <w:sz w:val="22"/>
         </w:rPr>
-        <w:t>Tata Motors invests in research and development, vehicle electrification, connected technologies, safety engineering, and advanced manufacturing systems. Public company materials describe a multi-segment automotive business with strong positions in commercial vehicles and a growing passenger vehicle and electric mobility portfolio, alongside the international Jaguar Land Rover (JLR) business.</w:t>
+        <w:t>Tata Motors has invested in research and development, vehicle electrification, connected technologies, safety engineering, and advanced manufacturing systems.</w:t>
+      </w:r>
+    </w:p>
+    <w:p>
+      <w:pPr>
+        <w:spacing w:before="200" w:after="120"/>
+      </w:pPr>
+      <w:r>
+        <w:rPr>
+          <w:rFonts w:ascii="Calibri" w:hAnsi="Calibri" w:eastAsia="Calibri"/>
+          <w:b/>
+          <w:color w:val="003366"/>
+          <w:sz w:val="32"/>
+        </w:rPr>
+        <w:t>3. Company Overview</w:t>
+      </w:r>
+    </w:p>
+    <w:p>
+      <w:pPr>
+        <w:jc w:val="center"/>
+      </w:pPr>
+      <w:r>
+        <w:drawing>
+          <wp:inline xmlns:a="http://schemas.openxmlformats.org/drawingml/2006/main" xmlns:pic="http://schemas.openxmlformats.org/drawingml/2006/picture">
+            <wp:extent cx="5486400" cy="2819736"/>
+            <wp:docPr id="3" name="Picture 3"/>
+            <wp:cNvGraphicFramePr>
+              <a:graphicFrameLocks noChangeAspect="1"/>
+            </wp:cNvGraphicFramePr>
+            <a:graphic>
+              <a:graphicData uri="http://schemas.openxmlformats.org/drawingml/2006/picture">
+                <pic:pic>
+                  <pic:nvPicPr>
+                    <pic:cNvPr id="0" name="photo_overview.jpg"/>
+                    <pic:cNvPicPr/>
+                  </pic:nvPicPr>
+                  <pic:blipFill>
+                    <a:blip r:embed="rId11"/>
+                    <a:stretch>
+                      <a:fillRect/>
+                    </a:stretch>
+                  </pic:blipFill>
+                  <pic:spPr>
+                    <a:xfrm>
+                      <a:off x="0" y="0"/>
+                      <a:ext cx="5486400" cy="2819736"/>
+                    </a:xfrm>
+                    <a:prstGeom prst="rect"/>
+                  </pic:spPr>
+                </pic:pic>
+              </a:graphicData>
+            </a:graphic>
+          </wp:inline>
+        </w:drawing>
+      </w:r>
+    </w:p>
+    <w:p>
+      <w:pPr>
+        <w:spacing w:line="288" w:lineRule="auto" w:after="160"/>
+      </w:pPr>
+      <w:r>
+        <w:rPr>
+          <w:rFonts w:ascii="Calibri" w:hAnsi="Calibri" w:eastAsia="Calibri"/>
+          <w:b w:val="0"/>
+          <w:sz w:val="22"/>
+        </w:rPr>
+        <w:t>Tata Motors operates in a highly competitive industry where product quality, pricing, design, safety, technology, fuel efficiency, and after-sales service influence customer decisions. Its business developed around two principal segments:</w:t>
+      </w:r>
+    </w:p>
+    <w:p>
+      <w:pPr>
+        <w:spacing w:line="288" w:lineRule="auto" w:after="160"/>
+      </w:pPr>
+      <w:r>
+        <w:rPr>
+          <w:rFonts w:ascii="Calibri" w:hAnsi="Calibri" w:eastAsia="Calibri"/>
+          <w:b w:val="0"/>
+          <w:sz w:val="22"/>
+        </w:rPr>
+        <w:t>Passenger vehicles: Cars, SUVs and electric passenger vehicles for personal and family transportation.</w:t>
+      </w:r>
+    </w:p>
+    <w:p>
+      <w:pPr>
+        <w:spacing w:line="288" w:lineRule="auto" w:after="160"/>
+      </w:pPr>
+      <w:r>
+        <w:rPr>
+          <w:rFonts w:ascii="Calibri" w:hAnsi="Calibri" w:eastAsia="Calibri"/>
+          <w:b w:val="0"/>
+          <w:sz w:val="22"/>
+        </w:rPr>
+        <w:t>Commercial vehicles: Trucks, buses, vans, light commercial vehicles and specialised vehicles for businesses and public transportation.</w:t>
+      </w:r>
+    </w:p>
+    <w:p>
+      <w:pPr>
+        <w:spacing w:line="288" w:lineRule="auto" w:after="160"/>
+      </w:pPr>
+      <w:r>
+        <w:rPr>
+          <w:rFonts w:ascii="Calibri" w:hAnsi="Calibri" w:eastAsia="Calibri"/>
+          <w:b w:val="0"/>
+          <w:sz w:val="22"/>
+        </w:rPr>
+        <w:t>The group also includes electric mobility solutions and the global Jaguar Land Rover (JLR) business. Public reports for FY2024–25 note leadership in Indian CV, strong SUV growth in PV, and a large share of the passenger EV market.</w:t>
       </w:r>
     </w:p>
     <w:tbl>
@@ -601,30 +767,34 @@
         <w:tc>
           <w:tcPr>
             <w:tcW w:type="dxa" w:w="4680"/>
-            <w:shd w:fill="003366"/>
+            <w:shd w:fill="1F4E79"/>
           </w:tcPr>
           <w:p>
             <w:r>
               <w:rPr>
+                <w:rFonts w:ascii="Calibri" w:hAnsi="Calibri" w:eastAsia="Calibri"/>
                 <w:b/>
                 <w:color w:val="FFFFFF"/>
+                <w:sz w:val="22"/>
               </w:rPr>
-              <w:t>Company name</w:t>
+              <w:t>Particular</w:t>
             </w:r>
           </w:p>
         </w:tc>
         <w:tc>
           <w:tcPr>
             <w:tcW w:type="dxa" w:w="4680"/>
-            <w:shd w:fill="003366"/>
+            <w:shd w:fill="1F4E79"/>
           </w:tcPr>
           <w:p>
             <w:r>
               <w:rPr>
+                <w:rFonts w:ascii="Calibri" w:hAnsi="Calibri" w:eastAsia="Calibri"/>
                 <w:b/>
                 <w:color w:val="FFFFFF"/>
+                <w:sz w:val="22"/>
               </w:rPr>
-              <w:t>Tata Motors Limited (group; segment structure evolved in FY25–26)</w:t>
+              <w:t>Details</w:t>
             </w:r>
           </w:p>
         </w:tc>
@@ -636,7 +806,12 @@
           </w:tcPr>
           <w:p>
             <w:r>
-              <w:t>Established</w:t>
+              <w:rPr>
+                <w:rFonts w:ascii="Calibri" w:hAnsi="Calibri" w:eastAsia="Calibri"/>
+                <w:b w:val="0"/>
+                <w:sz w:val="20"/>
+              </w:rPr>
+              <w:t>Company name</w:t>
             </w:r>
           </w:p>
         </w:tc>
@@ -646,6 +821,45 @@
           </w:tcPr>
           <w:p>
             <w:r>
+              <w:rPr>
+                <w:rFonts w:ascii="Calibri" w:hAnsi="Calibri" w:eastAsia="Calibri"/>
+                <w:b w:val="0"/>
+                <w:sz w:val="20"/>
+              </w:rPr>
+              <w:t>Tata Motors Limited</w:t>
+            </w:r>
+          </w:p>
+        </w:tc>
+      </w:tr>
+      <w:tr>
+        <w:tc>
+          <w:tcPr>
+            <w:tcW w:type="dxa" w:w="4680"/>
+            <w:shd w:fill="E8F1FA"/>
+          </w:tcPr>
+          <w:p>
+            <w:r>
+              <w:rPr>
+                <w:rFonts w:ascii="Calibri" w:hAnsi="Calibri" w:eastAsia="Calibri"/>
+                <w:b w:val="0"/>
+                <w:sz w:val="20"/>
+              </w:rPr>
+              <w:t>Established</w:t>
+            </w:r>
+          </w:p>
+        </w:tc>
+        <w:tc>
+          <w:tcPr>
+            <w:tcW w:type="dxa" w:w="4680"/>
+            <w:shd w:fill="E8F1FA"/>
+          </w:tcPr>
+          <w:p>
+            <w:r>
+              <w:rPr>
+                <w:rFonts w:ascii="Calibri" w:hAnsi="Calibri" w:eastAsia="Calibri"/>
+                <w:b w:val="0"/>
+                <w:sz w:val="20"/>
+              </w:rPr>
               <w:t>1945</w:t>
             </w:r>
           </w:p>
@@ -658,6 +872,11 @@
           </w:tcPr>
           <w:p>
             <w:r>
+              <w:rPr>
+                <w:rFonts w:ascii="Calibri" w:hAnsi="Calibri" w:eastAsia="Calibri"/>
+                <w:b w:val="0"/>
+                <w:sz w:val="20"/>
+              </w:rPr>
               <w:t>Original name</w:t>
             </w:r>
           </w:p>
@@ -668,6 +887,11 @@
           </w:tcPr>
           <w:p>
             <w:r>
+              <w:rPr>
+                <w:rFonts w:ascii="Calibri" w:hAnsi="Calibri" w:eastAsia="Calibri"/>
+                <w:b w:val="0"/>
+                <w:sz w:val="20"/>
+              </w:rPr>
               <w:t>Tata Engineering and Locomotive Company (TELCO)</w:t>
             </w:r>
           </w:p>
@@ -677,9 +901,15 @@
         <w:tc>
           <w:tcPr>
             <w:tcW w:type="dxa" w:w="4680"/>
+            <w:shd w:fill="E8F1FA"/>
           </w:tcPr>
           <w:p>
             <w:r>
+              <w:rPr>
+                <w:rFonts w:ascii="Calibri" w:hAnsi="Calibri" w:eastAsia="Calibri"/>
+                <w:b w:val="0"/>
+                <w:sz w:val="20"/>
+              </w:rPr>
               <w:t>Industry</w:t>
             </w:r>
           </w:p>
@@ -687,9 +917,15 @@
         <w:tc>
           <w:tcPr>
             <w:tcW w:type="dxa" w:w="4680"/>
+            <w:shd w:fill="E8F1FA"/>
           </w:tcPr>
           <w:p>
             <w:r>
+              <w:rPr>
+                <w:rFonts w:ascii="Calibri" w:hAnsi="Calibri" w:eastAsia="Calibri"/>
+                <w:b w:val="0"/>
+                <w:sz w:val="20"/>
+              </w:rPr>
               <w:t>Automotive manufacturing</w:t>
             </w:r>
           </w:p>
@@ -702,6 +938,11 @@
           </w:tcPr>
           <w:p>
             <w:r>
+              <w:rPr>
+                <w:rFonts w:ascii="Calibri" w:hAnsi="Calibri" w:eastAsia="Calibri"/>
+                <w:b w:val="0"/>
+                <w:sz w:val="20"/>
+              </w:rPr>
               <w:t>Headquarters</w:t>
             </w:r>
           </w:p>
@@ -712,6 +953,11 @@
           </w:tcPr>
           <w:p>
             <w:r>
+              <w:rPr>
+                <w:rFonts w:ascii="Calibri" w:hAnsi="Calibri" w:eastAsia="Calibri"/>
+                <w:b w:val="0"/>
+                <w:sz w:val="20"/>
+              </w:rPr>
               <w:t>Mumbai, Maharashtra, India</w:t>
             </w:r>
           </w:p>
@@ -721,9 +967,15 @@
         <w:tc>
           <w:tcPr>
             <w:tcW w:type="dxa" w:w="4680"/>
+            <w:shd w:fill="E8F1FA"/>
           </w:tcPr>
           <w:p>
             <w:r>
+              <w:rPr>
+                <w:rFonts w:ascii="Calibri" w:hAnsi="Calibri" w:eastAsia="Calibri"/>
+                <w:b w:val="0"/>
+                <w:sz w:val="20"/>
+              </w:rPr>
               <w:t>Parent group</w:t>
             </w:r>
           </w:p>
@@ -731,9 +983,15 @@
         <w:tc>
           <w:tcPr>
             <w:tcW w:type="dxa" w:w="4680"/>
+            <w:shd w:fill="E8F1FA"/>
           </w:tcPr>
           <w:p>
             <w:r>
+              <w:rPr>
+                <w:rFonts w:ascii="Calibri" w:hAnsi="Calibri" w:eastAsia="Calibri"/>
+                <w:b w:val="0"/>
+                <w:sz w:val="20"/>
+              </w:rPr>
               <w:t>Tata Group</w:t>
             </w:r>
           </w:p>
@@ -746,6 +1004,11 @@
           </w:tcPr>
           <w:p>
             <w:r>
+              <w:rPr>
+                <w:rFonts w:ascii="Calibri" w:hAnsi="Calibri" w:eastAsia="Calibri"/>
+                <w:b w:val="0"/>
+                <w:sz w:val="20"/>
+              </w:rPr>
               <w:t>Main products</w:t>
             </w:r>
           </w:p>
@@ -756,7 +1019,46 @@
           </w:tcPr>
           <w:p>
             <w:r>
-              <w:t>Cars, SUVs, trucks, buses, vans, electric vehicles, mobility solutions</w:t>
+              <w:rPr>
+                <w:rFonts w:ascii="Calibri" w:hAnsi="Calibri" w:eastAsia="Calibri"/>
+                <w:b w:val="0"/>
+                <w:sz w:val="20"/>
+              </w:rPr>
+              <w:t>Cars, SUVs, trucks, buses, electric vehicles</w:t>
+            </w:r>
+          </w:p>
+        </w:tc>
+      </w:tr>
+      <w:tr>
+        <w:tc>
+          <w:tcPr>
+            <w:tcW w:type="dxa" w:w="4680"/>
+            <w:shd w:fill="E8F1FA"/>
+          </w:tcPr>
+          <w:p>
+            <w:r>
+              <w:rPr>
+                <w:rFonts w:ascii="Calibri" w:hAnsi="Calibri" w:eastAsia="Calibri"/>
+                <w:b w:val="0"/>
+                <w:sz w:val="20"/>
+              </w:rPr>
+              <w:t>Major markets</w:t>
+            </w:r>
+          </w:p>
+        </w:tc>
+        <w:tc>
+          <w:tcPr>
+            <w:tcW w:type="dxa" w:w="4680"/>
+            <w:shd w:fill="E8F1FA"/>
+          </w:tcPr>
+          <w:p>
+            <w:r>
+              <w:rPr>
+                <w:rFonts w:ascii="Calibri" w:hAnsi="Calibri" w:eastAsia="Calibri"/>
+                <w:b w:val="0"/>
+                <w:sz w:val="20"/>
+              </w:rPr>
+              <w:t>India and international markets</w:t>
             </w:r>
           </w:p>
         </w:tc>
@@ -768,7 +1070,12 @@
           </w:tcPr>
           <w:p>
             <w:r>
-              <w:t>Major markets</w:t>
+              <w:rPr>
+                <w:rFonts w:ascii="Calibri" w:hAnsi="Calibri" w:eastAsia="Calibri"/>
+                <w:b w:val="0"/>
+                <w:sz w:val="20"/>
+              </w:rPr>
+              <w:t>Key focus</w:t>
             </w:r>
           </w:p>
         </w:tc>
@@ -778,474 +1085,25 @@
           </w:tcPr>
           <w:p>
             <w:r>
-              <w:t>India and selected international markets</w:t>
-            </w:r>
-          </w:p>
-        </w:tc>
-      </w:tr>
-      <w:tr>
-        <w:tc>
-          <w:tcPr>
-            <w:tcW w:type="dxa" w:w="4680"/>
-          </w:tcPr>
-          <w:p>
-            <w:r>
-              <w:t>Core focus</w:t>
-            </w:r>
-          </w:p>
-        </w:tc>
-        <w:tc>
-          <w:tcPr>
-            <w:tcW w:type="dxa" w:w="4680"/>
-          </w:tcPr>
-          <w:p>
-            <w:r>
-              <w:t>Quality, safety, innovation, sustainability, customer satisfaction</w:t>
+              <w:rPr>
+                <w:rFonts w:ascii="Calibri" w:hAnsi="Calibri" w:eastAsia="Calibri"/>
+                <w:b w:val="0"/>
+                <w:sz w:val="20"/>
+              </w:rPr>
+              <w:t>Quality, safety, innovation, sustainability</w:t>
             </w:r>
           </w:p>
         </w:tc>
       </w:tr>
     </w:tbl>
     <w:p>
-      <w:pPr>
-        <w:spacing w:before="240" w:after="120"/>
-      </w:pPr>
       <w:r>
-        <w:rPr>
-          <w:rFonts w:ascii="Calibri" w:hAnsi="Calibri" w:eastAsia="Calibri"/>
-          <w:b/>
-          <w:color w:val="003366"/>
-          <w:sz w:val="32"/>
-        </w:rPr>
-        <w:t>3. Company Overview</w:t>
+        <w:br w:type="page"/>
       </w:r>
     </w:p>
     <w:p>
       <w:pPr>
-        <w:spacing w:after="160" w:line="276" w:lineRule="auto"/>
-      </w:pPr>
-      <w:r>
-        <w:rPr>
-          <w:rFonts w:ascii="Calibri" w:hAnsi="Calibri" w:eastAsia="Calibri"/>
-          <w:b w:val="0"/>
-          <w:sz w:val="22"/>
-        </w:rPr>
-        <w:t>Tata Motors operates in a highly competitive industry where product quality, pricing, design, safety, technology, fuel efficiency, and after-sales service influence customer decisions. According to Tata Motors' integrated annual report and investor presentations for FY2024–25, the group's automotive business is organised around major reportable segments including Tata Commercial Vehicles (Tata CV), Tata Passenger Vehicles (Tata PV), electric mobility, and Jaguar Land Rover (JLR).</w:t>
-      </w:r>
-    </w:p>
-    <w:p>
-      <w:pPr>
-        <w:spacing w:after="160" w:line="276" w:lineRule="auto"/>
-      </w:pPr>
-      <w:r>
-        <w:rPr>
-          <w:rFonts w:ascii="Calibri" w:hAnsi="Calibri" w:eastAsia="Calibri"/>
-          <w:b w:val="0"/>
-          <w:sz w:val="22"/>
-        </w:rPr>
-        <w:t>Effective 1 October 2025, the company implemented a composite scheme of arrangement approved by the National Company Law Tribunal to demerge commercial vehicles from passenger vehicles (including electric passenger mobility), creating focused listed entities for sharper strategy execution. Students should refer to the latest annual report for the exact legal entity names after demerger.</w:t>
-      </w:r>
-    </w:p>
-    <w:p>
-      <w:pPr>
-        <w:jc w:val="center"/>
-      </w:pPr>
-      <w:r>
-        <w:drawing>
-          <wp:inline xmlns:a="http://schemas.openxmlformats.org/drawingml/2006/main" xmlns:pic="http://schemas.openxmlformats.org/drawingml/2006/picture">
-            <wp:extent cx="5303520" cy="2935956"/>
-            <wp:docPr id="4" name="Picture 4"/>
-            <wp:cNvGraphicFramePr>
-              <a:graphicFrameLocks noChangeAspect="1"/>
-            </wp:cNvGraphicFramePr>
-            <a:graphic>
-              <a:graphicData uri="http://schemas.openxmlformats.org/drawingml/2006/picture">
-                <pic:pic>
-                  <pic:nvPicPr>
-                    <pic:cNvPr id="0" name="business_segments.png"/>
-                    <pic:cNvPicPr/>
-                  </pic:nvPicPr>
-                  <pic:blipFill>
-                    <a:blip r:embed="rId12"/>
-                    <a:stretch>
-                      <a:fillRect/>
-                    </a:stretch>
-                  </pic:blipFill>
-                  <pic:spPr>
-                    <a:xfrm>
-                      <a:off x="0" y="0"/>
-                      <a:ext cx="5303520" cy="2935956"/>
-                    </a:xfrm>
-                    <a:prstGeom prst="rect"/>
-                  </pic:spPr>
-                </pic:pic>
-              </a:graphicData>
-            </a:graphic>
-          </wp:inline>
-        </w:drawing>
-      </w:r>
-    </w:p>
-    <w:p>
-      <w:pPr>
-        <w:jc w:val="center"/>
-      </w:pPr>
-      <w:r>
-        <w:rPr>
-          <w:rFonts w:ascii="Calibri" w:hAnsi="Calibri" w:eastAsia="Calibri"/>
-          <w:b w:val="0"/>
-          <w:color w:val="505050"/>
-          <w:sz w:val="18"/>
-        </w:rPr>
-        <w:t>Figure 1: Illustrative revenue scale by segment (FY25 public disclosures)</w:t>
-      </w:r>
-    </w:p>
-    <w:p>
-      <w:pPr>
-        <w:jc w:val="center"/>
-      </w:pPr>
-      <w:r>
-        <w:drawing>
-          <wp:inline xmlns:a="http://schemas.openxmlformats.org/drawingml/2006/main" xmlns:pic="http://schemas.openxmlformats.org/drawingml/2006/picture">
-            <wp:extent cx="5303520" cy="3978759"/>
-            <wp:docPr id="5" name="Picture 5"/>
-            <wp:cNvGraphicFramePr>
-              <a:graphicFrameLocks noChangeAspect="1"/>
-            </wp:cNvGraphicFramePr>
-            <a:graphic>
-              <a:graphicData uri="http://schemas.openxmlformats.org/drawingml/2006/picture">
-                <pic:pic>
-                  <pic:nvPicPr>
-                    <pic:cNvPr id="0" name="product_segments.png"/>
-                    <pic:cNvPicPr/>
-                  </pic:nvPicPr>
-                  <pic:blipFill>
-                    <a:blip r:embed="rId13"/>
-                    <a:stretch>
-                      <a:fillRect/>
-                    </a:stretch>
-                  </pic:blipFill>
-                  <pic:spPr>
-                    <a:xfrm>
-                      <a:off x="0" y="0"/>
-                      <a:ext cx="5303520" cy="3978759"/>
-                    </a:xfrm>
-                    <a:prstGeom prst="rect"/>
-                  </pic:spPr>
-                </pic:pic>
-              </a:graphicData>
-            </a:graphic>
-          </wp:inline>
-        </w:drawing>
-      </w:r>
-    </w:p>
-    <w:p>
-      <w:pPr>
-        <w:jc w:val="center"/>
-      </w:pPr>
-      <w:r>
-        <w:rPr>
-          <w:rFonts w:ascii="Calibri" w:hAnsi="Calibri" w:eastAsia="Calibri"/>
-          <w:b w:val="0"/>
-          <w:color w:val="505050"/>
-          <w:sz w:val="18"/>
-        </w:rPr>
-        <w:t>Figure 2: Product and market segments</w:t>
-      </w:r>
-    </w:p>
-    <w:p>
-      <w:pPr>
-        <w:jc w:val="center"/>
-      </w:pPr>
-      <w:r>
-        <w:drawing>
-          <wp:inline xmlns:a="http://schemas.openxmlformats.org/drawingml/2006/main" xmlns:pic="http://schemas.openxmlformats.org/drawingml/2006/picture">
-            <wp:extent cx="5303520" cy="2282528"/>
-            <wp:docPr id="6" name="Picture 6"/>
-            <wp:cNvGraphicFramePr>
-              <a:graphicFrameLocks noChangeAspect="1"/>
-            </wp:cNvGraphicFramePr>
-            <a:graphic>
-              <a:graphicData uri="http://schemas.openxmlformats.org/drawingml/2006/picture">
-                <pic:pic>
-                  <pic:nvPicPr>
-                    <pic:cNvPr id="0" name="market_highlights.png"/>
-                    <pic:cNvPicPr/>
-                  </pic:nvPicPr>
-                  <pic:blipFill>
-                    <a:blip r:embed="rId14"/>
-                    <a:stretch>
-                      <a:fillRect/>
-                    </a:stretch>
-                  </pic:blipFill>
-                  <pic:spPr>
-                    <a:xfrm>
-                      <a:off x="0" y="0"/>
-                      <a:ext cx="5303520" cy="2282528"/>
-                    </a:xfrm>
-                    <a:prstGeom prst="rect"/>
-                  </pic:spPr>
-                </pic:pic>
-              </a:graphicData>
-            </a:graphic>
-          </wp:inline>
-        </w:drawing>
-      </w:r>
-    </w:p>
-    <w:p>
-      <w:pPr>
-        <w:jc w:val="center"/>
-      </w:pPr>
-      <w:r>
-        <w:rPr>
-          <w:rFonts w:ascii="Calibri" w:hAnsi="Calibri" w:eastAsia="Calibri"/>
-          <w:b w:val="0"/>
-          <w:color w:val="505050"/>
-          <w:sz w:val="18"/>
-        </w:rPr>
-        <w:t>Figure 3: Market position highlights (public FY25 disclosures)</w:t>
-      </w:r>
-    </w:p>
-    <w:p>
-      <w:pPr>
-        <w:spacing w:before="160" w:after="120"/>
-      </w:pPr>
-      <w:r>
-        <w:rPr>
-          <w:rFonts w:ascii="Calibri" w:hAnsi="Calibri" w:eastAsia="Calibri"/>
-          <w:b/>
-          <w:color w:val="003366"/>
-          <w:sz w:val="28"/>
-        </w:rPr>
-        <w:t>3.1 Tata Commercial Vehicles (CV)</w:t>
-      </w:r>
-    </w:p>
-    <w:p>
-      <w:pPr>
-        <w:pStyle w:val="ListBullet"/>
-      </w:pPr>
-      <w:r>
-        <w:rPr>
-          <w:rFonts w:ascii="Calibri" w:hAnsi="Calibri" w:eastAsia="Calibri"/>
-          <w:b w:val="0"/>
-          <w:sz w:val="22"/>
-        </w:rPr>
-        <w:t>Trucks (light, medium, and heavy), tippers, tractors, and specialised haulage vehicles.</w:t>
-      </w:r>
-    </w:p>
-    <w:p>
-      <w:pPr>
-        <w:pStyle w:val="ListBullet"/>
-      </w:pPr>
-      <w:r>
-        <w:rPr>
-          <w:rFonts w:ascii="Calibri" w:hAnsi="Calibri" w:eastAsia="Calibri"/>
-          <w:b w:val="0"/>
-          <w:sz w:val="22"/>
-        </w:rPr>
-        <w:t>Buses and staff carriers for public transport, schools, and institutions.</w:t>
-      </w:r>
-    </w:p>
-    <w:p>
-      <w:pPr>
-        <w:pStyle w:val="ListBullet"/>
-      </w:pPr>
-      <w:r>
-        <w:rPr>
-          <w:rFonts w:ascii="Calibri" w:hAnsi="Calibri" w:eastAsia="Calibri"/>
-          <w:b w:val="0"/>
-          <w:sz w:val="22"/>
-        </w:rPr>
-        <w:t>Small commercial vehicles and pickups such as the Tata Ace and Intra families.</w:t>
-      </w:r>
-    </w:p>
-    <w:p>
-      <w:pPr>
-        <w:pStyle w:val="ListBullet"/>
-      </w:pPr>
-      <w:r>
-        <w:rPr>
-          <w:rFonts w:ascii="Calibri" w:hAnsi="Calibri" w:eastAsia="Calibri"/>
-          <w:b w:val="0"/>
-          <w:sz w:val="22"/>
-        </w:rPr>
-        <w:t>Electric commercial mobility including Ace EV and electric bus solutions for smart cities.</w:t>
-      </w:r>
-    </w:p>
-    <w:p>
-      <w:pPr>
-        <w:pStyle w:val="ListBullet"/>
-      </w:pPr>
-      <w:r>
-        <w:rPr>
-          <w:rFonts w:ascii="Calibri" w:hAnsi="Calibri" w:eastAsia="Calibri"/>
-          <w:b w:val="0"/>
-          <w:sz w:val="22"/>
-        </w:rPr>
-        <w:t>India market leadership in commercial vehicles; focus on uptime, total cost of ownership, and fleet solutions.</w:t>
-      </w:r>
-    </w:p>
-    <w:p>
-      <w:pPr>
-        <w:spacing w:before="160" w:after="120"/>
-      </w:pPr>
-      <w:r>
-        <w:rPr>
-          <w:rFonts w:ascii="Calibri" w:hAnsi="Calibri" w:eastAsia="Calibri"/>
-          <w:b/>
-          <w:color w:val="003366"/>
-          <w:sz w:val="28"/>
-        </w:rPr>
-        <w:t>3.2 Tata Passenger Vehicles (PV)</w:t>
-      </w:r>
-    </w:p>
-    <w:p>
-      <w:pPr>
-        <w:pStyle w:val="ListBullet"/>
-      </w:pPr>
-      <w:r>
-        <w:rPr>
-          <w:rFonts w:ascii="Calibri" w:hAnsi="Calibri" w:eastAsia="Calibri"/>
-          <w:b w:val="0"/>
-          <w:sz w:val="22"/>
-        </w:rPr>
-        <w:t>Hatchbacks and compact cars (e.g., Tiago, Altroz).</w:t>
-      </w:r>
-    </w:p>
-    <w:p>
-      <w:pPr>
-        <w:pStyle w:val="ListBullet"/>
-      </w:pPr>
-      <w:r>
-        <w:rPr>
-          <w:rFonts w:ascii="Calibri" w:hAnsi="Calibri" w:eastAsia="Calibri"/>
-          <w:b w:val="0"/>
-          <w:sz w:val="22"/>
-        </w:rPr>
-        <w:t>SUVs and crossovers (e.g., Punch, Nexon, Harrier, Safari).</w:t>
-      </w:r>
-    </w:p>
-    <w:p>
-      <w:pPr>
-        <w:pStyle w:val="ListBullet"/>
-      </w:pPr>
-      <w:r>
-        <w:rPr>
-          <w:rFonts w:ascii="Calibri" w:hAnsi="Calibri" w:eastAsia="Calibri"/>
-          <w:b w:val="0"/>
-          <w:sz w:val="22"/>
-        </w:rPr>
-        <w:t>Multi-powertrain strategy: petrol, diesel, CNG, and electric variants where offered.</w:t>
-      </w:r>
-    </w:p>
-    <w:p>
-      <w:pPr>
-        <w:pStyle w:val="ListBullet"/>
-      </w:pPr>
-      <w:r>
-        <w:rPr>
-          <w:rFonts w:ascii="Calibri" w:hAnsi="Calibri" w:eastAsia="Calibri"/>
-          <w:b w:val="0"/>
-          <w:sz w:val="22"/>
-        </w:rPr>
-        <w:t>Strong SUV portfolio aligned with Indian market preference; safety ratings (NCAP) used as a brand pillar.</w:t>
-      </w:r>
-    </w:p>
-    <w:p>
-      <w:pPr>
-        <w:spacing w:before="160" w:after="120"/>
-      </w:pPr>
-      <w:r>
-        <w:rPr>
-          <w:rFonts w:ascii="Calibri" w:hAnsi="Calibri" w:eastAsia="Calibri"/>
-          <w:b/>
-          <w:color w:val="003366"/>
-          <w:sz w:val="28"/>
-        </w:rPr>
-        <w:t>3.3 Electric Mobility</w:t>
-      </w:r>
-    </w:p>
-    <w:p>
-      <w:pPr>
-        <w:pStyle w:val="ListBullet"/>
-      </w:pPr>
-      <w:r>
-        <w:rPr>
-          <w:rFonts w:ascii="Calibri" w:hAnsi="Calibri" w:eastAsia="Calibri"/>
-          <w:b w:val="0"/>
-          <w:sz w:val="22"/>
-        </w:rPr>
-        <w:t>Tata Passenger Electric Mobility leads India's passenger EV market with a majority share in many periods.</w:t>
-      </w:r>
-    </w:p>
-    <w:p>
-      <w:pPr>
-        <w:pStyle w:val="ListBullet"/>
-      </w:pPr>
-      <w:r>
-        <w:rPr>
-          <w:rFonts w:ascii="Calibri" w:hAnsi="Calibri" w:eastAsia="Calibri"/>
-          <w:b w:val="0"/>
-          <w:sz w:val="22"/>
-        </w:rPr>
-        <w:t>Models include Nexon EV, Tiago EV, Punch EV, and upcoming platforms.</w:t>
-      </w:r>
-    </w:p>
-    <w:p>
-      <w:pPr>
-        <w:pStyle w:val="ListBullet"/>
-      </w:pPr>
-      <w:r>
-        <w:rPr>
-          <w:rFonts w:ascii="Calibri" w:hAnsi="Calibri" w:eastAsia="Calibri"/>
-          <w:b w:val="0"/>
-          <w:sz w:val="22"/>
-        </w:rPr>
-        <w:t>Ecosystem work includes charging partnerships, battery technology, and software-defined features.</w:t>
-      </w:r>
-    </w:p>
-    <w:p>
-      <w:pPr>
-        <w:pStyle w:val="ListBullet"/>
-      </w:pPr>
-      <w:r>
-        <w:rPr>
-          <w:rFonts w:ascii="Calibri" w:hAnsi="Calibri" w:eastAsia="Calibri"/>
-          <w:b w:val="0"/>
-          <w:sz w:val="22"/>
-        </w:rPr>
-        <w:t>Commercial EV includes electric buses with large fleet kilometres operated in Indian cities.</w:t>
-      </w:r>
-    </w:p>
-    <w:p>
-      <w:pPr>
-        <w:spacing w:before="160" w:after="120"/>
-      </w:pPr>
-      <w:r>
-        <w:rPr>
-          <w:rFonts w:ascii="Calibri" w:hAnsi="Calibri" w:eastAsia="Calibri"/>
-          <w:b/>
-          <w:color w:val="003366"/>
-          <w:sz w:val="28"/>
-        </w:rPr>
-        <w:t>3.4 Jaguar Land Rover (JLR)</w:t>
-      </w:r>
-    </w:p>
-    <w:p>
-      <w:pPr>
-        <w:spacing w:after="160" w:line="276" w:lineRule="auto"/>
-      </w:pPr>
-      <w:r>
-        <w:rPr>
-          <w:rFonts w:ascii="Calibri" w:hAnsi="Calibri" w:eastAsia="Calibri"/>
-          <w:b w:val="0"/>
-          <w:sz w:val="22"/>
-        </w:rPr>
-        <w:t>Acquired in 2008, JLR represents Tata Motors' global premium automotive business with luxury brands Jaguar and Land Rover, advanced engineering, and export-oriented manufacturing in the United Kingdom and other locations.</w:t>
-      </w:r>
-    </w:p>
-    <w:p>
-      <w:pPr>
-        <w:spacing w:before="240" w:after="120"/>
+        <w:spacing w:before="200" w:after="120"/>
       </w:pPr>
       <w:r>
         <w:rPr>
@@ -1257,129 +1115,125 @@
         <w:t>4. History and Development of Tata Motors</w:t>
       </w:r>
     </w:p>
+    <w:tbl>
+      <w:tblPr>
+        <w:tblW w:type="auto" w:w="0"/>
+        <w:jc w:val="center"/>
+        <w:tblLook w:firstColumn="1" w:firstRow="1" w:lastColumn="0" w:lastRow="0" w:noHBand="0" w:noVBand="1" w:val="04A0"/>
+      </w:tblPr>
+      <w:tblGrid>
+        <w:gridCol w:w="4680"/>
+        <w:gridCol w:w="4680"/>
+      </w:tblGrid>
+      <w:tr>
+        <w:tc>
+          <w:tcPr>
+            <w:tcW w:type="dxa" w:w="4680"/>
+          </w:tcPr>
+          <w:p>
+            <w:pPr>
+              <w:jc w:val="center"/>
+            </w:pPr>
+            <w:r>
+              <w:drawing>
+                <wp:inline xmlns:a="http://schemas.openxmlformats.org/drawingml/2006/main" xmlns:pic="http://schemas.openxmlformats.org/drawingml/2006/picture">
+                  <wp:extent cx="2651760" cy="1341664"/>
+                  <wp:docPr id="4" name="Picture 4"/>
+                  <wp:cNvGraphicFramePr>
+                    <a:graphicFrameLocks noChangeAspect="1"/>
+                  </wp:cNvGraphicFramePr>
+                  <a:graphic>
+                    <a:graphicData uri="http://schemas.openxmlformats.org/drawingml/2006/picture">
+                      <pic:pic>
+                        <pic:nvPicPr>
+                          <pic:cNvPr id="0" name="photo_history_collage.jpg"/>
+                          <pic:cNvPicPr/>
+                        </pic:nvPicPr>
+                        <pic:blipFill>
+                          <a:blip r:embed="rId12"/>
+                          <a:stretch>
+                            <a:fillRect/>
+                          </a:stretch>
+                        </pic:blipFill>
+                        <pic:spPr>
+                          <a:xfrm>
+                            <a:off x="0" y="0"/>
+                            <a:ext cx="2651760" cy="1341664"/>
+                          </a:xfrm>
+                          <a:prstGeom prst="rect"/>
+                        </pic:spPr>
+                      </pic:pic>
+                    </a:graphicData>
+                  </a:graphic>
+                </wp:inline>
+              </w:drawing>
+            </w:r>
+          </w:p>
+        </w:tc>
+        <w:tc>
+          <w:tcPr>
+            <w:tcW w:type="dxa" w:w="4680"/>
+          </w:tcPr>
+          <w:p>
+            <w:pPr>
+              <w:jc w:val="center"/>
+            </w:pPr>
+            <w:r>
+              <w:drawing>
+                <wp:inline xmlns:a="http://schemas.openxmlformats.org/drawingml/2006/main" xmlns:pic="http://schemas.openxmlformats.org/drawingml/2006/picture">
+                  <wp:extent cx="2651760" cy="1692707"/>
+                  <wp:docPr id="5" name="Picture 5"/>
+                  <wp:cNvGraphicFramePr>
+                    <a:graphicFrameLocks noChangeAspect="1"/>
+                  </wp:cNvGraphicFramePr>
+                  <a:graphic>
+                    <a:graphicData uri="http://schemas.openxmlformats.org/drawingml/2006/picture">
+                      <pic:pic>
+                        <pic:nvPicPr>
+                          <pic:cNvPr id="0" name="photo_history_indica.jpg"/>
+                          <pic:cNvPicPr/>
+                        </pic:nvPicPr>
+                        <pic:blipFill>
+                          <a:blip r:embed="rId13"/>
+                          <a:stretch>
+                            <a:fillRect/>
+                          </a:stretch>
+                        </pic:blipFill>
+                        <pic:spPr>
+                          <a:xfrm>
+                            <a:off x="0" y="0"/>
+                            <a:ext cx="2651760" cy="1692707"/>
+                          </a:xfrm>
+                          <a:prstGeom prst="rect"/>
+                        </pic:spPr>
+                      </pic:pic>
+                    </a:graphicData>
+                  </a:graphic>
+                </wp:inline>
+              </w:drawing>
+            </w:r>
+          </w:p>
+        </w:tc>
+      </w:tr>
+    </w:tbl>
+    <w:p/>
     <w:p>
       <w:pPr>
-        <w:jc w:val="center"/>
-      </w:pPr>
-      <w:r>
-        <w:drawing>
-          <wp:inline xmlns:a="http://schemas.openxmlformats.org/drawingml/2006/main" xmlns:pic="http://schemas.openxmlformats.org/drawingml/2006/picture">
-            <wp:extent cx="5486400" cy="1611468"/>
-            <wp:docPr id="7" name="Picture 7"/>
-            <wp:cNvGraphicFramePr>
-              <a:graphicFrameLocks noChangeAspect="1"/>
-            </wp:cNvGraphicFramePr>
-            <a:graphic>
-              <a:graphicData uri="http://schemas.openxmlformats.org/drawingml/2006/picture">
-                <pic:pic>
-                  <pic:nvPicPr>
-                    <pic:cNvPr id="0" name="history_timeline.png"/>
-                    <pic:cNvPicPr/>
-                  </pic:nvPicPr>
-                  <pic:blipFill>
-                    <a:blip r:embed="rId15"/>
-                    <a:stretch>
-                      <a:fillRect/>
-                    </a:stretch>
-                  </pic:blipFill>
-                  <pic:spPr>
-                    <a:xfrm>
-                      <a:off x="0" y="0"/>
-                      <a:ext cx="5486400" cy="1611468"/>
-                    </a:xfrm>
-                    <a:prstGeom prst="rect"/>
-                  </pic:spPr>
-                </pic:pic>
-              </a:graphicData>
-            </a:graphic>
-          </wp:inline>
-        </w:drawing>
-      </w:r>
-    </w:p>
-    <w:p>
-      <w:pPr>
-        <w:jc w:val="center"/>
-      </w:pPr>
-      <w:r>
-        <w:rPr>
-          <w:rFonts w:ascii="Calibri" w:hAnsi="Calibri" w:eastAsia="Calibri"/>
-          <w:b w:val="0"/>
-          <w:color w:val="505050"/>
-          <w:sz w:val="18"/>
-        </w:rPr>
-        <w:t>Figure 4: Key milestones (overview)</w:t>
-      </w:r>
-    </w:p>
-    <w:p>
-      <w:pPr>
-        <w:jc w:val="center"/>
-      </w:pPr>
-      <w:r>
-        <w:drawing>
-          <wp:inline xmlns:a="http://schemas.openxmlformats.org/drawingml/2006/main" xmlns:pic="http://schemas.openxmlformats.org/drawingml/2006/picture">
-            <wp:extent cx="5669280" cy="6241935"/>
-            <wp:docPr id="8" name="Picture 8"/>
-            <wp:cNvGraphicFramePr>
-              <a:graphicFrameLocks noChangeAspect="1"/>
-            </wp:cNvGraphicFramePr>
-            <a:graphic>
-              <a:graphicData uri="http://schemas.openxmlformats.org/drawingml/2006/picture">
-                <pic:pic>
-                  <pic:nvPicPr>
-                    <pic:cNvPr id="0" name="history_detailed.png"/>
-                    <pic:cNvPicPr/>
-                  </pic:nvPicPr>
-                  <pic:blipFill>
-                    <a:blip r:embed="rId16"/>
-                    <a:stretch>
-                      <a:fillRect/>
-                    </a:stretch>
-                  </pic:blipFill>
-                  <pic:spPr>
-                    <a:xfrm>
-                      <a:off x="0" y="0"/>
-                      <a:ext cx="5669280" cy="6241935"/>
-                    </a:xfrm>
-                    <a:prstGeom prst="rect"/>
-                  </pic:spPr>
-                </pic:pic>
-              </a:graphicData>
-            </a:graphic>
-          </wp:inline>
-        </w:drawing>
-      </w:r>
-    </w:p>
-    <w:p>
-      <w:pPr>
-        <w:jc w:val="center"/>
-      </w:pPr>
-      <w:r>
-        <w:rPr>
-          <w:rFonts w:ascii="Calibri" w:hAnsi="Calibri" w:eastAsia="Calibri"/>
-          <w:b w:val="0"/>
-          <w:color w:val="505050"/>
-          <w:sz w:val="18"/>
-        </w:rPr>
-        <w:t>Figure 5: Detailed historical timeline (1945–2025)</w:t>
-      </w:r>
-    </w:p>
-    <w:p>
-      <w:pPr>
-        <w:spacing w:before="160" w:after="120"/>
+        <w:spacing w:before="200" w:after="120"/>
       </w:pPr>
       <w:r>
         <w:rPr>
           <w:rFonts w:ascii="Calibri" w:hAnsi="Calibri" w:eastAsia="Calibri"/>
           <w:b/>
           <w:color w:val="003366"/>
-          <w:sz w:val="28"/>
+          <w:sz w:val="26"/>
         </w:rPr>
         <w:t>4.1 Early foundation: 1945</w:t>
       </w:r>
     </w:p>
     <w:p>
       <w:pPr>
-        <w:spacing w:after="160" w:line="276" w:lineRule="auto"/>
+        <w:spacing w:line="288" w:lineRule="auto" w:after="160"/>
       </w:pPr>
       <w:r>
         <w:rPr>
@@ -1387,26 +1241,26 @@
           <w:b w:val="0"/>
           <w:sz w:val="22"/>
         </w:rPr>
-        <w:t>Tata Motors was established in 1945 as Tata Engineering and Locomotive Company Limited (TELCO). Its initial activities were associated with locomotives and engineering products, building industrial capability that later supported vehicle manufacturing.</w:t>
+        <w:t>Tata Motors was established in 1945 as TELCO, with initial focus on locomotives and engineering products.</w:t>
       </w:r>
     </w:p>
     <w:p>
       <w:pPr>
-        <w:spacing w:before="160" w:after="120"/>
+        <w:spacing w:before="200" w:after="120"/>
       </w:pPr>
       <w:r>
         <w:rPr>
           <w:rFonts w:ascii="Calibri" w:hAnsi="Calibri" w:eastAsia="Calibri"/>
           <w:b/>
           <w:color w:val="003366"/>
-          <w:sz w:val="28"/>
+          <w:sz w:val="26"/>
         </w:rPr>
         <w:t>4.2 Entry into commercial vehicles: 1950s</w:t>
       </w:r>
     </w:p>
     <w:p>
       <w:pPr>
-        <w:spacing w:after="160" w:line="276" w:lineRule="auto"/>
+        <w:spacing w:line="288" w:lineRule="auto" w:after="160"/>
       </w:pPr>
       <w:r>
         <w:rPr>
@@ -1414,26 +1268,26 @@
           <w:b w:val="0"/>
           <w:sz w:val="22"/>
         </w:rPr>
-        <w:t>The company entered the commercial vehicle sector through collaboration with Daimler-Benz of Germany (1954), marking the beginning of India's organised truck manufacturing ecosystem.</w:t>
+        <w:t>The company entered commercial vehicles through collaboration with Daimler-Benz (1954).</w:t>
       </w:r>
     </w:p>
     <w:p>
       <w:pPr>
-        <w:spacing w:before="160" w:after="120"/>
+        <w:spacing w:before="200" w:after="120"/>
       </w:pPr>
       <w:r>
         <w:rPr>
           <w:rFonts w:ascii="Calibri" w:hAnsi="Calibri" w:eastAsia="Calibri"/>
           <w:b/>
           <w:color w:val="003366"/>
-          <w:sz w:val="28"/>
+          <w:sz w:val="26"/>
         </w:rPr>
         <w:t>4.3 Expansion into passenger vehicles</w:t>
       </w:r>
     </w:p>
     <w:p>
       <w:pPr>
-        <w:spacing w:after="160" w:line="276" w:lineRule="auto"/>
+        <w:spacing w:line="288" w:lineRule="auto" w:after="160"/>
       </w:pPr>
       <w:r>
         <w:rPr>
@@ -1441,26 +1295,26 @@
           <w:b w:val="0"/>
           <w:sz w:val="22"/>
         </w:rPr>
-        <w:t>Passenger vehicles expanded the business beyond commercial transport. The Tata Indica (1998) became a significant milestone as a fully indigenous Indian passenger car. Earlier, Tata Sierra (1991) signalled entry into the passenger segment with an SUV.</w:t>
+        <w:t>Passenger vehicles expanded the business beyond commercial transport. The Tata Indica (1998) became a milestone as an indigenously developed passenger car.</w:t>
       </w:r>
     </w:p>
     <w:p>
       <w:pPr>
-        <w:spacing w:before="160" w:after="120"/>
+        <w:spacing w:before="200" w:after="120"/>
       </w:pPr>
       <w:r>
         <w:rPr>
           <w:rFonts w:ascii="Calibri" w:hAnsi="Calibri" w:eastAsia="Calibri"/>
           <w:b/>
           <w:color w:val="003366"/>
-          <w:sz w:val="28"/>
+          <w:sz w:val="26"/>
         </w:rPr>
         <w:t>4.4 International expansion: 2000s</w:t>
       </w:r>
     </w:p>
     <w:p>
       <w:pPr>
-        <w:spacing w:after="160" w:line="276" w:lineRule="auto"/>
+        <w:spacing w:line="288" w:lineRule="auto" w:after="160"/>
       </w:pPr>
       <w:r>
         <w:rPr>
@@ -1468,26 +1322,26 @@
           <w:b w:val="0"/>
           <w:sz w:val="22"/>
         </w:rPr>
-        <w:t>In 2004, Tata Motors acquired Daewoo Commercial Vehicle Company in South Korea. In 2008, it acquired Jaguar Land Rover from Ford Motor Company—a landmark global acquisition that added luxury brands and advanced engineering capabilities.</w:t>
+        <w:t>2004: Daewoo Commercial Vehicle Company (South Korea). 2008: Jaguar Land Rover acquired from Ford — a landmark global acquisition.</w:t>
       </w:r>
     </w:p>
     <w:p>
       <w:pPr>
-        <w:spacing w:before="160" w:after="120"/>
+        <w:spacing w:before="200" w:after="120"/>
       </w:pPr>
       <w:r>
         <w:rPr>
           <w:rFonts w:ascii="Calibri" w:hAnsi="Calibri" w:eastAsia="Calibri"/>
           <w:b/>
           <w:color w:val="003366"/>
-          <w:sz w:val="28"/>
+          <w:sz w:val="26"/>
         </w:rPr>
         <w:t>4.5 Development of modern vehicles</w:t>
       </w:r>
     </w:p>
     <w:p>
       <w:pPr>
-        <w:spacing w:after="160" w:line="276" w:lineRule="auto"/>
+        <w:spacing w:line="288" w:lineRule="auto" w:after="160"/>
       </w:pPr>
       <w:r>
         <w:rPr>
@@ -1495,26 +1349,26 @@
           <w:b w:val="0"/>
           <w:sz w:val="22"/>
         </w:rPr>
-        <w:t>The company introduced products focused on styling, fuel efficiency, safety, comfort, and technology. IMPACT and IMPACT 2.0 design philosophies shaped models such as Tiago, Nexon, Harrier, Safari, and Punch. Tata Ace (2005) revolutionised last-mile logistics; Tata Ultra (2014) strengthened intermediate commercial trucks.</w:t>
+        <w:t>Modern lineup includes Tiago, Nexon, Harrier, Safari, Punch, and Curvv with improved safety, design, and technology.</w:t>
       </w:r>
     </w:p>
     <w:p>
       <w:pPr>
-        <w:spacing w:before="160" w:after="120"/>
+        <w:spacing w:before="200" w:after="120"/>
       </w:pPr>
       <w:r>
         <w:rPr>
           <w:rFonts w:ascii="Calibri" w:hAnsi="Calibri" w:eastAsia="Calibri"/>
           <w:b/>
           <w:color w:val="003366"/>
-          <w:sz w:val="28"/>
+          <w:sz w:val="26"/>
         </w:rPr>
         <w:t>4.6 Electric mobility and digital manufacturing</w:t>
       </w:r>
     </w:p>
     <w:p>
       <w:pPr>
-        <w:spacing w:after="160" w:line="276" w:lineRule="auto"/>
+        <w:spacing w:line="288" w:lineRule="auto" w:after="160"/>
       </w:pPr>
       <w:r>
         <w:rPr>
@@ -1522,12 +1376,12 @@
           <w:b w:val="0"/>
           <w:sz w:val="22"/>
         </w:rPr>
-        <w:t>Tata Motors invested in battery-electric vehicles, ZIPTRON powertrain (Nexon EV, 2019), acti.ev platform, charging partnerships, connected features, and smarter factories with automation and AI (as described in FY2024–25 annual reporting). FY25 milestones include 36% CNG+EV share in PV portfolio, hydrogen ICE truck unveil, Curvv launch, and commencement of work on the Tamil Nadu plant.</w:t>
+        <w:t>Investments in battery-electric vehicles, ZIPTRON powertrain, charging partnerships, connected features, automation, and sustainable mobility. FY25 milestones include expanded EV/CNG portfolio and new manufacturing capacity.</w:t>
       </w:r>
     </w:p>
     <w:p>
       <w:pPr>
-        <w:spacing w:before="240" w:after="120"/>
+        <w:spacing w:before="200" w:after="120"/>
       </w:pPr>
       <w:r>
         <w:rPr>
@@ -1539,62 +1393,111 @@
         <w:t>5. Manufacturing Methodology Used by Tata Motors</w:t>
       </w:r>
     </w:p>
+    <w:tbl>
+      <w:tblPr>
+        <w:tblW w:type="auto" w:w="0"/>
+        <w:jc w:val="center"/>
+        <w:tblLook w:firstColumn="1" w:firstRow="1" w:lastColumn="0" w:lastRow="0" w:noHBand="0" w:noVBand="1" w:val="04A0"/>
+      </w:tblPr>
+      <w:tblGrid>
+        <w:gridCol w:w="4680"/>
+        <w:gridCol w:w="4680"/>
+      </w:tblGrid>
+      <w:tr>
+        <w:tc>
+          <w:tcPr>
+            <w:tcW w:type="dxa" w:w="4680"/>
+          </w:tcPr>
+          <w:p>
+            <w:pPr>
+              <w:jc w:val="center"/>
+            </w:pPr>
+            <w:r>
+              <w:drawing>
+                <wp:inline xmlns:a="http://schemas.openxmlformats.org/drawingml/2006/main" xmlns:pic="http://schemas.openxmlformats.org/drawingml/2006/picture">
+                  <wp:extent cx="2651760" cy="1878330"/>
+                  <wp:docPr id="6" name="Picture 6"/>
+                  <wp:cNvGraphicFramePr>
+                    <a:graphicFrameLocks noChangeAspect="1"/>
+                  </wp:cNvGraphicFramePr>
+                  <a:graphic>
+                    <a:graphicData uri="http://schemas.openxmlformats.org/drawingml/2006/picture">
+                      <pic:pic>
+                        <pic:nvPicPr>
+                          <pic:cNvPr id="0" name="photo_manufacturing_robots.jpg"/>
+                          <pic:cNvPicPr/>
+                        </pic:nvPicPr>
+                        <pic:blipFill>
+                          <a:blip r:embed="rId14"/>
+                          <a:stretch>
+                            <a:fillRect/>
+                          </a:stretch>
+                        </pic:blipFill>
+                        <pic:spPr>
+                          <a:xfrm>
+                            <a:off x="0" y="0"/>
+                            <a:ext cx="2651760" cy="1878330"/>
+                          </a:xfrm>
+                          <a:prstGeom prst="rect"/>
+                        </pic:spPr>
+                      </pic:pic>
+                    </a:graphicData>
+                  </a:graphic>
+                </wp:inline>
+              </w:drawing>
+            </w:r>
+          </w:p>
+        </w:tc>
+        <w:tc>
+          <w:tcPr>
+            <w:tcW w:type="dxa" w:w="4680"/>
+          </w:tcPr>
+          <w:p>
+            <w:pPr>
+              <w:jc w:val="center"/>
+            </w:pPr>
+            <w:r>
+              <w:drawing>
+                <wp:inline xmlns:a="http://schemas.openxmlformats.org/drawingml/2006/main" xmlns:pic="http://schemas.openxmlformats.org/drawingml/2006/picture">
+                  <wp:extent cx="2651760" cy="1864519"/>
+                  <wp:docPr id="7" name="Picture 7"/>
+                  <wp:cNvGraphicFramePr>
+                    <a:graphicFrameLocks noChangeAspect="1"/>
+                  </wp:cNvGraphicFramePr>
+                  <a:graphic>
+                    <a:graphicData uri="http://schemas.openxmlformats.org/drawingml/2006/picture">
+                      <pic:pic>
+                        <pic:nvPicPr>
+                          <pic:cNvPr id="0" name="photo_manufacturing_workers.jpg"/>
+                          <pic:cNvPicPr/>
+                        </pic:nvPicPr>
+                        <pic:blipFill>
+                          <a:blip r:embed="rId15"/>
+                          <a:stretch>
+                            <a:fillRect/>
+                          </a:stretch>
+                        </pic:blipFill>
+                        <pic:spPr>
+                          <a:xfrm>
+                            <a:off x="0" y="0"/>
+                            <a:ext cx="2651760" cy="1864519"/>
+                          </a:xfrm>
+                          <a:prstGeom prst="rect"/>
+                        </pic:spPr>
+                      </pic:pic>
+                    </a:graphicData>
+                  </a:graphic>
+                </wp:inline>
+              </w:drawing>
+            </w:r>
+          </w:p>
+        </w:tc>
+      </w:tr>
+    </w:tbl>
+    <w:p/>
     <w:p>
       <w:pPr>
-        <w:jc w:val="center"/>
-      </w:pPr>
-      <w:r>
-        <w:drawing>
-          <wp:inline xmlns:a="http://schemas.openxmlformats.org/drawingml/2006/main" xmlns:pic="http://schemas.openxmlformats.org/drawingml/2006/picture">
-            <wp:extent cx="5669280" cy="1374371"/>
-            <wp:docPr id="9" name="Picture 9"/>
-            <wp:cNvGraphicFramePr>
-              <a:graphicFrameLocks noChangeAspect="1"/>
-            </wp:cNvGraphicFramePr>
-            <a:graphic>
-              <a:graphicData uri="http://schemas.openxmlformats.org/drawingml/2006/picture">
-                <pic:pic>
-                  <pic:nvPicPr>
-                    <pic:cNvPr id="0" name="manufacturing_flow.png"/>
-                    <pic:cNvPicPr/>
-                  </pic:nvPicPr>
-                  <pic:blipFill>
-                    <a:blip r:embed="rId17"/>
-                    <a:stretch>
-                      <a:fillRect/>
-                    </a:stretch>
-                  </pic:blipFill>
-                  <pic:spPr>
-                    <a:xfrm>
-                      <a:off x="0" y="0"/>
-                      <a:ext cx="5669280" cy="1374371"/>
-                    </a:xfrm>
-                    <a:prstGeom prst="rect"/>
-                  </pic:spPr>
-                </pic:pic>
-              </a:graphicData>
-            </a:graphic>
-          </wp:inline>
-        </w:drawing>
-      </w:r>
-    </w:p>
-    <w:p>
-      <w:pPr>
-        <w:jc w:val="center"/>
-      </w:pPr>
-      <w:r>
-        <w:rPr>
-          <w:rFonts w:ascii="Calibri" w:hAnsi="Calibri" w:eastAsia="Calibri"/>
-          <w:b w:val="0"/>
-          <w:color w:val="505050"/>
-          <w:sz w:val="18"/>
-        </w:rPr>
-        <w:t>Figure 5: Typical vehicle manufacturing flow</w:t>
-      </w:r>
-    </w:p>
-    <w:p>
-      <w:pPr>
-        <w:spacing w:after="160" w:line="276" w:lineRule="auto"/>
+        <w:spacing w:line="288" w:lineRule="auto" w:after="160"/>
       </w:pPr>
       <w:r>
         <w:rPr>
@@ -1602,26 +1505,26 @@
           <w:b w:val="0"/>
           <w:sz w:val="22"/>
         </w:rPr>
-        <w:t>Automobile manufacturing involves coordinated activities from product design and procurement to assembly, inspection, and delivery. Tata Motors uses established automotive practices; exact procedures vary by plant and product line. The following describes widely used methodologies relevant to Tata Motors and the industry.</w:t>
+        <w:t>Automobile manufacturing involves design, procurement, assembly, inspection, and delivery. The following are established practices relevant to Tata Motors operations (general industry methods; exact procedures vary by plant).</w:t>
       </w:r>
     </w:p>
     <w:p>
       <w:pPr>
-        <w:spacing w:before="160" w:after="120"/>
+        <w:spacing w:before="200" w:after="120"/>
       </w:pPr>
       <w:r>
         <w:rPr>
           <w:rFonts w:ascii="Calibri" w:hAnsi="Calibri" w:eastAsia="Calibri"/>
           <w:b/>
           <w:color w:val="003366"/>
-          <w:sz w:val="28"/>
+          <w:sz w:val="26"/>
         </w:rPr>
         <w:t>5.1 Lean manufacturing</w:t>
       </w:r>
     </w:p>
     <w:p>
       <w:pPr>
-        <w:spacing w:after="160" w:line="276" w:lineRule="auto"/>
+        <w:spacing w:line="288" w:lineRule="auto" w:after="160"/>
       </w:pPr>
       <w:r>
         <w:rPr>
@@ -1629,26 +1532,26 @@
           <w:b w:val="0"/>
           <w:sz w:val="22"/>
         </w:rPr>
-        <w:t>Reduces waste and improves material flow through elimination of unnecessary movement, excess inventory, and rework while improving productivity and quality.</w:t>
+        <w:t>Reduces waste; improves flow of materials and work.</w:t>
       </w:r>
     </w:p>
     <w:p>
       <w:pPr>
-        <w:spacing w:before="160" w:after="120"/>
+        <w:spacing w:before="200" w:after="120"/>
       </w:pPr>
       <w:r>
         <w:rPr>
           <w:rFonts w:ascii="Calibri" w:hAnsi="Calibri" w:eastAsia="Calibri"/>
           <w:b/>
           <w:color w:val="003366"/>
-          <w:sz w:val="28"/>
+          <w:sz w:val="26"/>
         </w:rPr>
-        <w:t>5.2 Just-in-Time (JIT) production</w:t>
+        <w:t>5.2 Just-in-Time (JIT)</w:t>
       </w:r>
     </w:p>
     <w:p>
       <w:pPr>
-        <w:spacing w:after="160" w:line="276" w:lineRule="auto"/>
+        <w:spacing w:line="288" w:lineRule="auto" w:after="160"/>
       </w:pPr>
       <w:r>
         <w:rPr>
@@ -1656,26 +1559,26 @@
           <w:b w:val="0"/>
           <w:sz w:val="22"/>
         </w:rPr>
-        <w:t>Supplies components when needed on the line, requiring reliable suppliers and accurate scheduling.</w:t>
+        <w:t>Supplies components when required on the production line.</w:t>
       </w:r>
     </w:p>
     <w:p>
       <w:pPr>
-        <w:spacing w:before="160" w:after="120"/>
+        <w:spacing w:before="200" w:after="120"/>
       </w:pPr>
       <w:r>
         <w:rPr>
           <w:rFonts w:ascii="Calibri" w:hAnsi="Calibri" w:eastAsia="Calibri"/>
           <w:b/>
           <w:color w:val="003366"/>
-          <w:sz w:val="28"/>
+          <w:sz w:val="26"/>
         </w:rPr>
-        <w:t>5.3 Kaizen and continuous improvement</w:t>
+        <w:t>5.3 Kaizen</w:t>
       </w:r>
     </w:p>
     <w:p>
       <w:pPr>
-        <w:spacing w:after="160" w:line="276" w:lineRule="auto"/>
+        <w:spacing w:line="288" w:lineRule="auto" w:after="160"/>
       </w:pPr>
       <w:r>
         <w:rPr>
@@ -1683,26 +1586,26 @@
           <w:b w:val="0"/>
           <w:sz w:val="22"/>
         </w:rPr>
-        <w:t>Employees and supervisors identify problems and implement incremental improvements in safety, quality, and workflow.</w:t>
+        <w:t>Continuous incremental improvement by employees and supervisors.</w:t>
       </w:r>
     </w:p>
     <w:p>
       <w:pPr>
-        <w:spacing w:before="160" w:after="120"/>
+        <w:spacing w:before="200" w:after="120"/>
       </w:pPr>
       <w:r>
         <w:rPr>
           <w:rFonts w:ascii="Calibri" w:hAnsi="Calibri" w:eastAsia="Calibri"/>
           <w:b/>
           <w:color w:val="003366"/>
-          <w:sz w:val="28"/>
+          <w:sz w:val="26"/>
         </w:rPr>
-        <w:t>5.4 Total Quality Management (TQM)</w:t>
+        <w:t>5.4 Total Quality Management</w:t>
       </w:r>
     </w:p>
     <w:p>
       <w:pPr>
-        <w:spacing w:after="160" w:line="276" w:lineRule="auto"/>
+        <w:spacing w:line="288" w:lineRule="auto" w:after="160"/>
       </w:pPr>
       <w:r>
         <w:rPr>
@@ -1710,26 +1613,26 @@
           <w:b w:val="0"/>
           <w:sz w:val="22"/>
         </w:rPr>
-        <w:t>Quality is built across design, production, and service—not only at final inspection.</w:t>
+        <w:t>Quality across design, production, and service—not only inspection.</w:t>
       </w:r>
     </w:p>
     <w:p>
       <w:pPr>
-        <w:spacing w:before="160" w:after="120"/>
+        <w:spacing w:before="200" w:after="120"/>
       </w:pPr>
       <w:r>
         <w:rPr>
           <w:rFonts w:ascii="Calibri" w:hAnsi="Calibri" w:eastAsia="Calibri"/>
           <w:b/>
           <w:color w:val="003366"/>
-          <w:sz w:val="28"/>
+          <w:sz w:val="26"/>
         </w:rPr>
-        <w:t>5.5 Automation, robotics, CAD/CAM</w:t>
+        <w:t>5.5 Automation and robotics</w:t>
       </w:r>
     </w:p>
     <w:p>
       <w:pPr>
-        <w:spacing w:after="160" w:line="276" w:lineRule="auto"/>
+        <w:spacing w:line="288" w:lineRule="auto" w:after="160"/>
       </w:pPr>
       <w:r>
         <w:rPr>
@@ -1737,26 +1640,26 @@
           <w:b w:val="0"/>
           <w:sz w:val="22"/>
         </w:rPr>
-        <w:t>Robots improve precision in welding and handling; CAD/CAM supports digital design and manufacturing planning.</w:t>
+        <w:t>Improves precision and repeatability in welding and assembly.</w:t>
       </w:r>
     </w:p>
     <w:p>
       <w:pPr>
-        <w:spacing w:before="160" w:after="120"/>
+        <w:spacing w:before="200" w:after="120"/>
       </w:pPr>
       <w:r>
         <w:rPr>
           <w:rFonts w:ascii="Calibri" w:hAnsi="Calibri" w:eastAsia="Calibri"/>
           <w:b/>
           <w:color w:val="003366"/>
-          <w:sz w:val="28"/>
+          <w:sz w:val="26"/>
         </w:rPr>
-        <w:t>5.6 Supply chain and vendor management</w:t>
+        <w:t>5.6 CAD / CAM</w:t>
       </w:r>
     </w:p>
     <w:p>
       <w:pPr>
-        <w:spacing w:after="160" w:line="276" w:lineRule="auto"/>
+        <w:spacing w:line="288" w:lineRule="auto" w:after="160"/>
       </w:pPr>
       <w:r>
         <w:rPr>
@@ -1764,26 +1667,26 @@
           <w:b w:val="0"/>
           <w:sz w:val="22"/>
         </w:rPr>
-        <w:t>Steel, tyres, electronics, batteries, and assemblies are sourced from a large vendor network with incoming quality checks.</w:t>
+        <w:t>Digital design and manufacturing planning.</w:t>
       </w:r>
     </w:p>
     <w:p>
       <w:pPr>
-        <w:spacing w:before="160" w:after="120"/>
+        <w:spacing w:before="200" w:after="120"/>
       </w:pPr>
       <w:r>
         <w:rPr>
           <w:rFonts w:ascii="Calibri" w:hAnsi="Calibri" w:eastAsia="Calibri"/>
           <w:b/>
           <w:color w:val="003366"/>
-          <w:sz w:val="28"/>
+          <w:sz w:val="26"/>
         </w:rPr>
-        <w:t>5.7 Safety and environmental management</w:t>
+        <w:t>5.7 Supply chain management</w:t>
       </w:r>
     </w:p>
     <w:p>
       <w:pPr>
-        <w:spacing w:after="160" w:line="276" w:lineRule="auto"/>
+        <w:spacing w:line="288" w:lineRule="auto" w:after="160"/>
       </w:pPr>
       <w:r>
         <w:rPr>
@@ -1791,26 +1694,26 @@
           <w:b w:val="0"/>
           <w:sz w:val="22"/>
         </w:rPr>
-        <w:t>Plants manage occupational safety, energy, emissions, wastewater, and statutory environmental compliance.</w:t>
+        <w:t>Vendor quality, inventory, scheduling, and logistics.</w:t>
       </w:r>
     </w:p>
     <w:p>
       <w:pPr>
-        <w:spacing w:before="160" w:after="120"/>
+        <w:spacing w:before="200" w:after="120"/>
       </w:pPr>
       <w:r>
         <w:rPr>
           <w:rFonts w:ascii="Calibri" w:hAnsi="Calibri" w:eastAsia="Calibri"/>
           <w:b/>
           <w:color w:val="003366"/>
-          <w:sz w:val="28"/>
+          <w:sz w:val="26"/>
         </w:rPr>
-        <w:t>5.8 Electric vehicle manufacturing</w:t>
+        <w:t>5.8 Safety and environment</w:t>
       </w:r>
     </w:p>
     <w:p>
       <w:pPr>
-        <w:spacing w:after="160" w:line="276" w:lineRule="auto"/>
+        <w:spacing w:line="288" w:lineRule="auto" w:after="160"/>
       </w:pPr>
       <w:r>
         <w:rPr>
@@ -1818,26 +1721,26 @@
           <w:b w:val="0"/>
           <w:sz w:val="22"/>
         </w:rPr>
-        <w:t>Adds high-voltage battery assembly, thermal management, power electronics, and strict electrical safety protocols.</w:t>
+        <w:t>Occupational safety, emissions, waste, and compliance.</w:t>
       </w:r>
     </w:p>
     <w:p>
       <w:pPr>
-        <w:spacing w:before="160" w:after="120"/>
+        <w:spacing w:before="200" w:after="120"/>
       </w:pPr>
       <w:r>
         <w:rPr>
           <w:rFonts w:ascii="Calibri" w:hAnsi="Calibri" w:eastAsia="Calibri"/>
           <w:b/>
           <w:color w:val="003366"/>
-          <w:sz w:val="28"/>
+          <w:sz w:val="26"/>
         </w:rPr>
-        <w:t>5.9 Quality inspection and testing</w:t>
+        <w:t>5.9 EV manufacturing</w:t>
       </w:r>
     </w:p>
     <w:p>
       <w:pPr>
-        <w:spacing w:after="160" w:line="276" w:lineRule="auto"/>
+        <w:spacing w:line="288" w:lineRule="auto" w:after="160"/>
       </w:pPr>
       <w:r>
         <w:rPr>
@@ -1845,12 +1748,44 @@
           <w:b w:val="0"/>
           <w:sz w:val="22"/>
         </w:rPr>
-        <w:t>Includes body and paint checks, electrical tests, powertrain checks, brake/steering inspection, leak tests, and road tests as applicable.</w:t>
+        <w:t>Battery packs, high-voltage safety, motors, and power electronics.</w:t>
       </w:r>
     </w:p>
     <w:p>
       <w:pPr>
-        <w:spacing w:before="240" w:after="120"/>
+        <w:spacing w:before="200" w:after="120"/>
+      </w:pPr>
+      <w:r>
+        <w:rPr>
+          <w:rFonts w:ascii="Calibri" w:hAnsi="Calibri" w:eastAsia="Calibri"/>
+          <w:b/>
+          <w:color w:val="003366"/>
+          <w:sz w:val="26"/>
+        </w:rPr>
+        <w:t>5.10 Quality testing</w:t>
+      </w:r>
+    </w:p>
+    <w:p>
+      <w:pPr>
+        <w:spacing w:line="288" w:lineRule="auto" w:after="160"/>
+      </w:pPr>
+      <w:r>
+        <w:rPr>
+          <w:rFonts w:ascii="Calibri" w:hAnsi="Calibri" w:eastAsia="Calibri"/>
+          <w:b w:val="0"/>
+          <w:sz w:val="22"/>
+        </w:rPr>
+        <w:t>Body, paint, electrical, powertrain, brake, leak, and road tests.</w:t>
+      </w:r>
+    </w:p>
+    <w:p>
+      <w:r>
+        <w:br w:type="page"/>
+      </w:r>
+    </w:p>
+    <w:p>
+      <w:pPr>
+        <w:spacing w:before="200" w:after="120"/>
       </w:pPr>
       <w:r>
         <w:rPr>
@@ -1864,7 +1799,7 @@
     </w:p>
     <w:p>
       <w:pPr>
-        <w:spacing w:after="160" w:line="276" w:lineRule="auto"/>
+        <w:spacing w:line="288" w:lineRule="auto" w:after="160"/>
       </w:pPr>
       <w:r>
         <w:rPr>
@@ -1872,231 +1807,358 @@
           <w:b w:val="0"/>
           <w:sz w:val="22"/>
         </w:rPr>
-        <w:t>Tata Motors manufactures a wide portfolio for personal mobility, logistics, and public transport. Representative families are summarised below (model lists change with product lifecycle).</w:t>
+        <w:t>Tata Motors has developed a wide range of vehicles for individual customers, businesses, and public transport operators.</w:t>
       </w:r>
     </w:p>
     <w:tbl>
       <w:tblPr>
-        <w:tblStyle w:val="TableGrid"/>
         <w:tblW w:type="auto" w:w="0"/>
+        <w:tblLayout w:type="fixed"/>
         <w:tblLook w:firstColumn="1" w:firstRow="1" w:lastColumn="0" w:lastRow="0" w:noHBand="0" w:noVBand="1" w:val="04A0"/>
       </w:tblPr>
       <w:tblGrid>
-        <w:gridCol w:w="3120"/>
-        <w:gridCol w:w="3120"/>
-        <w:gridCol w:w="3120"/>
+        <w:gridCol w:w="3744"/>
+        <w:gridCol w:w="5472"/>
       </w:tblGrid>
       <w:tr>
         <w:tc>
           <w:tcPr>
-            <w:tcW w:type="dxa" w:w="3120"/>
-            <w:shd w:fill="003366"/>
+            <w:tcW w:type="dxa" w:w="4680"/>
           </w:tcPr>
           <w:p>
+            <w:pPr>
+              <w:jc w:val="center"/>
+            </w:pPr>
             <w:r>
-              <w:rPr>
-                <w:b/>
-                <w:color w:val="FFFFFF"/>
-              </w:rPr>
-              <w:t>Segment</w:t>
+              <w:drawing>
+                <wp:inline xmlns:a="http://schemas.openxmlformats.org/drawingml/2006/main" xmlns:pic="http://schemas.openxmlformats.org/drawingml/2006/picture">
+                  <wp:extent cx="2194560" cy="700460"/>
+                  <wp:docPr id="8" name="Picture 8"/>
+                  <wp:cNvGraphicFramePr>
+                    <a:graphicFrameLocks noChangeAspect="1"/>
+                  </wp:cNvGraphicFramePr>
+                  <a:graphic>
+                    <a:graphicData uri="http://schemas.openxmlformats.org/drawingml/2006/picture">
+                      <pic:pic>
+                        <pic:nvPicPr>
+                          <pic:cNvPr id="0" name="product_passenger_suv.jpg"/>
+                          <pic:cNvPicPr/>
+                        </pic:nvPicPr>
+                        <pic:blipFill>
+                          <a:blip r:embed="rId16"/>
+                          <a:stretch>
+                            <a:fillRect/>
+                          </a:stretch>
+                        </pic:blipFill>
+                        <pic:spPr>
+                          <a:xfrm>
+                            <a:off x="0" y="0"/>
+                            <a:ext cx="2194560" cy="700460"/>
+                          </a:xfrm>
+                          <a:prstGeom prst="rect"/>
+                        </pic:spPr>
+                      </pic:pic>
+                    </a:graphicData>
+                  </a:graphic>
+                </wp:inline>
+              </w:drawing>
             </w:r>
           </w:p>
         </w:tc>
         <w:tc>
           <w:tcPr>
-            <w:tcW w:type="dxa" w:w="3120"/>
-            <w:shd w:fill="003366"/>
+            <w:tcW w:type="dxa" w:w="4680"/>
           </w:tcPr>
           <w:p>
             <w:r>
               <w:rPr>
+                <w:rFonts w:ascii="Calibri" w:hAnsi="Calibri" w:eastAsia="Calibri"/>
                 <w:b/>
-                <w:color w:val="FFFFFF"/>
+                <w:color w:val="1F4E79"/>
+                <w:sz w:val="22"/>
               </w:rPr>
-              <w:t>Category</w:t>
+              <w:t>6.1 Passenger cars and SUVs</w:t>
+              <w:br/>
+            </w:r>
+            <w:r>
+              <w:rPr>
+                <w:rFonts w:ascii="Calibri" w:hAnsi="Calibri" w:eastAsia="Calibri"/>
+                <w:b w:val="0"/>
+                <w:sz w:val="22"/>
+              </w:rPr>
+              <w:t>Designed for personal and family transport. Examples: Tiago, Altroz, Tigor, Punch, Nexon, Harrier, Safari, and Curvv.</w:t>
+            </w:r>
+          </w:p>
+        </w:tc>
+      </w:tr>
+    </w:tbl>
+    <w:p/>
+    <w:tbl>
+      <w:tblPr>
+        <w:tblW w:type="auto" w:w="0"/>
+        <w:tblLayout w:type="fixed"/>
+        <w:tblLook w:firstColumn="1" w:firstRow="1" w:lastColumn="0" w:lastRow="0" w:noHBand="0" w:noVBand="1" w:val="04A0"/>
+      </w:tblPr>
+      <w:tblGrid>
+        <w:gridCol w:w="3744"/>
+        <w:gridCol w:w="5472"/>
+      </w:tblGrid>
+      <w:tr>
+        <w:tc>
+          <w:tcPr>
+            <w:tcW w:type="dxa" w:w="4680"/>
+          </w:tcPr>
+          <w:p>
+            <w:pPr>
+              <w:jc w:val="center"/>
+            </w:pPr>
+            <w:r>
+              <w:drawing>
+                <wp:inline xmlns:a="http://schemas.openxmlformats.org/drawingml/2006/main" xmlns:pic="http://schemas.openxmlformats.org/drawingml/2006/picture">
+                  <wp:extent cx="2194560" cy="628850"/>
+                  <wp:docPr id="9" name="Picture 9"/>
+                  <wp:cNvGraphicFramePr>
+                    <a:graphicFrameLocks noChangeAspect="1"/>
+                  </wp:cNvGraphicFramePr>
+                  <a:graphic>
+                    <a:graphicData uri="http://schemas.openxmlformats.org/drawingml/2006/picture">
+                      <pic:pic>
+                        <pic:nvPicPr>
+                          <pic:cNvPr id="0" name="product_ev.jpg"/>
+                          <pic:cNvPicPr/>
+                        </pic:nvPicPr>
+                        <pic:blipFill>
+                          <a:blip r:embed="rId17"/>
+                          <a:stretch>
+                            <a:fillRect/>
+                          </a:stretch>
+                        </pic:blipFill>
+                        <pic:spPr>
+                          <a:xfrm>
+                            <a:off x="0" y="0"/>
+                            <a:ext cx="2194560" cy="628850"/>
+                          </a:xfrm>
+                          <a:prstGeom prst="rect"/>
+                        </pic:spPr>
+                      </pic:pic>
+                    </a:graphicData>
+                  </a:graphic>
+                </wp:inline>
+              </w:drawing>
             </w:r>
           </w:p>
         </w:tc>
         <w:tc>
           <w:tcPr>
-            <w:tcW w:type="dxa" w:w="3120"/>
-            <w:shd w:fill="003366"/>
+            <w:tcW w:type="dxa" w:w="4680"/>
           </w:tcPr>
           <w:p>
             <w:r>
               <w:rPr>
+                <w:rFonts w:ascii="Calibri" w:hAnsi="Calibri" w:eastAsia="Calibri"/>
                 <w:b/>
-                <w:color w:val="FFFFFF"/>
+                <w:color w:val="1F4E79"/>
+                <w:sz w:val="22"/>
               </w:rPr>
-              <w:t>Examples</w:t>
+              <w:t>6.2 Electric vehicles</w:t>
+              <w:br/>
+            </w:r>
+            <w:r>
+              <w:rPr>
+                <w:rFonts w:ascii="Calibri" w:hAnsi="Calibri" w:eastAsia="Calibri"/>
+                <w:b w:val="0"/>
+                <w:sz w:val="22"/>
+              </w:rPr>
+              <w:t>Battery-electric models such as Nexon EV, Tiago EV, Punch EV, and Tigor EV support lower emissions and sustainable mobility.</w:t>
             </w:r>
           </w:p>
         </w:tc>
       </w:tr>
+    </w:tbl>
+    <w:p/>
+    <w:tbl>
+      <w:tblPr>
+        <w:tblW w:type="auto" w:w="0"/>
+        <w:tblLayout w:type="fixed"/>
+        <w:tblLook w:firstColumn="1" w:firstRow="1" w:lastColumn="0" w:lastRow="0" w:noHBand="0" w:noVBand="1" w:val="04A0"/>
+      </w:tblPr>
+      <w:tblGrid>
+        <w:gridCol w:w="3744"/>
+        <w:gridCol w:w="5472"/>
+      </w:tblGrid>
       <w:tr>
         <w:tc>
           <w:tcPr>
-            <w:tcW w:type="dxa" w:w="3120"/>
+            <w:tcW w:type="dxa" w:w="4680"/>
           </w:tcPr>
           <w:p>
+            <w:pPr>
+              <w:jc w:val="center"/>
+            </w:pPr>
             <w:r>
-              <w:t>Passenger</w:t>
+              <w:drawing>
+                <wp:inline xmlns:a="http://schemas.openxmlformats.org/drawingml/2006/main" xmlns:pic="http://schemas.openxmlformats.org/drawingml/2006/picture">
+                  <wp:extent cx="2194560" cy="667777"/>
+                  <wp:docPr id="10" name="Picture 10"/>
+                  <wp:cNvGraphicFramePr>
+                    <a:graphicFrameLocks noChangeAspect="1"/>
+                  </wp:cNvGraphicFramePr>
+                  <a:graphic>
+                    <a:graphicData uri="http://schemas.openxmlformats.org/drawingml/2006/picture">
+                      <pic:pic>
+                        <pic:nvPicPr>
+                          <pic:cNvPr id="0" name="product_truck.jpg"/>
+                          <pic:cNvPicPr/>
+                        </pic:nvPicPr>
+                        <pic:blipFill>
+                          <a:blip r:embed="rId18"/>
+                          <a:stretch>
+                            <a:fillRect/>
+                          </a:stretch>
+                        </pic:blipFill>
+                        <pic:spPr>
+                          <a:xfrm>
+                            <a:off x="0" y="0"/>
+                            <a:ext cx="2194560" cy="667777"/>
+                          </a:xfrm>
+                          <a:prstGeom prst="rect"/>
+                        </pic:spPr>
+                      </pic:pic>
+                    </a:graphicData>
+                  </a:graphic>
+                </wp:inline>
+              </w:drawing>
             </w:r>
           </w:p>
         </w:tc>
         <w:tc>
           <w:tcPr>
-            <w:tcW w:type="dxa" w:w="3120"/>
+            <w:tcW w:type="dxa" w:w="4680"/>
           </w:tcPr>
           <w:p>
             <w:r>
-              <w:t>Hatch / sedan</w:t>
+              <w:rPr>
+                <w:rFonts w:ascii="Calibri" w:hAnsi="Calibri" w:eastAsia="Calibri"/>
+                <w:b/>
+                <w:color w:val="1F4E79"/>
+                <w:sz w:val="22"/>
+              </w:rPr>
+              <w:t>6.3 Commercial trucks</w:t>
+              <w:br/>
+            </w:r>
+            <w:r>
+              <w:rPr>
+                <w:rFonts w:ascii="Calibri" w:hAnsi="Calibri" w:eastAsia="Calibri"/>
+                <w:b w:val="0"/>
+                <w:sz w:val="22"/>
+              </w:rPr>
+              <w:t>Used for goods movement across industries. Examples include Prima, Signa, Ultra, and Intra families.</w:t>
+            </w:r>
+          </w:p>
+        </w:tc>
+      </w:tr>
+    </w:tbl>
+    <w:p/>
+    <w:tbl>
+      <w:tblPr>
+        <w:tblW w:type="auto" w:w="0"/>
+        <w:tblLayout w:type="fixed"/>
+        <w:tblLook w:firstColumn="1" w:firstRow="1" w:lastColumn="0" w:lastRow="0" w:noHBand="0" w:noVBand="1" w:val="04A0"/>
+      </w:tblPr>
+      <w:tblGrid>
+        <w:gridCol w:w="3744"/>
+        <w:gridCol w:w="5472"/>
+      </w:tblGrid>
+      <w:tr>
+        <w:tc>
+          <w:tcPr>
+            <w:tcW w:type="dxa" w:w="4680"/>
+          </w:tcPr>
+          <w:p>
+            <w:pPr>
+              <w:jc w:val="center"/>
+            </w:pPr>
+            <w:r>
+              <w:drawing>
+                <wp:inline xmlns:a="http://schemas.openxmlformats.org/drawingml/2006/main" xmlns:pic="http://schemas.openxmlformats.org/drawingml/2006/picture">
+                  <wp:extent cx="2194560" cy="673823"/>
+                  <wp:docPr id="11" name="Picture 11"/>
+                  <wp:cNvGraphicFramePr>
+                    <a:graphicFrameLocks noChangeAspect="1"/>
+                  </wp:cNvGraphicFramePr>
+                  <a:graphic>
+                    <a:graphicData uri="http://schemas.openxmlformats.org/drawingml/2006/picture">
+                      <pic:pic>
+                        <pic:nvPicPr>
+                          <pic:cNvPr id="0" name="product_bus.jpg"/>
+                          <pic:cNvPicPr/>
+                        </pic:nvPicPr>
+                        <pic:blipFill>
+                          <a:blip r:embed="rId19"/>
+                          <a:stretch>
+                            <a:fillRect/>
+                          </a:stretch>
+                        </pic:blipFill>
+                        <pic:spPr>
+                          <a:xfrm>
+                            <a:off x="0" y="0"/>
+                            <a:ext cx="2194560" cy="673823"/>
+                          </a:xfrm>
+                          <a:prstGeom prst="rect"/>
+                        </pic:spPr>
+                      </pic:pic>
+                    </a:graphicData>
+                  </a:graphic>
+                </wp:inline>
+              </w:drawing>
             </w:r>
           </w:p>
         </w:tc>
         <w:tc>
           <w:tcPr>
-            <w:tcW w:type="dxa" w:w="3120"/>
+            <w:tcW w:type="dxa" w:w="4680"/>
           </w:tcPr>
           <w:p>
             <w:r>
-              <w:t>Tiago, Altroz, Tigor</w:t>
+              <w:rPr>
+                <w:rFonts w:ascii="Calibri" w:hAnsi="Calibri" w:eastAsia="Calibri"/>
+                <w:b/>
+                <w:color w:val="1F4E79"/>
+                <w:sz w:val="22"/>
+              </w:rPr>
+              <w:t>6.4 Buses and passenger transport</w:t>
+              <w:br/>
             </w:r>
-          </w:p>
-        </w:tc>
-      </w:tr>
-      <w:tr>
-        <w:tc>
-          <w:tcPr>
-            <w:tcW w:type="dxa" w:w="3120"/>
-          </w:tcPr>
-          <w:p>
             <w:r>
-              <w:t>Passenger</w:t>
-            </w:r>
-          </w:p>
-        </w:tc>
-        <w:tc>
-          <w:tcPr>
-            <w:tcW w:type="dxa" w:w="3120"/>
-          </w:tcPr>
-          <w:p>
-            <w:r>
-              <w:t>SUV / crossover</w:t>
-            </w:r>
-          </w:p>
-        </w:tc>
-        <w:tc>
-          <w:tcPr>
-            <w:tcW w:type="dxa" w:w="3120"/>
-          </w:tcPr>
-          <w:p>
-            <w:r>
-              <w:t>Punch, Nexon, Harrier, Safari, Curvv</w:t>
-            </w:r>
-          </w:p>
-        </w:tc>
-      </w:tr>
-      <w:tr>
-        <w:tc>
-          <w:tcPr>
-            <w:tcW w:type="dxa" w:w="3120"/>
-          </w:tcPr>
-          <w:p>
-            <w:r>
-              <w:t>Commercial</w:t>
-            </w:r>
-          </w:p>
-        </w:tc>
-        <w:tc>
-          <w:tcPr>
-            <w:tcW w:type="dxa" w:w="3120"/>
-          </w:tcPr>
-          <w:p>
-            <w:r>
-              <w:t>SCV / LCV / M&amp;HCV</w:t>
-            </w:r>
-          </w:p>
-        </w:tc>
-        <w:tc>
-          <w:tcPr>
-            <w:tcW w:type="dxa" w:w="3120"/>
-          </w:tcPr>
-          <w:p>
-            <w:r>
-              <w:t>Ace, Intra, Ultra, Prima, Signa</w:t>
-            </w:r>
-          </w:p>
-        </w:tc>
-      </w:tr>
-      <w:tr>
-        <w:tc>
-          <w:tcPr>
-            <w:tcW w:type="dxa" w:w="3120"/>
-          </w:tcPr>
-          <w:p>
-            <w:r>
-              <w:t>Commercial</w:t>
-            </w:r>
-          </w:p>
-        </w:tc>
-        <w:tc>
-          <w:tcPr>
-            <w:tcW w:type="dxa" w:w="3120"/>
-          </w:tcPr>
-          <w:p>
-            <w:r>
-              <w:t>Buses &amp; mobility</w:t>
-            </w:r>
-          </w:p>
-        </w:tc>
-        <w:tc>
-          <w:tcPr>
-            <w:tcW w:type="dxa" w:w="3120"/>
-          </w:tcPr>
-          <w:p>
-            <w:r>
-              <w:t>Starbus, electric buses, staff carriers</w:t>
-            </w:r>
-          </w:p>
-        </w:tc>
-      </w:tr>
-      <w:tr>
-        <w:tc>
-          <w:tcPr>
-            <w:tcW w:type="dxa" w:w="3120"/>
-          </w:tcPr>
-          <w:p>
-            <w:r>
-              <w:t>Electric</w:t>
-            </w:r>
-          </w:p>
-        </w:tc>
-        <w:tc>
-          <w:tcPr>
-            <w:tcW w:type="dxa" w:w="3120"/>
-          </w:tcPr>
-          <w:p>
-            <w:r>
-              <w:t>Passenger &amp; CV EV</w:t>
-            </w:r>
-          </w:p>
-        </w:tc>
-        <w:tc>
-          <w:tcPr>
-            <w:tcW w:type="dxa" w:w="3120"/>
-          </w:tcPr>
-          <w:p>
-            <w:r>
-              <w:t>Nexon EV, Tiago EV, Punch EV, Ace EV</w:t>
+              <w:rPr>
+                <w:rFonts w:ascii="Calibri" w:hAnsi="Calibri" w:eastAsia="Calibri"/>
+                <w:b w:val="0"/>
+                <w:sz w:val="22"/>
+              </w:rPr>
+              <w:t>Buses for city, school, staff, and intercity transport, including electric bus solutions.</w:t>
             </w:r>
           </w:p>
         </w:tc>
       </w:tr>
     </w:tbl>
+    <w:p/>
     <w:p>
       <w:pPr>
-        <w:spacing w:after="160" w:line="276" w:lineRule="auto"/>
+        <w:spacing w:before="200" w:after="120"/>
+      </w:pPr>
+      <w:r>
+        <w:rPr>
+          <w:rFonts w:ascii="Calibri" w:hAnsi="Calibri" w:eastAsia="Calibri"/>
+          <w:b/>
+          <w:color w:val="003366"/>
+          <w:sz w:val="26"/>
+        </w:rPr>
+        <w:t>6.5 Relevance for ECE internship</w:t>
+      </w:r>
+    </w:p>
+    <w:p>
+      <w:pPr>
+        <w:spacing w:line="288" w:lineRule="auto" w:after="160"/>
       </w:pPr>
       <w:r>
         <w:rPr>
@@ -2104,501 +2166,12 @@
           <w:b w:val="0"/>
           <w:sz w:val="22"/>
         </w:rPr>
-        <w:t>Tata Motors serves individual customers, businesses, logistics operators, and public transport authorities. Passenger offerings span affordable hatchbacks to premium SUVs; commercial offerings span mini-trucks to heavy haulage and electric buses; the EV line supports personal and fleet electrification.</w:t>
+        <w:t>Electronics and Communication Engineering students may learn about wiring harnesses, ECU diagnostics, earthing and safety checks, BMS basics on EV lines, PLC automation, and end-of-line electrical testing during authorised plant training (e.g., Pune, Sanand, Jamshedpur).</w:t>
       </w:r>
     </w:p>
     <w:p>
       <w:pPr>
-        <w:jc w:val="center"/>
-      </w:pPr>
-      <w:r>
-        <w:drawing>
-          <wp:inline xmlns:a="http://schemas.openxmlformats.org/drawingml/2006/main" xmlns:pic="http://schemas.openxmlformats.org/drawingml/2006/picture">
-            <wp:extent cx="5852160" cy="3446869"/>
-            <wp:docPr id="10" name="Picture 10"/>
-            <wp:cNvGraphicFramePr>
-              <a:graphicFrameLocks noChangeAspect="1"/>
-            </wp:cNvGraphicFramePr>
-            <a:graphic>
-              <a:graphicData uri="http://schemas.openxmlformats.org/drawingml/2006/picture">
-                <pic:pic>
-                  <pic:nvPicPr>
-                    <pic:cNvPr id="0" name="products_showcase.png"/>
-                    <pic:cNvPicPr/>
-                  </pic:nvPicPr>
-                  <pic:blipFill>
-                    <a:blip r:embed="rId18"/>
-                    <a:stretch>
-                      <a:fillRect/>
-                    </a:stretch>
-                  </pic:blipFill>
-                  <pic:spPr>
-                    <a:xfrm>
-                      <a:off x="0" y="0"/>
-                      <a:ext cx="5852160" cy="3446869"/>
-                    </a:xfrm>
-                    <a:prstGeom prst="rect"/>
-                  </pic:spPr>
-                </pic:pic>
-              </a:graphicData>
-            </a:graphic>
-          </wp:inline>
-        </w:drawing>
-      </w:r>
-    </w:p>
-    <w:p>
-      <w:pPr>
-        <w:jc w:val="center"/>
-      </w:pPr>
-      <w:r>
-        <w:rPr>
-          <w:rFonts w:ascii="Calibri" w:hAnsi="Calibri" w:eastAsia="Calibri"/>
-          <w:b w:val="0"/>
-          <w:color w:val="505050"/>
-          <w:sz w:val="18"/>
-        </w:rPr>
-        <w:t>Figure 6: Key products with segment description (visual catalogue)</w:t>
-      </w:r>
-    </w:p>
-    <w:p>
-      <w:pPr>
-        <w:jc w:val="center"/>
-      </w:pPr>
-      <w:r>
-        <w:drawing>
-          <wp:inline xmlns:a="http://schemas.openxmlformats.org/drawingml/2006/main" xmlns:pic="http://schemas.openxmlformats.org/drawingml/2006/picture">
-            <wp:extent cx="5669280" cy="4399531"/>
-            <wp:docPr id="11" name="Picture 11"/>
-            <wp:cNvGraphicFramePr>
-              <a:graphicFrameLocks noChangeAspect="1"/>
-            </wp:cNvGraphicFramePr>
-            <a:graphic>
-              <a:graphicData uri="http://schemas.openxmlformats.org/drawingml/2006/picture">
-                <pic:pic>
-                  <pic:nvPicPr>
-                    <pic:cNvPr id="0" name="vehicle_portfolio.png"/>
-                    <pic:cNvPicPr/>
-                  </pic:nvPicPr>
-                  <pic:blipFill>
-                    <a:blip r:embed="rId19"/>
-                    <a:stretch>
-                      <a:fillRect/>
-                    </a:stretch>
-                  </pic:blipFill>
-                  <pic:spPr>
-                    <a:xfrm>
-                      <a:off x="0" y="0"/>
-                      <a:ext cx="5669280" cy="4399531"/>
-                    </a:xfrm>
-                    <a:prstGeom prst="rect"/>
-                  </pic:spPr>
-                </pic:pic>
-              </a:graphicData>
-            </a:graphic>
-          </wp:inline>
-        </w:drawing>
-      </w:r>
-    </w:p>
-    <w:p>
-      <w:pPr>
-        <w:jc w:val="center"/>
-      </w:pPr>
-      <w:r>
-        <w:rPr>
-          <w:rFonts w:ascii="Calibri" w:hAnsi="Calibri" w:eastAsia="Calibri"/>
-          <w:b w:val="0"/>
-          <w:color w:val="505050"/>
-          <w:sz w:val="18"/>
-        </w:rPr>
-        <w:t>Figure 7: Representative product families across segments</w:t>
-      </w:r>
-    </w:p>
-    <w:p>
-      <w:pPr>
-        <w:jc w:val="center"/>
-      </w:pPr>
-      <w:r>
-        <w:drawing>
-          <wp:inline xmlns:a="http://schemas.openxmlformats.org/drawingml/2006/main" xmlns:pic="http://schemas.openxmlformats.org/drawingml/2006/picture">
-            <wp:extent cx="5303520" cy="2324014"/>
-            <wp:docPr id="12" name="Picture 12"/>
-            <wp:cNvGraphicFramePr>
-              <a:graphicFrameLocks noChangeAspect="1"/>
-            </wp:cNvGraphicFramePr>
-            <a:graphic>
-              <a:graphicData uri="http://schemas.openxmlformats.org/drawingml/2006/picture">
-                <pic:pic>
-                  <pic:nvPicPr>
-                    <pic:cNvPr id="0" name="ev_ecosystem.png"/>
-                    <pic:cNvPicPr/>
-                  </pic:nvPicPr>
-                  <pic:blipFill>
-                    <a:blip r:embed="rId20"/>
-                    <a:stretch>
-                      <a:fillRect/>
-                    </a:stretch>
-                  </pic:blipFill>
-                  <pic:spPr>
-                    <a:xfrm>
-                      <a:off x="0" y="0"/>
-                      <a:ext cx="5303520" cy="2324014"/>
-                    </a:xfrm>
-                    <a:prstGeom prst="rect"/>
-                  </pic:spPr>
-                </pic:pic>
-              </a:graphicData>
-            </a:graphic>
-          </wp:inline>
-        </w:drawing>
-      </w:r>
-    </w:p>
-    <w:p>
-      <w:pPr>
-        <w:jc w:val="center"/>
-      </w:pPr>
-      <w:r>
-        <w:rPr>
-          <w:rFonts w:ascii="Calibri" w:hAnsi="Calibri" w:eastAsia="Calibri"/>
-          <w:b w:val="0"/>
-          <w:color w:val="505050"/>
-          <w:sz w:val="18"/>
-        </w:rPr>
-        <w:t>Figure 8: Electric mobility value chain</w:t>
-      </w:r>
-    </w:p>
-    <w:p>
-      <w:pPr>
-        <w:spacing w:before="160" w:after="120"/>
-      </w:pPr>
-      <w:r>
-        <w:rPr>
-          <w:rFonts w:ascii="Calibri" w:hAnsi="Calibri" w:eastAsia="Calibri"/>
-          <w:b/>
-          <w:color w:val="003366"/>
-          <w:sz w:val="28"/>
-        </w:rPr>
-        <w:t>6.1 Research, Development and Electronics (ECE relevance)</w:t>
-      </w:r>
-    </w:p>
-    <w:p>
-      <w:pPr>
-        <w:spacing w:after="160" w:line="276" w:lineRule="auto"/>
-      </w:pPr>
-      <w:r>
-        <w:rPr>
-          <w:rFonts w:ascii="Calibri" w:hAnsi="Calibri" w:eastAsia="Calibri"/>
-          <w:b w:val="0"/>
-          <w:sz w:val="22"/>
-        </w:rPr>
-        <w:t>Modern automobiles are complex electro-mechanical systems. Electronics and Communication Engineering plays a critical role in automotive R&amp;D and production quality.</w:t>
-      </w:r>
-    </w:p>
-    <w:p>
-      <w:pPr>
-        <w:spacing w:after="160" w:line="276" w:lineRule="auto"/>
-      </w:pPr>
-      <w:r>
-        <w:rPr>
-          <w:rFonts w:ascii="Calibri" w:hAnsi="Calibri" w:eastAsia="Calibri"/>
-          <w:b w:val="0"/>
-          <w:sz w:val="22"/>
-        </w:rPr>
-        <w:t>Key electronic domains in Tata Motors vehicles include engine control units (ECU), body control modules, infotainment and telematics, advanced driver assistance sensors, battery management systems (BMS) in EVs, wiring harnesses, communication buses (CAN, LIN, Ethernet in newer architectures), and over-the-air (OTA) software updates in connected cars.</w:t>
-      </w:r>
-    </w:p>
-    <w:p>
-      <w:pPr>
-        <w:spacing w:after="160" w:line="276" w:lineRule="auto"/>
-      </w:pPr>
-      <w:r>
-        <w:rPr>
-          <w:rFonts w:ascii="Calibri" w:hAnsi="Calibri" w:eastAsia="Calibri"/>
-          <w:b w:val="0"/>
-          <w:sz w:val="22"/>
-        </w:rPr>
-        <w:t>Manufacturing and quality teams use electronic test equipment for functional verification, diagnostics, and traceability. Diploma interns in electronics may observe PLC-based automation, robotic cells, end-of-line electrical checks, and instrumentation in paint and assembly shops during authorised plant visits.</w:t>
-      </w:r>
-    </w:p>
-    <w:p>
-      <w:pPr>
-        <w:pStyle w:val="ListBullet"/>
-      </w:pPr>
-      <w:r>
-        <w:rPr>
-          <w:rFonts w:ascii="Calibri" w:hAnsi="Calibri" w:eastAsia="Calibri"/>
-          <w:b w:val="0"/>
-          <w:sz w:val="22"/>
-        </w:rPr>
-        <w:t>Embedded systems: microcontrollers in ECUs and BMS.</w:t>
-      </w:r>
-    </w:p>
-    <w:p>
-      <w:pPr>
-        <w:pStyle w:val="ListBullet"/>
-      </w:pPr>
-      <w:r>
-        <w:rPr>
-          <w:rFonts w:ascii="Calibri" w:hAnsi="Calibri" w:eastAsia="Calibri"/>
-          <w:b w:val="0"/>
-          <w:sz w:val="22"/>
-        </w:rPr>
-        <w:t>Sensors: speed, temperature, pressure, radar/camera for ADAS on higher trims.</w:t>
-      </w:r>
-    </w:p>
-    <w:p>
-      <w:pPr>
-        <w:pStyle w:val="ListBullet"/>
-      </w:pPr>
-      <w:r>
-        <w:rPr>
-          <w:rFonts w:ascii="Calibri" w:hAnsi="Calibri" w:eastAsia="Calibri"/>
-          <w:b w:val="0"/>
-          <w:sz w:val="22"/>
-        </w:rPr>
-        <w:t>Communication: in-vehicle networks linking sensors, displays, and control units.</w:t>
-      </w:r>
-    </w:p>
-    <w:p>
-      <w:pPr>
-        <w:pStyle w:val="ListBullet"/>
-      </w:pPr>
-      <w:r>
-        <w:rPr>
-          <w:rFonts w:ascii="Calibri" w:hAnsi="Calibri" w:eastAsia="Calibri"/>
-          <w:b w:val="0"/>
-          <w:sz w:val="22"/>
-        </w:rPr>
-        <w:t>Power electronics: inverters and converters in electric powertrains.</w:t>
-      </w:r>
-    </w:p>
-    <w:p>
-      <w:pPr>
-        <w:pStyle w:val="ListBullet"/>
-      </w:pPr>
-      <w:r>
-        <w:rPr>
-          <w:rFonts w:ascii="Calibri" w:hAnsi="Calibri" w:eastAsia="Calibri"/>
-          <w:b w:val="0"/>
-          <w:sz w:val="22"/>
-        </w:rPr>
-        <w:t>Quality electronics: test jigs, oscilloscopes, and automated diagnostic stations.</w:t>
-      </w:r>
-    </w:p>
-    <w:p>
-      <w:pPr>
-        <w:jc w:val="center"/>
-      </w:pPr>
-      <w:r>
-        <w:drawing>
-          <wp:inline xmlns:a="http://schemas.openxmlformats.org/drawingml/2006/main" xmlns:pic="http://schemas.openxmlformats.org/drawingml/2006/picture">
-            <wp:extent cx="5029200" cy="3119377"/>
-            <wp:docPr id="13" name="Picture 13"/>
-            <wp:cNvGraphicFramePr>
-              <a:graphicFrameLocks noChangeAspect="1"/>
-            </wp:cNvGraphicFramePr>
-            <a:graphic>
-              <a:graphicData uri="http://schemas.openxmlformats.org/drawingml/2006/picture">
-                <pic:pic>
-                  <pic:nvPicPr>
-                    <pic:cNvPr id="0" name="ece_automotive.png"/>
-                    <pic:cNvPicPr/>
-                  </pic:nvPicPr>
-                  <pic:blipFill>
-                    <a:blip r:embed="rId21"/>
-                    <a:stretch>
-                      <a:fillRect/>
-                    </a:stretch>
-                  </pic:blipFill>
-                  <pic:spPr>
-                    <a:xfrm>
-                      <a:off x="0" y="0"/>
-                      <a:ext cx="5029200" cy="3119377"/>
-                    </a:xfrm>
-                    <a:prstGeom prst="rect"/>
-                  </pic:spPr>
-                </pic:pic>
-              </a:graphicData>
-            </a:graphic>
-          </wp:inline>
-        </w:drawing>
-      </w:r>
-    </w:p>
-    <w:p>
-      <w:pPr>
-        <w:jc w:val="center"/>
-      </w:pPr>
-      <w:r>
-        <w:rPr>
-          <w:rFonts w:ascii="Calibri" w:hAnsi="Calibri" w:eastAsia="Calibri"/>
-          <w:b w:val="0"/>
-          <w:color w:val="505050"/>
-          <w:sz w:val="18"/>
-        </w:rPr>
-        <w:t>Figure 9: Electronics integration in modern vehicles (ECE perspective)</w:t>
-      </w:r>
-    </w:p>
-    <w:p>
-      <w:pPr>
-        <w:spacing w:before="160" w:after="120"/>
-      </w:pPr>
-      <w:r>
-        <w:rPr>
-          <w:rFonts w:ascii="Calibri" w:hAnsi="Calibri" w:eastAsia="Calibri"/>
-          <w:b/>
-          <w:color w:val="003366"/>
-          <w:sz w:val="28"/>
-        </w:rPr>
-        <w:t>6.2 Manufacturing Plants and Operations in India</w:t>
-      </w:r>
-    </w:p>
-    <w:p>
-      <w:pPr>
-        <w:spacing w:after="160" w:line="276" w:lineRule="auto"/>
-      </w:pPr>
-      <w:r>
-        <w:rPr>
-          <w:rFonts w:ascii="Calibri" w:hAnsi="Calibri" w:eastAsia="Calibri"/>
-          <w:b w:val="0"/>
-          <w:sz w:val="22"/>
-        </w:rPr>
-        <w:t>Tata Motors operates multiple manufacturing and assembly facilities in India. Major locations include Pune (passenger vehicles), Jamshedpur and Lucknow (commercial vehicles), Sanand (passenger and EV-related capacity), and Dharwad among others. Plants integrate stamping, body shop, paint shop, engine or powertrain assembly (where applicable), final assembly, and quality gates. Capacity and product mix are updated over time as new models launch.</w:t>
-      </w:r>
-    </w:p>
-    <w:p>
-      <w:pPr>
-        <w:jc w:val="center"/>
-      </w:pPr>
-      <w:r>
-        <w:drawing>
-          <wp:inline xmlns:a="http://schemas.openxmlformats.org/drawingml/2006/main" xmlns:pic="http://schemas.openxmlformats.org/drawingml/2006/picture">
-            <wp:extent cx="4754880" cy="5443993"/>
-            <wp:docPr id="14" name="Picture 14"/>
-            <wp:cNvGraphicFramePr>
-              <a:graphicFrameLocks noChangeAspect="1"/>
-            </wp:cNvGraphicFramePr>
-            <a:graphic>
-              <a:graphicData uri="http://schemas.openxmlformats.org/drawingml/2006/picture">
-                <pic:pic>
-                  <pic:nvPicPr>
-                    <pic:cNvPr id="0" name="india_plants_map.png"/>
-                    <pic:cNvPicPr/>
-                  </pic:nvPicPr>
-                  <pic:blipFill>
-                    <a:blip r:embed="rId22"/>
-                    <a:stretch>
-                      <a:fillRect/>
-                    </a:stretch>
-                  </pic:blipFill>
-                  <pic:spPr>
-                    <a:xfrm>
-                      <a:off x="0" y="0"/>
-                      <a:ext cx="4754880" cy="5443993"/>
-                    </a:xfrm>
-                    <a:prstGeom prst="rect"/>
-                  </pic:spPr>
-                </pic:pic>
-              </a:graphicData>
-            </a:graphic>
-          </wp:inline>
-        </w:drawing>
-      </w:r>
-    </w:p>
-    <w:p>
-      <w:pPr>
-        <w:jc w:val="center"/>
-      </w:pPr>
-      <w:r>
-        <w:rPr>
-          <w:rFonts w:ascii="Calibri" w:hAnsi="Calibri" w:eastAsia="Calibri"/>
-          <w:b w:val="0"/>
-          <w:color w:val="505050"/>
-          <w:sz w:val="18"/>
-        </w:rPr>
-        <w:t>Figure 10: Major Tata Motors locations in India (schematic)</w:t>
-      </w:r>
-    </w:p>
-    <w:p>
-      <w:pPr>
-        <w:spacing w:before="160" w:after="120"/>
-      </w:pPr>
-      <w:r>
-        <w:rPr>
-          <w:rFonts w:ascii="Calibri" w:hAnsi="Calibri" w:eastAsia="Calibri"/>
-          <w:b/>
-          <w:color w:val="003366"/>
-          <w:sz w:val="28"/>
-        </w:rPr>
-        <w:t>6.3 Internship and learning opportunities (ECE)</w:t>
-      </w:r>
-    </w:p>
-    <w:p>
-      <w:pPr>
-        <w:spacing w:after="160" w:line="276" w:lineRule="auto"/>
-      </w:pPr>
-      <w:r>
-        <w:rPr>
-          <w:rFonts w:ascii="Calibri" w:hAnsi="Calibri" w:eastAsia="Calibri"/>
-          <w:b w:val="0"/>
-          <w:sz w:val="22"/>
-        </w:rPr>
-        <w:t>Tata Motors runs structured student programmes (campus hiring, internships, graduate engineer trainees) with exposure to manufacturing, quality, production, and engineering functions. Diploma interns in electronics-related domains may observe trim-and-chassis fitment, electrical harness routing, earthing and safety checks, ECU flashing, heating elements, connector quality, end-of-line electrical testing, and cross-functional coordination with quality and supply chain—similar to industrial projects reported at PV plants in Pune and manufacturing internships at Sanand.</w:t>
-      </w:r>
-    </w:p>
-    <w:p>
-      <w:pPr>
-        <w:spacing w:after="160" w:line="276" w:lineRule="auto"/>
-      </w:pPr>
-      <w:r>
-        <w:rPr>
-          <w:rFonts w:ascii="Calibri" w:hAnsi="Calibri" w:eastAsia="Calibri"/>
-          <w:b w:val="0"/>
-          <w:sz w:val="22"/>
-        </w:rPr>
-        <w:t>Official portal: joinus.tatamotors.com (Student Programmes). Institutes typically coordinate industrial visits and internships through the training and placement cell with company HR.</w:t>
-      </w:r>
-    </w:p>
-    <w:p>
-      <w:pPr>
-        <w:pStyle w:val="ListBullet"/>
-      </w:pPr>
-      <w:r>
-        <w:rPr>
-          <w:rFonts w:ascii="Calibri" w:hAnsi="Calibri" w:eastAsia="Calibri"/>
-          <w:b w:val="0"/>
-          <w:sz w:val="22"/>
-        </w:rPr>
-        <w:t>Suggested internship focus for ECE: wiring harness safety, ECU diagnostics, BMS awareness (EV lines), PLC/automation in body shop.</w:t>
-      </w:r>
-    </w:p>
-    <w:p>
-      <w:pPr>
-        <w:pStyle w:val="ListBullet"/>
-      </w:pPr>
-      <w:r>
-        <w:rPr>
-          <w:rFonts w:ascii="Calibri" w:hAnsi="Calibri" w:eastAsia="Calibri"/>
-          <w:b w:val="0"/>
-          <w:sz w:val="22"/>
-        </w:rPr>
-        <w:t>Soft skills: safety culture, teamwork across departments, documentation and presentation of findings.</w:t>
-      </w:r>
-    </w:p>
-    <w:p>
-      <w:pPr>
-        <w:pStyle w:val="ListBullet"/>
-      </w:pPr>
-      <w:r>
-        <w:rPr>
-          <w:rFonts w:ascii="Calibri" w:hAnsi="Calibri" w:eastAsia="Calibri"/>
-          <w:b w:val="0"/>
-          <w:sz w:val="22"/>
-        </w:rPr>
-        <w:t>Career alignment: production engineering, quality, automotive electronics, and vehicle testing.</w:t>
-      </w:r>
-    </w:p>
-    <w:p>
-      <w:pPr>
-        <w:spacing w:before="240" w:after="120"/>
+        <w:spacing w:before="200" w:after="120"/>
       </w:pPr>
       <w:r>
         <w:rPr>
@@ -2612,15 +2185,41 @@
     </w:p>
     <w:p>
       <w:pPr>
-        <w:pStyle w:val="ListBullet"/>
+        <w:jc w:val="center"/>
       </w:pPr>
       <w:r>
-        <w:rPr>
-          <w:rFonts w:ascii="Calibri" w:hAnsi="Calibri" w:eastAsia="Calibri"/>
-          <w:b w:val="0"/>
-          <w:sz w:val="22"/>
-        </w:rPr>
-        <w:t>Competition and pricing pressure across CV and PV segments.</w:t>
+        <w:drawing>
+          <wp:inline xmlns:a="http://schemas.openxmlformats.org/drawingml/2006/main" xmlns:pic="http://schemas.openxmlformats.org/drawingml/2006/picture">
+            <wp:extent cx="5029200" cy="1436914"/>
+            <wp:docPr id="12" name="Picture 12"/>
+            <wp:cNvGraphicFramePr>
+              <a:graphicFrameLocks noChangeAspect="1"/>
+            </wp:cNvGraphicFramePr>
+            <a:graphic>
+              <a:graphicData uri="http://schemas.openxmlformats.org/drawingml/2006/picture">
+                <pic:pic>
+                  <pic:nvPicPr>
+                    <pic:cNvPr id="0" name="photo_future_mobility.jpg"/>
+                    <pic:cNvPicPr/>
+                  </pic:nvPicPr>
+                  <pic:blipFill>
+                    <a:blip r:embed="rId20"/>
+                    <a:stretch>
+                      <a:fillRect/>
+                    </a:stretch>
+                  </pic:blipFill>
+                  <pic:spPr>
+                    <a:xfrm>
+                      <a:off x="0" y="0"/>
+                      <a:ext cx="5029200" cy="1436914"/>
+                    </a:xfrm>
+                    <a:prstGeom prst="rect"/>
+                  </pic:spPr>
+                </pic:pic>
+              </a:graphicData>
+            </a:graphic>
+          </wp:inline>
+        </w:drawing>
       </w:r>
     </w:p>
     <w:p>
@@ -2633,7 +2232,7 @@
           <w:b w:val="0"/>
           <w:sz w:val="22"/>
         </w:rPr>
-        <w:t>Supply chain resilience for semiconductors, batteries, and specialised components.</w:t>
+        <w:t>Competition and pricing: balance features, affordability, and profitability.</w:t>
       </w:r>
     </w:p>
     <w:p>
@@ -2646,7 +2245,7 @@
           <w:b w:val="0"/>
           <w:sz w:val="22"/>
         </w:rPr>
-        <w:t>Quality and reliability expectations from customers and regulators.</w:t>
+        <w:t>Supply chain resilience: semiconductors, batteries, and critical components.</w:t>
       </w:r>
     </w:p>
     <w:p>
@@ -2659,7 +2258,7 @@
           <w:b w:val="0"/>
           <w:sz w:val="22"/>
         </w:rPr>
-        <w:t>Accelerating electrification, charging infrastructure, and battery cost reduction.</w:t>
+        <w:t>Quality and reliability: reduce defects, rework, and warranty costs.</w:t>
       </w:r>
     </w:p>
     <w:p>
@@ -2672,7 +2271,7 @@
           <w:b w:val="0"/>
           <w:sz w:val="22"/>
         </w:rPr>
-        <w:t>Sustainability, carbon footprint, and compliance with emission and safety norms.</w:t>
+        <w:t>Electrification: charging infrastructure, battery cost, and customer confidence.</w:t>
       </w:r>
     </w:p>
     <w:p>
@@ -2685,12 +2284,25 @@
           <w:b w:val="0"/>
           <w:sz w:val="22"/>
         </w:rPr>
-        <w:t>Opportunities in connected vehicles, software-defined features, hydrogen/fuel-cell research, and export growth.</w:t>
+        <w:t>Sustainability and compliance: safety and emission regulations.</w:t>
       </w:r>
     </w:p>
     <w:p>
       <w:pPr>
-        <w:spacing w:before="240" w:after="120"/>
+        <w:pStyle w:val="ListBullet"/>
+      </w:pPr>
+      <w:r>
+        <w:rPr>
+          <w:rFonts w:ascii="Calibri" w:hAnsi="Calibri" w:eastAsia="Calibri"/>
+          <w:b w:val="0"/>
+          <w:sz w:val="22"/>
+        </w:rPr>
+        <w:t>Opportunities: R&amp;D, digitalisation, energy efficiency, and battery recycling.</w:t>
+      </w:r>
+    </w:p>
+    <w:p>
+      <w:pPr>
+        <w:spacing w:before="200" w:after="120"/>
       </w:pPr>
       <w:r>
         <w:rPr>
@@ -2704,7 +2316,7 @@
     </w:p>
     <w:p>
       <w:pPr>
-        <w:spacing w:after="160" w:line="276" w:lineRule="auto"/>
+        <w:spacing w:line="288" w:lineRule="auto" w:after="160"/>
       </w:pPr>
       <w:r>
         <w:rPr>
@@ -2712,7 +2324,7 @@
           <w:b w:val="0"/>
           <w:sz w:val="22"/>
         </w:rPr>
-        <w:t>This report uses a descriptive, document-based research approach. Publicly available company information and general automotive manufacturing knowledge are organised to explain Tata Motors' development, segments, products, R&amp;D areas, manufacturing methodologies, and challenges.</w:t>
+        <w:t>Descriptive, document-based research using Tata Motors annual reports, investor presentations, official website, and automotive industry publications.</w:t>
       </w:r>
     </w:p>
     <w:p>
@@ -2725,7 +2337,7 @@
           <w:b w:val="0"/>
           <w:sz w:val="22"/>
         </w:rPr>
-        <w:t>Secondary data: Tata Motors website, integrated annual report FY2024–25, investor presentations, product catalogues, and reputable industry publications.</w:t>
+        <w:t>Secondary data: company reports, catalogues, government publications.</w:t>
       </w:r>
     </w:p>
     <w:p>
@@ -2738,7 +2350,7 @@
           <w:b w:val="0"/>
           <w:sz w:val="22"/>
         </w:rPr>
-        <w:t>Primary data (if collected during internship): authorised plant visit notes, supervised discussions, and observation logs—include only with official permission.</w:t>
+        <w:t>Primary data (if performed): authorised plant visit and supervised discussions.</w:t>
       </w:r>
     </w:p>
     <w:p>
@@ -2751,7 +2363,7 @@
           <w:b w:val="0"/>
           <w:sz w:val="22"/>
         </w:rPr>
-        <w:t>Analysis: historical timeline, segment-wise description, and thematic grouping (quality, manufacturing, sustainability, electronics).</w:t>
+        <w:t>Analysis: historical, descriptive, and thematic grouping.</w:t>
       </w:r>
     </w:p>
     <w:p>
@@ -2764,25 +2376,12 @@
           <w:b w:val="0"/>
           <w:sz w:val="22"/>
         </w:rPr>
-        <w:t>Verification: cross-check figures with source publication dates and financial year labels.</w:t>
+        <w:t>Limitations: confidential plant data is not publicly available.</w:t>
       </w:r>
     </w:p>
     <w:p>
       <w:pPr>
-        <w:pStyle w:val="ListBullet"/>
-      </w:pPr>
-      <w:r>
-        <w:rPr>
-          <w:rFonts w:ascii="Calibri" w:hAnsi="Calibri" w:eastAsia="Calibri"/>
-          <w:b w:val="0"/>
-          <w:sz w:val="22"/>
-        </w:rPr>
-        <w:t>Limitations: confidential plant procedures and unreleased R&amp;D details are not available in public sources.</w:t>
-      </w:r>
-    </w:p>
-    <w:p>
-      <w:pPr>
-        <w:spacing w:before="240" w:after="120"/>
+        <w:spacing w:before="200" w:after="120"/>
       </w:pPr>
       <w:r>
         <w:rPr>
@@ -2796,7 +2395,7 @@
     </w:p>
     <w:p>
       <w:pPr>
-        <w:spacing w:after="160" w:line="276" w:lineRule="auto"/>
+        <w:spacing w:line="288" w:lineRule="auto" w:after="160"/>
       </w:pPr>
       <w:r>
         <w:rPr>
@@ -2804,12 +2403,12 @@
           <w:b w:val="0"/>
           <w:sz w:val="22"/>
         </w:rPr>
-        <w:t>Tata Motors has grown from a locomotive and engineering company into a diversified automotive group with leadership in Indian commercial vehicles, a strong passenger vehicle portfolio, market-leading electric mobility initiatives, and a global premium business through Jaguar Land Rover. Its manufacturing philosophy combines lean production, quality systems, automation, and supply chain coordination. For diploma students, studying Tata Motors provides practical insight into how large-scale manufacturing, electronics integration, and innovation align with national industrial growth and sustainable mobility goals.</w:t>
+        <w:t>Tata Motors is a leading Indian automotive company with strong commercial and passenger portfolios, growing electric mobility, and global presence through JLR. Its manufacturing systems and electronics integration make it a valuable organisation for diploma internship and industrial learning.</w:t>
       </w:r>
     </w:p>
     <w:p>
       <w:pPr>
-        <w:spacing w:before="240" w:after="120"/>
+        <w:spacing w:before="200" w:after="120"/>
       </w:pPr>
       <w:r>
         <w:rPr>
@@ -2818,62 +2417,64 @@
           <w:color w:val="003366"/>
           <w:sz w:val="32"/>
         </w:rPr>
-        <w:t>10. References</w:t>
+        <w:t>References</w:t>
       </w:r>
     </w:p>
     <w:p>
+      <w:pPr>
+        <w:pStyle w:val="ListBullet"/>
+      </w:pPr>
       <w:r>
         <w:rPr>
           <w:rFonts w:ascii="Calibri" w:hAnsi="Calibri" w:eastAsia="Calibri"/>
           <w:b w:val="0"/>
-          <w:sz w:val="20"/>
+          <w:sz w:val="22"/>
         </w:rPr>
-        <w:t>[1] Tata Motors Limited, Integrated Annual Report 2024–25.</w:t>
+        <w:t>Tata Motors Integrated Annual Report 2024–25.</w:t>
       </w:r>
     </w:p>
     <w:p>
+      <w:pPr>
+        <w:pStyle w:val="ListBullet"/>
+      </w:pPr>
       <w:r>
         <w:rPr>
           <w:rFonts w:ascii="Calibri" w:hAnsi="Calibri" w:eastAsia="Calibri"/>
           <w:b w:val="0"/>
-          <w:sz w:val="20"/>
+          <w:sz w:val="22"/>
         </w:rPr>
-        <w:t>[2] Tata Motors Limited, Q4 FY25 Investor Presentation and press releases.</w:t>
+        <w:t>Tata Motors investor presentations and press releases (FY25).</w:t>
       </w:r>
     </w:p>
     <w:p>
+      <w:pPr>
+        <w:pStyle w:val="ListBullet"/>
+      </w:pPr>
       <w:r>
         <w:rPr>
           <w:rFonts w:ascii="Calibri" w:hAnsi="Calibri" w:eastAsia="Calibri"/>
           <w:b w:val="0"/>
-          <w:sz w:val="20"/>
+          <w:sz w:val="22"/>
         </w:rPr>
-        <w:t>[3] Tata Motors Limited, Corporate website — www.tatamotors.com (company profile, products, sustainability).</w:t>
+        <w:t>https://www.tatamotors.com</w:t>
       </w:r>
     </w:p>
     <w:p>
+      <w:pPr>
+        <w:pStyle w:val="ListBullet"/>
+      </w:pPr>
       <w:r>
         <w:rPr>
           <w:rFonts w:ascii="Calibri" w:hAnsi="Calibri" w:eastAsia="Calibri"/>
           <w:b w:val="0"/>
-          <w:sz w:val="20"/>
+          <w:sz w:val="22"/>
         </w:rPr>
-        <w:t>[4] Government of India, automotive industry reports and policy documents (for sector context).</w:t>
-      </w:r>
-    </w:p>
-    <w:p>
-      <w:r>
-        <w:rPr>
-          <w:rFonts w:ascii="Calibri" w:hAnsi="Calibri" w:eastAsia="Calibri"/>
-          <w:b w:val="0"/>
-          <w:sz w:val="20"/>
-        </w:rPr>
-        <w:t>[5] Textbooks on automobile engineering and manufacturing technology (for general methodology terms).</w:t>
+        <w:t>https://joinus.tatamotors.com/student-programmes/</w:t>
       </w:r>
     </w:p>
     <w:sectPr>
       <w:pgSz w:w="12240" w:h="15840"/>
-      <w:pgMar w:top="1296" w:right="1440" w:bottom="1296" w:left="1440" w:header="720" w:footer="720" w:gutter="0"/>
+      <w:pgMar w:top="1440" w:right="1440" w:bottom="1440" w:left="1440" w:header="720" w:footer="720" w:gutter="0"/>
       <w:cols w:space="720"/>
       <w:docGrid w:linePitch="360"/>
     </w:sectPr>

</xml_diff>

<commit_message>
Expand Tata Motors report with more research text and figures
- Add FY25 achievements, R&D, sustainability, internship, segment narratives
- Longer history, ECE bullets, plants and conclusion text
- Place diagrams between sections (segments, timeline, manufacturing, EV, ECE)

Co-authored-by: Sumit Kaktwan <Sumit211995@users.noreply.github.com>
</commit_message>
<xml_diff>
--- a/tata-motors-project/output/TATA_Motors_Diploma_Project.docx
+++ b/tata-motors-project/output/TATA_Motors_Diploma_Project.docx
@@ -31,6 +31,46 @@
       </w:r>
     </w:p>
     <w:p/>
+    <w:p>
+      <w:pPr>
+        <w:spacing w:before="120" w:after="120"/>
+        <w:jc w:val="center"/>
+      </w:pPr>
+      <w:r>
+        <w:drawing>
+          <wp:inline xmlns:a="http://schemas.openxmlformats.org/drawingml/2006/main" xmlns:pic="http://schemas.openxmlformats.org/drawingml/2006/picture">
+            <wp:extent cx="1371600" cy="876795"/>
+            <wp:docPr id="1" name="Picture 1"/>
+            <wp:cNvGraphicFramePr>
+              <a:graphicFrameLocks noChangeAspect="1"/>
+            </wp:cNvGraphicFramePr>
+            <a:graphic>
+              <a:graphicData uri="http://schemas.openxmlformats.org/drawingml/2006/picture">
+                <pic:pic>
+                  <pic:nvPicPr>
+                    <pic:cNvPr id="0" name="tata_motors_logo.png"/>
+                    <pic:cNvPicPr/>
+                  </pic:nvPicPr>
+                  <pic:blipFill>
+                    <a:blip r:embed="rId9"/>
+                    <a:stretch>
+                      <a:fillRect/>
+                    </a:stretch>
+                  </pic:blipFill>
+                  <pic:spPr>
+                    <a:xfrm>
+                      <a:off x="0" y="0"/>
+                      <a:ext cx="1371600" cy="876795"/>
+                    </a:xfrm>
+                    <a:prstGeom prst="rect"/>
+                  </pic:spPr>
+                </pic:pic>
+              </a:graphicData>
+            </a:graphic>
+          </wp:inline>
+        </w:drawing>
+      </w:r>
+    </w:p>
     <w:p>
       <w:pPr>
         <w:jc w:val="center"/>
@@ -75,10 +115,13 @@
       <w:tr>
         <w:tc>
           <w:tcPr>
-            <w:tcW w:type="dxa" w:w="4680"/>
+            <w:tcW w:type="dxa" w:w="3168"/>
             <w:shd w:fill="1F4E79"/>
           </w:tcPr>
           <w:p>
+            <w:pPr>
+              <w:jc w:val="left"/>
+            </w:pPr>
             <w:r>
               <w:rPr>
                 <w:rFonts w:ascii="Calibri" w:hAnsi="Calibri" w:eastAsia="Calibri"/>
@@ -92,10 +135,13 @@
         </w:tc>
         <w:tc>
           <w:tcPr>
-            <w:tcW w:type="dxa" w:w="4680"/>
+            <w:tcW w:type="dxa" w:w="6048"/>
             <w:shd w:fill="1F4E79"/>
           </w:tcPr>
           <w:p>
+            <w:pPr>
+              <w:jc w:val="left"/>
+            </w:pPr>
             <w:r>
               <w:rPr>
                 <w:rFonts w:ascii="Calibri" w:hAnsi="Calibri" w:eastAsia="Calibri"/>
@@ -111,9 +157,12 @@
       <w:tr>
         <w:tc>
           <w:tcPr>
-            <w:tcW w:type="dxa" w:w="4680"/>
+            <w:tcW w:type="dxa" w:w="3168"/>
           </w:tcPr>
           <w:p>
+            <w:pPr>
+              <w:jc w:val="left"/>
+            </w:pPr>
             <w:r>
               <w:rPr>
                 <w:rFonts w:ascii="Calibri" w:hAnsi="Calibri" w:eastAsia="Calibri"/>
@@ -126,9 +175,12 @@
         </w:tc>
         <w:tc>
           <w:tcPr>
-            <w:tcW w:type="dxa" w:w="4680"/>
+            <w:tcW w:type="dxa" w:w="6048"/>
           </w:tcPr>
           <w:p>
+            <w:pPr>
+              <w:jc w:val="left"/>
+            </w:pPr>
             <w:r>
               <w:rPr>
                 <w:rFonts w:ascii="Calibri" w:hAnsi="Calibri" w:eastAsia="Calibri"/>
@@ -143,10 +195,13 @@
       <w:tr>
         <w:tc>
           <w:tcPr>
-            <w:tcW w:type="dxa" w:w="4680"/>
+            <w:tcW w:type="dxa" w:w="3168"/>
             <w:shd w:fill="E8F1FA"/>
           </w:tcPr>
           <w:p>
+            <w:pPr>
+              <w:jc w:val="left"/>
+            </w:pPr>
             <w:r>
               <w:rPr>
                 <w:rFonts w:ascii="Calibri" w:hAnsi="Calibri" w:eastAsia="Calibri"/>
@@ -159,10 +214,13 @@
         </w:tc>
         <w:tc>
           <w:tcPr>
-            <w:tcW w:type="dxa" w:w="4680"/>
+            <w:tcW w:type="dxa" w:w="6048"/>
             <w:shd w:fill="E8F1FA"/>
           </w:tcPr>
           <w:p>
+            <w:pPr>
+              <w:jc w:val="left"/>
+            </w:pPr>
             <w:r>
               <w:rPr>
                 <w:rFonts w:ascii="Calibri" w:hAnsi="Calibri" w:eastAsia="Calibri"/>
@@ -177,9 +235,12 @@
       <w:tr>
         <w:tc>
           <w:tcPr>
-            <w:tcW w:type="dxa" w:w="4680"/>
+            <w:tcW w:type="dxa" w:w="3168"/>
           </w:tcPr>
           <w:p>
+            <w:pPr>
+              <w:jc w:val="left"/>
+            </w:pPr>
             <w:r>
               <w:rPr>
                 <w:rFonts w:ascii="Calibri" w:hAnsi="Calibri" w:eastAsia="Calibri"/>
@@ -192,9 +253,12 @@
         </w:tc>
         <w:tc>
           <w:tcPr>
-            <w:tcW w:type="dxa" w:w="4680"/>
+            <w:tcW w:type="dxa" w:w="6048"/>
           </w:tcPr>
           <w:p>
+            <w:pPr>
+              <w:jc w:val="left"/>
+            </w:pPr>
             <w:r>
               <w:rPr>
                 <w:rFonts w:ascii="Calibri" w:hAnsi="Calibri" w:eastAsia="Calibri"/>
@@ -209,10 +273,13 @@
       <w:tr>
         <w:tc>
           <w:tcPr>
-            <w:tcW w:type="dxa" w:w="4680"/>
+            <w:tcW w:type="dxa" w:w="3168"/>
             <w:shd w:fill="E8F1FA"/>
           </w:tcPr>
           <w:p>
+            <w:pPr>
+              <w:jc w:val="left"/>
+            </w:pPr>
             <w:r>
               <w:rPr>
                 <w:rFonts w:ascii="Calibri" w:hAnsi="Calibri" w:eastAsia="Calibri"/>
@@ -225,10 +292,13 @@
         </w:tc>
         <w:tc>
           <w:tcPr>
-            <w:tcW w:type="dxa" w:w="4680"/>
+            <w:tcW w:type="dxa" w:w="6048"/>
             <w:shd w:fill="E8F1FA"/>
           </w:tcPr>
           <w:p>
+            <w:pPr>
+              <w:jc w:val="left"/>
+            </w:pPr>
             <w:r>
               <w:rPr>
                 <w:rFonts w:ascii="Calibri" w:hAnsi="Calibri" w:eastAsia="Calibri"/>
@@ -243,9 +313,12 @@
       <w:tr>
         <w:tc>
           <w:tcPr>
-            <w:tcW w:type="dxa" w:w="4680"/>
+            <w:tcW w:type="dxa" w:w="3168"/>
           </w:tcPr>
           <w:p>
+            <w:pPr>
+              <w:jc w:val="left"/>
+            </w:pPr>
             <w:r>
               <w:rPr>
                 <w:rFonts w:ascii="Calibri" w:hAnsi="Calibri" w:eastAsia="Calibri"/>
@@ -258,9 +331,12 @@
         </w:tc>
         <w:tc>
           <w:tcPr>
-            <w:tcW w:type="dxa" w:w="4680"/>
+            <w:tcW w:type="dxa" w:w="6048"/>
           </w:tcPr>
           <w:p>
+            <w:pPr>
+              <w:jc w:val="left"/>
+            </w:pPr>
             <w:r>
               <w:rPr>
                 <w:rFonts w:ascii="Calibri" w:hAnsi="Calibri" w:eastAsia="Calibri"/>
@@ -295,7 +371,8 @@
     </w:p>
     <w:p>
       <w:pPr>
-        <w:spacing w:before="200" w:after="120"/>
+        <w:keepNext w:val="0"/>
+        <w:spacing w:before="240" w:after="120"/>
       </w:pPr>
       <w:r>
         <w:rPr>
@@ -309,7 +386,8 @@
     </w:p>
     <w:p>
       <w:pPr>
-        <w:spacing w:line="288" w:lineRule="auto" w:after="160"/>
+        <w:spacing w:line="276" w:lineRule="auto" w:after="160"/>
+        <w:jc w:val="both"/>
       </w:pPr>
       <w:r>
         <w:rPr>
@@ -317,12 +395,13 @@
           <w:b w:val="0"/>
           <w:sz w:val="22"/>
         </w:rPr>
-        <w:t>I hereby declare that this report is my original work prepared for the diploma internship. Information is taken from official and public sources with acknowledgement.</w:t>
+        <w:t>I hereby declare that this company research report entitled "Tata Motors Limited — Company Research Report" is prepared by me, Nachiket L Karoshi, as part of the final-year diploma internship requirement. The information is compiled from publicly available sources with appropriate acknowledgement.</w:t>
       </w:r>
     </w:p>
     <w:p>
       <w:pPr>
-        <w:spacing w:line="288" w:lineRule="auto" w:after="160"/>
+        <w:spacing w:line="276" w:lineRule="auto" w:after="160"/>
+        <w:jc w:val="both"/>
       </w:pPr>
       <w:r>
         <w:rPr>
@@ -337,7 +416,8 @@
     </w:p>
     <w:p>
       <w:pPr>
-        <w:spacing w:line="288" w:lineRule="auto" w:after="160"/>
+        <w:spacing w:line="276" w:lineRule="auto" w:after="160"/>
+        <w:jc w:val="both"/>
       </w:pPr>
       <w:r>
         <w:rPr>
@@ -345,7 +425,7 @@
           <w:b w:val="0"/>
           <w:sz w:val="22"/>
         </w:rPr>
-        <w:t>Signature: _______________________</w:t>
+        <w:t>Signature of student: _______________________</w:t>
         <w:br/>
         <w:t>Name: Nachiket L Karoshi</w:t>
       </w:r>
@@ -357,7 +437,8 @@
     </w:p>
     <w:p>
       <w:pPr>
-        <w:spacing w:before="200" w:after="120"/>
+        <w:keepNext w:val="0"/>
+        <w:spacing w:before="240" w:after="120"/>
       </w:pPr>
       <w:r>
         <w:rPr>
@@ -367,6 +448,16 @@
           <w:sz w:val="32"/>
         </w:rPr>
         <w:t>Table of Contents</w:t>
+      </w:r>
+    </w:p>
+    <w:p>
+      <w:r>
+        <w:rPr>
+          <w:rFonts w:ascii="Calibri" w:hAnsi="Calibri" w:eastAsia="Calibri"/>
+          <w:b w:val="0"/>
+          <w:sz w:val="22"/>
+        </w:rPr>
+        <w:t>Executive Summary</w:t>
       </w:r>
     </w:p>
     <w:p>
@@ -461,12 +552,71 @@
     </w:p>
     <w:p>
       <w:r>
+        <w:rPr>
+          <w:rFonts w:ascii="Calibri" w:hAnsi="Calibri" w:eastAsia="Calibri"/>
+          <w:b w:val="0"/>
+          <w:sz w:val="22"/>
+        </w:rPr>
+        <w:t>References</w:t>
+      </w:r>
+    </w:p>
+    <w:p>
+      <w:r>
         <w:br w:type="page"/>
       </w:r>
     </w:p>
     <w:p>
       <w:pPr>
-        <w:spacing w:before="200" w:after="120"/>
+        <w:keepNext w:val="0"/>
+        <w:spacing w:before="240" w:after="120"/>
+      </w:pPr>
+      <w:r>
+        <w:rPr>
+          <w:rFonts w:ascii="Calibri" w:hAnsi="Calibri" w:eastAsia="Calibri"/>
+          <w:b/>
+          <w:color w:val="003366"/>
+          <w:sz w:val="32"/>
+        </w:rPr>
+        <w:t>Executive Summary</w:t>
+      </w:r>
+    </w:p>
+    <w:p>
+      <w:pPr>
+        <w:spacing w:line="276" w:lineRule="auto" w:after="160"/>
+        <w:jc w:val="both"/>
+      </w:pPr>
+      <w:r>
+        <w:rPr>
+          <w:rFonts w:ascii="Calibri" w:hAnsi="Calibri" w:eastAsia="Calibri"/>
+          <w:b w:val="0"/>
+          <w:sz w:val="22"/>
+        </w:rPr>
+        <w:t>Tata Motors Limited is the Tata Group's flagship automotive company and one of India's largest vehicle manufacturers. This report presents a complete study of its history, business segments, products, manufacturing systems, research areas, challenges, and internship relevance for a Diploma in Electronics and Communication Engineering.</w:t>
+      </w:r>
+    </w:p>
+    <w:p>
+      <w:pPr>
+        <w:spacing w:line="276" w:lineRule="auto" w:after="160"/>
+        <w:jc w:val="both"/>
+      </w:pPr>
+      <w:r>
+        <w:rPr>
+          <w:rFonts w:ascii="Calibri" w:hAnsi="Calibri" w:eastAsia="Calibri"/>
+          <w:b w:val="0"/>
+          <w:sz w:val="22"/>
+        </w:rPr>
+        <w:t>According to public disclosures for FY2024–25, Tata Motors strengthened its position in commercial vehicles, recorded strong SUV growth in passenger vehicles, and maintained leadership in passenger electric vehicles. Milestones include over 6 million cumulative passenger vehicle sales, more than 200,000 cumulative EV sales, expansion at Sanand, and progress on a new manufacturing facility in Tamil Nadu. The company's multi-powertrain approach (petrol, diesel, CNG, electric, and alternate fuels) supports India's goals for safer, cleaner mobility.</w:t>
+      </w:r>
+    </w:p>
+    <w:p>
+      <w:r>
+        <w:br w:type="page"/>
+      </w:r>
+    </w:p>
+    <w:p>
+      <w:pPr>
+        <w:keepNext w:val="0"/>
+        <w:spacing w:before="240" w:after="120"/>
       </w:pPr>
       <w:r>
         <w:rPr>
@@ -480,46 +630,8 @@
     </w:p>
     <w:p>
       <w:pPr>
-        <w:jc w:val="center"/>
-      </w:pPr>
-      <w:r>
-        <w:drawing>
-          <wp:inline xmlns:a="http://schemas.openxmlformats.org/drawingml/2006/main" xmlns:pic="http://schemas.openxmlformats.org/drawingml/2006/picture">
-            <wp:extent cx="1463040" cy="935248"/>
-            <wp:docPr id="1" name="Picture 1"/>
-            <wp:cNvGraphicFramePr>
-              <a:graphicFrameLocks noChangeAspect="1"/>
-            </wp:cNvGraphicFramePr>
-            <a:graphic>
-              <a:graphicData uri="http://schemas.openxmlformats.org/drawingml/2006/picture">
-                <pic:pic>
-                  <pic:nvPicPr>
-                    <pic:cNvPr id="0" name="tata_motors_logo.png"/>
-                    <pic:cNvPicPr/>
-                  </pic:nvPicPr>
-                  <pic:blipFill>
-                    <a:blip r:embed="rId9"/>
-                    <a:stretch>
-                      <a:fillRect/>
-                    </a:stretch>
-                  </pic:blipFill>
-                  <pic:spPr>
-                    <a:xfrm>
-                      <a:off x="0" y="0"/>
-                      <a:ext cx="1463040" cy="935248"/>
-                    </a:xfrm>
-                    <a:prstGeom prst="rect"/>
-                  </pic:spPr>
-                </pic:pic>
-              </a:graphicData>
-            </a:graphic>
-          </wp:inline>
-        </w:drawing>
-      </w:r>
-    </w:p>
-    <w:p>
-      <w:pPr>
-        <w:spacing w:line="288" w:lineRule="auto" w:after="160"/>
+        <w:spacing w:line="276" w:lineRule="auto" w:after="160"/>
+        <w:jc w:val="both"/>
       </w:pPr>
       <w:r>
         <w:rPr>
@@ -532,7 +644,8 @@
     </w:p>
     <w:p>
       <w:pPr>
-        <w:spacing w:line="288" w:lineRule="auto" w:after="160"/>
+        <w:spacing w:line="276" w:lineRule="auto" w:after="160"/>
+        <w:jc w:val="both"/>
       </w:pPr>
       <w:r>
         <w:rPr>
@@ -545,7 +658,8 @@
     </w:p>
     <w:p>
       <w:pPr>
-        <w:spacing w:line="288" w:lineRule="auto" w:after="160"/>
+        <w:spacing w:line="276" w:lineRule="auto" w:after="160"/>
+        <w:jc w:val="both"/>
       </w:pPr>
       <w:r>
         <w:rPr>
@@ -553,12 +667,13 @@
           <w:b w:val="0"/>
           <w:sz w:val="22"/>
         </w:rPr>
-        <w:t>This research report examines Tata Motors' background, organisational development, products, manufacturing processes, achievements, business progress, and recent developments. It also studies manufacturing methodologies and the importance of continuous improvement in quality, productivity, and customer satisfaction.</w:t>
+        <w:t>This research report examines Tata Motors' background, organisational development, products, manufacturing processes, achievements, business progress, and recent developments. It also studies the manufacturing methodologies used in automobile production and the importance of continuous improvement in maintaining quality, productivity, and customer satisfaction.</w:t>
       </w:r>
     </w:p>
     <w:p>
       <w:pPr>
-        <w:spacing w:before="200" w:after="120"/>
+        <w:keepNext w:val="0"/>
+        <w:spacing w:before="240" w:after="120"/>
       </w:pPr>
       <w:r>
         <w:rPr>
@@ -572,12 +687,55 @@
     </w:p>
     <w:p>
       <w:pPr>
+        <w:spacing w:line="276" w:lineRule="auto" w:after="160"/>
+        <w:jc w:val="both"/>
+      </w:pPr>
+      <w:r>
+        <w:rPr>
+          <w:rFonts w:ascii="Calibri" w:hAnsi="Calibri" w:eastAsia="Calibri"/>
+          <w:b w:val="0"/>
+          <w:sz w:val="22"/>
+        </w:rPr>
+        <w:t>Tata Motors is a well-known automotive manufacturer associated with the Tata Group. Its operations cover the design, development, manufacturing, marketing, and servicing of a wide range of vehicles.</w:t>
+      </w:r>
+    </w:p>
+    <w:p>
+      <w:pPr>
+        <w:spacing w:line="276" w:lineRule="auto" w:after="160"/>
+        <w:jc w:val="both"/>
+      </w:pPr>
+      <w:r>
+        <w:rPr>
+          <w:rFonts w:ascii="Calibri" w:hAnsi="Calibri" w:eastAsia="Calibri"/>
+          <w:b w:val="0"/>
+          <w:sz w:val="22"/>
+        </w:rPr>
+        <w:t>The company serves individual customers, businesses, logistics operators, public transport organisations, and industrial customers. Its vehicles are used for personal transportation, goods transportation, passenger transport, construction, mining, defence-related mobility, and specialised commercial applications.</w:t>
+      </w:r>
+    </w:p>
+    <w:p>
+      <w:pPr>
+        <w:spacing w:line="276" w:lineRule="auto" w:after="160"/>
+        <w:jc w:val="both"/>
+      </w:pPr>
+      <w:r>
+        <w:rPr>
+          <w:rFonts w:ascii="Calibri" w:hAnsi="Calibri" w:eastAsia="Calibri"/>
+          <w:b w:val="0"/>
+          <w:sz w:val="22"/>
+        </w:rPr>
+        <w:t>Tata Motors has invested in research and development, vehicle electrification, connected technologies, safety engineering, and advanced manufacturing systems. It is widely recognised for building vehicles that balance affordability with improving safety and technology.</w:t>
+      </w:r>
+    </w:p>
+    <w:p>
+      <w:pPr>
+        <w:spacing w:before="120" w:after="120"/>
         <w:jc w:val="center"/>
       </w:pPr>
       <w:r>
         <w:drawing>
           <wp:inline xmlns:a="http://schemas.openxmlformats.org/drawingml/2006/main" xmlns:pic="http://schemas.openxmlformats.org/drawingml/2006/picture">
-            <wp:extent cx="5303520" cy="2964568"/>
+            <wp:extent cx="5120640" cy="2862342"/>
             <wp:docPr id="2" name="Picture 2"/>
             <wp:cNvGraphicFramePr>
               <a:graphicFrameLocks noChangeAspect="1"/>
@@ -598,7 +756,7 @@
                   <pic:spPr>
                     <a:xfrm>
                       <a:off x="0" y="0"/>
-                      <a:ext cx="5303520" cy="2964568"/>
+                      <a:ext cx="5120640" cy="2862342"/>
                     </a:xfrm>
                     <a:prstGeom prst="rect"/>
                   </pic:spPr>
@@ -611,46 +769,22 @@
     </w:p>
     <w:p>
       <w:pPr>
-        <w:spacing w:line="288" w:lineRule="auto" w:after="160"/>
+        <w:jc w:val="center"/>
       </w:pPr>
       <w:r>
         <w:rPr>
           <w:rFonts w:ascii="Calibri" w:hAnsi="Calibri" w:eastAsia="Calibri"/>
           <w:b w:val="0"/>
-          <w:sz w:val="22"/>
+          <w:color w:val="5A5A5A"/>
+          <w:sz w:val="18"/>
         </w:rPr>
-        <w:t>Tata Motors is a well-known automotive manufacturer associated with the Tata Group. Its operations cover the design, development, manufacturing, marketing, and servicing of a wide range of vehicles.</w:t>
+        <w:t>Figure 1: Tata Motors facility (reference image)</w:t>
       </w:r>
     </w:p>
     <w:p>
       <w:pPr>
-        <w:spacing w:line="288" w:lineRule="auto" w:after="160"/>
-      </w:pPr>
-      <w:r>
-        <w:rPr>
-          <w:rFonts w:ascii="Calibri" w:hAnsi="Calibri" w:eastAsia="Calibri"/>
-          <w:b w:val="0"/>
-          <w:sz w:val="22"/>
-        </w:rPr>
-        <w:t>The company serves individual customers, businesses, logistics operators, public transport organisations, and industrial customers. Its vehicles are used for personal transportation, goods transportation, passenger transport, construction, and specialised commercial applications.</w:t>
-      </w:r>
-    </w:p>
-    <w:p>
-      <w:pPr>
-        <w:spacing w:line="288" w:lineRule="auto" w:after="160"/>
-      </w:pPr>
-      <w:r>
-        <w:rPr>
-          <w:rFonts w:ascii="Calibri" w:hAnsi="Calibri" w:eastAsia="Calibri"/>
-          <w:b w:val="0"/>
-          <w:sz w:val="22"/>
-        </w:rPr>
-        <w:t>Tata Motors has invested in research and development, vehicle electrification, connected technologies, safety engineering, and advanced manufacturing systems.</w:t>
-      </w:r>
-    </w:p>
-    <w:p>
-      <w:pPr>
-        <w:spacing w:before="200" w:after="120"/>
+        <w:keepNext w:val="0"/>
+        <w:spacing w:before="240" w:after="120"/>
       </w:pPr>
       <w:r>
         <w:rPr>
@@ -664,12 +798,41 @@
     </w:p>
     <w:p>
       <w:pPr>
+        <w:spacing w:line="276" w:lineRule="auto" w:after="160"/>
+        <w:jc w:val="both"/>
+      </w:pPr>
+      <w:r>
+        <w:rPr>
+          <w:rFonts w:ascii="Calibri" w:hAnsi="Calibri" w:eastAsia="Calibri"/>
+          <w:b w:val="0"/>
+          <w:sz w:val="22"/>
+        </w:rPr>
+        <w:t>Tata Motors operates in a highly competitive industry where product quality, pricing, design, safety, technology, fuel efficiency, and after-sales service influence customer decisions. Its business is organised around major automotive segments reported publicly for the Tata Motors Group: Tata Commercial Vehicles (CV), Tata Passenger Vehicles (PV), electric mobility, and Jaguar Land Rover (JLR).</w:t>
+      </w:r>
+    </w:p>
+    <w:p>
+      <w:pPr>
+        <w:spacing w:line="276" w:lineRule="auto" w:after="160"/>
+        <w:jc w:val="both"/>
+      </w:pPr>
+      <w:r>
+        <w:rPr>
+          <w:rFonts w:ascii="Calibri" w:hAnsi="Calibri" w:eastAsia="Calibri"/>
+          <w:b w:val="0"/>
+          <w:sz w:val="22"/>
+        </w:rPr>
+        <w:t>Effective 1 October 2025, a composite scheme of arrangement (approved by the National Company Law Tribunal) demerged commercial vehicles from passenger vehicles (including electric passenger mobility) to allow sharper focus and strategy execution in each business.</w:t>
+      </w:r>
+    </w:p>
+    <w:p>
+      <w:pPr>
+        <w:spacing w:before="120" w:after="120"/>
         <w:jc w:val="center"/>
       </w:pPr>
       <w:r>
         <w:drawing>
           <wp:inline xmlns:a="http://schemas.openxmlformats.org/drawingml/2006/main" xmlns:pic="http://schemas.openxmlformats.org/drawingml/2006/picture">
-            <wp:extent cx="5486400" cy="2819736"/>
+            <wp:extent cx="5303520" cy="2725744"/>
             <wp:docPr id="3" name="Picture 3"/>
             <wp:cNvGraphicFramePr>
               <a:graphicFrameLocks noChangeAspect="1"/>
@@ -690,7 +853,7 @@
                   <pic:spPr>
                     <a:xfrm>
                       <a:off x="0" y="0"/>
-                      <a:ext cx="5486400" cy="2819736"/>
+                      <a:ext cx="5303520" cy="2725744"/>
                     </a:xfrm>
                     <a:prstGeom prst="rect"/>
                   </pic:spPr>
@@ -703,7 +866,37 @@
     </w:p>
     <w:p>
       <w:pPr>
-        <w:spacing w:line="288" w:lineRule="auto" w:after="160"/>
+        <w:jc w:val="center"/>
+      </w:pPr>
+      <w:r>
+        <w:rPr>
+          <w:rFonts w:ascii="Calibri" w:hAnsi="Calibri" w:eastAsia="Calibri"/>
+          <w:b w:val="0"/>
+          <w:color w:val="5A5A5A"/>
+          <w:sz w:val="18"/>
+        </w:rPr>
+        <w:t>Figure 2: Manufacturing and product operations</w:t>
+      </w:r>
+    </w:p>
+    <w:p>
+      <w:pPr>
+        <w:keepNext/>
+        <w:spacing w:before="160" w:after="120"/>
+      </w:pPr>
+      <w:r>
+        <w:rPr>
+          <w:rFonts w:ascii="Calibri" w:hAnsi="Calibri" w:eastAsia="Calibri"/>
+          <w:b/>
+          <w:color w:val="003366"/>
+          <w:sz w:val="26"/>
+        </w:rPr>
+        <w:t>3.1 Tata Commercial Vehicles (CV)</w:t>
+      </w:r>
+    </w:p>
+    <w:p>
+      <w:pPr>
+        <w:pStyle w:val="ListBullet"/>
+        <w:jc w:val="both"/>
       </w:pPr>
       <w:r>
         <w:rPr>
@@ -711,12 +904,13 @@
           <w:b w:val="0"/>
           <w:sz w:val="22"/>
         </w:rPr>
-        <w:t>Tata Motors operates in a highly competitive industry where product quality, pricing, design, safety, technology, fuel efficiency, and after-sales service influence customer decisions. Its business developed around two principal segments:</w:t>
+        <w:t>Trucks (light, medium, heavy), tippers, and specialised haulage vehicles.</w:t>
       </w:r>
     </w:p>
     <w:p>
       <w:pPr>
-        <w:spacing w:line="288" w:lineRule="auto" w:after="160"/>
+        <w:pStyle w:val="ListBullet"/>
+        <w:jc w:val="both"/>
       </w:pPr>
       <w:r>
         <w:rPr>
@@ -724,12 +918,13 @@
           <w:b w:val="0"/>
           <w:sz w:val="22"/>
         </w:rPr>
-        <w:t>Passenger vehicles: Cars, SUVs and electric passenger vehicles for personal and family transportation.</w:t>
+        <w:t>Buses and staff carriers for public transport and institutions.</w:t>
       </w:r>
     </w:p>
     <w:p>
       <w:pPr>
-        <w:spacing w:line="288" w:lineRule="auto" w:after="160"/>
+        <w:pStyle w:val="ListBullet"/>
+        <w:jc w:val="both"/>
       </w:pPr>
       <w:r>
         <w:rPr>
@@ -737,12 +932,13 @@
           <w:b w:val="0"/>
           <w:sz w:val="22"/>
         </w:rPr>
-        <w:t>Commercial vehicles: Trucks, buses, vans, light commercial vehicles and specialised vehicles for businesses and public transportation.</w:t>
+        <w:t>Small commercial vehicles and pickups (Ace, Intra families).</w:t>
       </w:r>
     </w:p>
     <w:p>
       <w:pPr>
-        <w:spacing w:line="288" w:lineRule="auto" w:after="160"/>
+        <w:pStyle w:val="ListBullet"/>
+        <w:jc w:val="both"/>
       </w:pPr>
       <w:r>
         <w:rPr>
@@ -750,7 +946,193 @@
           <w:b w:val="0"/>
           <w:sz w:val="22"/>
         </w:rPr>
-        <w:t>The group also includes electric mobility solutions and the global Jaguar Land Rover (JLR) business. Public reports for FY2024–25 note leadership in Indian CV, strong SUV growth in PV, and a large share of the passenger EV market.</w:t>
+        <w:t>Electric commercial mobility including Ace EV and e-bus solutions.</w:t>
+      </w:r>
+    </w:p>
+    <w:p>
+      <w:pPr>
+        <w:pStyle w:val="ListBullet"/>
+        <w:jc w:val="both"/>
+      </w:pPr>
+      <w:r>
+        <w:rPr>
+          <w:rFonts w:ascii="Calibri" w:hAnsi="Calibri" w:eastAsia="Calibri"/>
+          <w:b w:val="0"/>
+          <w:sz w:val="22"/>
+        </w:rPr>
+        <w:t>Market leadership in Indian CV with focus on uptime and total cost of ownership.</w:t>
+      </w:r>
+    </w:p>
+    <w:p>
+      <w:pPr>
+        <w:keepNext/>
+        <w:spacing w:before="160" w:after="120"/>
+      </w:pPr>
+      <w:r>
+        <w:rPr>
+          <w:rFonts w:ascii="Calibri" w:hAnsi="Calibri" w:eastAsia="Calibri"/>
+          <w:b/>
+          <w:color w:val="003366"/>
+          <w:sz w:val="26"/>
+        </w:rPr>
+        <w:t>3.2 Tata Passenger Vehicles (PV)</w:t>
+      </w:r>
+    </w:p>
+    <w:p>
+      <w:pPr>
+        <w:pStyle w:val="ListBullet"/>
+        <w:jc w:val="both"/>
+      </w:pPr>
+      <w:r>
+        <w:rPr>
+          <w:rFonts w:ascii="Calibri" w:hAnsi="Calibri" w:eastAsia="Calibri"/>
+          <w:b w:val="0"/>
+          <w:sz w:val="22"/>
+        </w:rPr>
+        <w:t>Hatchbacks and sedans: Tiago, Altroz, Tigor.</w:t>
+      </w:r>
+    </w:p>
+    <w:p>
+      <w:pPr>
+        <w:pStyle w:val="ListBullet"/>
+        <w:jc w:val="both"/>
+      </w:pPr>
+      <w:r>
+        <w:rPr>
+          <w:rFonts w:ascii="Calibri" w:hAnsi="Calibri" w:eastAsia="Calibri"/>
+          <w:b w:val="0"/>
+          <w:sz w:val="22"/>
+        </w:rPr>
+        <w:t>SUVs and crossovers: Punch, Nexon, Harrier, Safari, Curvv.</w:t>
+      </w:r>
+    </w:p>
+    <w:p>
+      <w:pPr>
+        <w:pStyle w:val="ListBullet"/>
+        <w:jc w:val="both"/>
+      </w:pPr>
+      <w:r>
+        <w:rPr>
+          <w:rFonts w:ascii="Calibri" w:hAnsi="Calibri" w:eastAsia="Calibri"/>
+          <w:b w:val="0"/>
+          <w:sz w:val="22"/>
+        </w:rPr>
+        <w:t>Multi-powertrain strategy: petrol, diesel, CNG, and electric where offered.</w:t>
+      </w:r>
+    </w:p>
+    <w:p>
+      <w:pPr>
+        <w:pStyle w:val="ListBullet"/>
+        <w:jc w:val="both"/>
+      </w:pPr>
+      <w:r>
+        <w:rPr>
+          <w:rFonts w:ascii="Calibri" w:hAnsi="Calibri" w:eastAsia="Calibri"/>
+          <w:b w:val="0"/>
+          <w:sz w:val="22"/>
+        </w:rPr>
+        <w:t>Safety and design are key brand pillars (including NCAP-focused marketing).</w:t>
+      </w:r>
+    </w:p>
+    <w:p>
+      <w:pPr>
+        <w:keepNext/>
+        <w:spacing w:before="160" w:after="120"/>
+      </w:pPr>
+      <w:r>
+        <w:rPr>
+          <w:rFonts w:ascii="Calibri" w:hAnsi="Calibri" w:eastAsia="Calibri"/>
+          <w:b/>
+          <w:color w:val="003366"/>
+          <w:sz w:val="26"/>
+        </w:rPr>
+        <w:t>3.3 Electric Mobility</w:t>
+      </w:r>
+    </w:p>
+    <w:p>
+      <w:pPr>
+        <w:pStyle w:val="ListBullet"/>
+        <w:jc w:val="both"/>
+      </w:pPr>
+      <w:r>
+        <w:rPr>
+          <w:rFonts w:ascii="Calibri" w:hAnsi="Calibri" w:eastAsia="Calibri"/>
+          <w:b w:val="0"/>
+          <w:sz w:val="22"/>
+        </w:rPr>
+        <w:t>Passenger EV leadership in India with Nexon EV, Tiago EV, Punch EV, and related platforms.</w:t>
+      </w:r>
+    </w:p>
+    <w:p>
+      <w:pPr>
+        <w:pStyle w:val="ListBullet"/>
+        <w:jc w:val="both"/>
+      </w:pPr>
+      <w:r>
+        <w:rPr>
+          <w:rFonts w:ascii="Calibri" w:hAnsi="Calibri" w:eastAsia="Calibri"/>
+          <w:b w:val="0"/>
+          <w:sz w:val="22"/>
+        </w:rPr>
+        <w:t>ZIPTRON and acti.ev technology for range, safety, and charging ecosystem.</w:t>
+      </w:r>
+    </w:p>
+    <w:p>
+      <w:pPr>
+        <w:pStyle w:val="ListBullet"/>
+        <w:jc w:val="both"/>
+      </w:pPr>
+      <w:r>
+        <w:rPr>
+          <w:rFonts w:ascii="Calibri" w:hAnsi="Calibri" w:eastAsia="Calibri"/>
+          <w:b w:val="0"/>
+          <w:sz w:val="22"/>
+        </w:rPr>
+        <w:t>Commercial electric buses and smart-city mobility solutions.</w:t>
+      </w:r>
+    </w:p>
+    <w:p>
+      <w:pPr>
+        <w:keepNext/>
+        <w:spacing w:before="160" w:after="120"/>
+      </w:pPr>
+      <w:r>
+        <w:rPr>
+          <w:rFonts w:ascii="Calibri" w:hAnsi="Calibri" w:eastAsia="Calibri"/>
+          <w:b/>
+          <w:color w:val="003366"/>
+          <w:sz w:val="26"/>
+        </w:rPr>
+        <w:t>3.4 Jaguar Land Rover (JLR)</w:t>
+      </w:r>
+    </w:p>
+    <w:p>
+      <w:pPr>
+        <w:spacing w:line="276" w:lineRule="auto" w:after="160"/>
+        <w:jc w:val="both"/>
+      </w:pPr>
+      <w:r>
+        <w:rPr>
+          <w:rFonts w:ascii="Calibri" w:hAnsi="Calibri" w:eastAsia="Calibri"/>
+          <w:b w:val="0"/>
+          <w:sz w:val="22"/>
+        </w:rPr>
+        <w:t>Acquired in 2008, Jaguar Land Rover is Tata Motors' global premium automotive business with luxury brands, advanced engineering, and manufacturing primarily in the United Kingdom and other international locations.</w:t>
+      </w:r>
+    </w:p>
+    <w:p>
+      <w:pPr>
+        <w:keepNext/>
+        <w:spacing w:before="160" w:after="120"/>
+      </w:pPr>
+      <w:r>
+        <w:rPr>
+          <w:rFonts w:ascii="Calibri" w:hAnsi="Calibri" w:eastAsia="Calibri"/>
+          <w:b/>
+          <w:color w:val="003366"/>
+          <w:sz w:val="26"/>
+        </w:rPr>
+        <w:t>Basic company profile</w:t>
       </w:r>
     </w:p>
     <w:tbl>
@@ -766,10 +1148,13 @@
       <w:tr>
         <w:tc>
           <w:tcPr>
-            <w:tcW w:type="dxa" w:w="4680"/>
+            <w:tcW w:type="dxa" w:w="2880"/>
             <w:shd w:fill="1F4E79"/>
           </w:tcPr>
           <w:p>
+            <w:pPr>
+              <w:jc w:val="left"/>
+            </w:pPr>
             <w:r>
               <w:rPr>
                 <w:rFonts w:ascii="Calibri" w:hAnsi="Calibri" w:eastAsia="Calibri"/>
@@ -783,10 +1168,13 @@
         </w:tc>
         <w:tc>
           <w:tcPr>
-            <w:tcW w:type="dxa" w:w="4680"/>
+            <w:tcW w:type="dxa" w:w="6336"/>
             <w:shd w:fill="1F4E79"/>
           </w:tcPr>
           <w:p>
+            <w:pPr>
+              <w:jc w:val="left"/>
+            </w:pPr>
             <w:r>
               <w:rPr>
                 <w:rFonts w:ascii="Calibri" w:hAnsi="Calibri" w:eastAsia="Calibri"/>
@@ -802,9 +1190,12 @@
       <w:tr>
         <w:tc>
           <w:tcPr>
-            <w:tcW w:type="dxa" w:w="4680"/>
+            <w:tcW w:type="dxa" w:w="2880"/>
           </w:tcPr>
           <w:p>
+            <w:pPr>
+              <w:jc w:val="left"/>
+            </w:pPr>
             <w:r>
               <w:rPr>
                 <w:rFonts w:ascii="Calibri" w:hAnsi="Calibri" w:eastAsia="Calibri"/>
@@ -817,9 +1208,12 @@
         </w:tc>
         <w:tc>
           <w:tcPr>
-            <w:tcW w:type="dxa" w:w="4680"/>
+            <w:tcW w:type="dxa" w:w="6336"/>
           </w:tcPr>
           <w:p>
+            <w:pPr>
+              <w:jc w:val="left"/>
+            </w:pPr>
             <w:r>
               <w:rPr>
                 <w:rFonts w:ascii="Calibri" w:hAnsi="Calibri" w:eastAsia="Calibri"/>
@@ -834,10 +1228,13 @@
       <w:tr>
         <w:tc>
           <w:tcPr>
-            <w:tcW w:type="dxa" w:w="4680"/>
+            <w:tcW w:type="dxa" w:w="2880"/>
             <w:shd w:fill="E8F1FA"/>
           </w:tcPr>
           <w:p>
+            <w:pPr>
+              <w:jc w:val="left"/>
+            </w:pPr>
             <w:r>
               <w:rPr>
                 <w:rFonts w:ascii="Calibri" w:hAnsi="Calibri" w:eastAsia="Calibri"/>
@@ -850,10 +1247,13 @@
         </w:tc>
         <w:tc>
           <w:tcPr>
-            <w:tcW w:type="dxa" w:w="4680"/>
+            <w:tcW w:type="dxa" w:w="6336"/>
             <w:shd w:fill="E8F1FA"/>
           </w:tcPr>
           <w:p>
+            <w:pPr>
+              <w:jc w:val="left"/>
+            </w:pPr>
             <w:r>
               <w:rPr>
                 <w:rFonts w:ascii="Calibri" w:hAnsi="Calibri" w:eastAsia="Calibri"/>
@@ -868,9 +1268,12 @@
       <w:tr>
         <w:tc>
           <w:tcPr>
-            <w:tcW w:type="dxa" w:w="4680"/>
+            <w:tcW w:type="dxa" w:w="2880"/>
           </w:tcPr>
           <w:p>
+            <w:pPr>
+              <w:jc w:val="left"/>
+            </w:pPr>
             <w:r>
               <w:rPr>
                 <w:rFonts w:ascii="Calibri" w:hAnsi="Calibri" w:eastAsia="Calibri"/>
@@ -883,9 +1286,12 @@
         </w:tc>
         <w:tc>
           <w:tcPr>
-            <w:tcW w:type="dxa" w:w="4680"/>
+            <w:tcW w:type="dxa" w:w="6336"/>
           </w:tcPr>
           <w:p>
+            <w:pPr>
+              <w:jc w:val="left"/>
+            </w:pPr>
             <w:r>
               <w:rPr>
                 <w:rFonts w:ascii="Calibri" w:hAnsi="Calibri" w:eastAsia="Calibri"/>
@@ -900,10 +1306,52 @@
       <w:tr>
         <w:tc>
           <w:tcPr>
-            <w:tcW w:type="dxa" w:w="4680"/>
+            <w:tcW w:type="dxa" w:w="2880"/>
             <w:shd w:fill="E8F1FA"/>
           </w:tcPr>
           <w:p>
+            <w:pPr>
+              <w:jc w:val="left"/>
+            </w:pPr>
+            <w:r>
+              <w:rPr>
+                <w:rFonts w:ascii="Calibri" w:hAnsi="Calibri" w:eastAsia="Calibri"/>
+                <w:b w:val="0"/>
+                <w:sz w:val="20"/>
+              </w:rPr>
+              <w:t>Founder / group</w:t>
+            </w:r>
+          </w:p>
+        </w:tc>
+        <w:tc>
+          <w:tcPr>
+            <w:tcW w:type="dxa" w:w="6336"/>
+            <w:shd w:fill="E8F1FA"/>
+          </w:tcPr>
+          <w:p>
+            <w:pPr>
+              <w:jc w:val="left"/>
+            </w:pPr>
+            <w:r>
+              <w:rPr>
+                <w:rFonts w:ascii="Calibri" w:hAnsi="Calibri" w:eastAsia="Calibri"/>
+                <w:b w:val="0"/>
+                <w:sz w:val="20"/>
+              </w:rPr>
+              <w:t>Founded under the leadership of the Tata Group</w:t>
+            </w:r>
+          </w:p>
+        </w:tc>
+      </w:tr>
+      <w:tr>
+        <w:tc>
+          <w:tcPr>
+            <w:tcW w:type="dxa" w:w="2880"/>
+          </w:tcPr>
+          <w:p>
+            <w:pPr>
+              <w:jc w:val="left"/>
+            </w:pPr>
             <w:r>
               <w:rPr>
                 <w:rFonts w:ascii="Calibri" w:hAnsi="Calibri" w:eastAsia="Calibri"/>
@@ -916,10 +1364,12 @@
         </w:tc>
         <w:tc>
           <w:tcPr>
-            <w:tcW w:type="dxa" w:w="4680"/>
-            <w:shd w:fill="E8F1FA"/>
+            <w:tcW w:type="dxa" w:w="6336"/>
           </w:tcPr>
           <w:p>
+            <w:pPr>
+              <w:jc w:val="left"/>
+            </w:pPr>
             <w:r>
               <w:rPr>
                 <w:rFonts w:ascii="Calibri" w:hAnsi="Calibri" w:eastAsia="Calibri"/>
@@ -934,9 +1384,13 @@
       <w:tr>
         <w:tc>
           <w:tcPr>
-            <w:tcW w:type="dxa" w:w="4680"/>
+            <w:tcW w:type="dxa" w:w="2880"/>
+            <w:shd w:fill="E8F1FA"/>
           </w:tcPr>
           <w:p>
+            <w:pPr>
+              <w:jc w:val="left"/>
+            </w:pPr>
             <w:r>
               <w:rPr>
                 <w:rFonts w:ascii="Calibri" w:hAnsi="Calibri" w:eastAsia="Calibri"/>
@@ -949,9 +1403,13 @@
         </w:tc>
         <w:tc>
           <w:tcPr>
-            <w:tcW w:type="dxa" w:w="4680"/>
+            <w:tcW w:type="dxa" w:w="6336"/>
+            <w:shd w:fill="E8F1FA"/>
           </w:tcPr>
           <w:p>
+            <w:pPr>
+              <w:jc w:val="left"/>
+            </w:pPr>
             <w:r>
               <w:rPr>
                 <w:rFonts w:ascii="Calibri" w:hAnsi="Calibri" w:eastAsia="Calibri"/>
@@ -966,10 +1424,12 @@
       <w:tr>
         <w:tc>
           <w:tcPr>
-            <w:tcW w:type="dxa" w:w="4680"/>
-            <w:shd w:fill="E8F1FA"/>
+            <w:tcW w:type="dxa" w:w="2880"/>
           </w:tcPr>
           <w:p>
+            <w:pPr>
+              <w:jc w:val="left"/>
+            </w:pPr>
             <w:r>
               <w:rPr>
                 <w:rFonts w:ascii="Calibri" w:hAnsi="Calibri" w:eastAsia="Calibri"/>
@@ -982,10 +1442,12 @@
         </w:tc>
         <w:tc>
           <w:tcPr>
-            <w:tcW w:type="dxa" w:w="4680"/>
-            <w:shd w:fill="E8F1FA"/>
+            <w:tcW w:type="dxa" w:w="6336"/>
           </w:tcPr>
           <w:p>
+            <w:pPr>
+              <w:jc w:val="left"/>
+            </w:pPr>
             <w:r>
               <w:rPr>
                 <w:rFonts w:ascii="Calibri" w:hAnsi="Calibri" w:eastAsia="Calibri"/>
@@ -1000,9 +1462,13 @@
       <w:tr>
         <w:tc>
           <w:tcPr>
-            <w:tcW w:type="dxa" w:w="4680"/>
+            <w:tcW w:type="dxa" w:w="2880"/>
+            <w:shd w:fill="E8F1FA"/>
           </w:tcPr>
           <w:p>
+            <w:pPr>
+              <w:jc w:val="left"/>
+            </w:pPr>
             <w:r>
               <w:rPr>
                 <w:rFonts w:ascii="Calibri" w:hAnsi="Calibri" w:eastAsia="Calibri"/>
@@ -1015,16 +1481,20 @@
         </w:tc>
         <w:tc>
           <w:tcPr>
-            <w:tcW w:type="dxa" w:w="4680"/>
+            <w:tcW w:type="dxa" w:w="6336"/>
+            <w:shd w:fill="E8F1FA"/>
           </w:tcPr>
           <w:p>
+            <w:pPr>
+              <w:jc w:val="left"/>
+            </w:pPr>
             <w:r>
               <w:rPr>
                 <w:rFonts w:ascii="Calibri" w:hAnsi="Calibri" w:eastAsia="Calibri"/>
                 <w:b w:val="0"/>
                 <w:sz w:val="20"/>
               </w:rPr>
-              <w:t>Cars, SUVs, trucks, buses, electric vehicles</w:t>
+              <w:t>Cars, SUVs, trucks, buses, electric vehicles and mobility solutions</w:t>
             </w:r>
           </w:p>
         </w:tc>
@@ -1032,10 +1502,12 @@
       <w:tr>
         <w:tc>
           <w:tcPr>
-            <w:tcW w:type="dxa" w:w="4680"/>
-            <w:shd w:fill="E8F1FA"/>
+            <w:tcW w:type="dxa" w:w="2880"/>
           </w:tcPr>
           <w:p>
+            <w:pPr>
+              <w:jc w:val="left"/>
+            </w:pPr>
             <w:r>
               <w:rPr>
                 <w:rFonts w:ascii="Calibri" w:hAnsi="Calibri" w:eastAsia="Calibri"/>
@@ -1048,17 +1520,19 @@
         </w:tc>
         <w:tc>
           <w:tcPr>
-            <w:tcW w:type="dxa" w:w="4680"/>
-            <w:shd w:fill="E8F1FA"/>
+            <w:tcW w:type="dxa" w:w="6336"/>
           </w:tcPr>
           <w:p>
+            <w:pPr>
+              <w:jc w:val="left"/>
+            </w:pPr>
             <w:r>
               <w:rPr>
                 <w:rFonts w:ascii="Calibri" w:hAnsi="Calibri" w:eastAsia="Calibri"/>
                 <w:b w:val="0"/>
                 <w:sz w:val="20"/>
               </w:rPr>
-              <w:t>India and international markets</w:t>
+              <w:t>India and selected international markets</w:t>
             </w:r>
           </w:p>
         </w:tc>
@@ -1066,31 +1540,39 @@
       <w:tr>
         <w:tc>
           <w:tcPr>
-            <w:tcW w:type="dxa" w:w="4680"/>
+            <w:tcW w:type="dxa" w:w="2880"/>
+            <w:shd w:fill="E8F1FA"/>
           </w:tcPr>
           <w:p>
+            <w:pPr>
+              <w:jc w:val="left"/>
+            </w:pPr>
             <w:r>
               <w:rPr>
                 <w:rFonts w:ascii="Calibri" w:hAnsi="Calibri" w:eastAsia="Calibri"/>
                 <w:b w:val="0"/>
                 <w:sz w:val="20"/>
               </w:rPr>
-              <w:t>Key focus</w:t>
+              <w:t>Key focus areas</w:t>
             </w:r>
           </w:p>
         </w:tc>
         <w:tc>
           <w:tcPr>
-            <w:tcW w:type="dxa" w:w="4680"/>
+            <w:tcW w:type="dxa" w:w="6336"/>
+            <w:shd w:fill="E8F1FA"/>
           </w:tcPr>
           <w:p>
+            <w:pPr>
+              <w:jc w:val="left"/>
+            </w:pPr>
             <w:r>
               <w:rPr>
                 <w:rFonts w:ascii="Calibri" w:hAnsi="Calibri" w:eastAsia="Calibri"/>
                 <w:b w:val="0"/>
                 <w:sz w:val="20"/>
               </w:rPr>
-              <w:t>Quality, safety, innovation, sustainability</w:t>
+              <w:t>Quality, safety, innovation, sustainability and customer satisfaction</w:t>
             </w:r>
           </w:p>
         </w:tc>
@@ -1103,7 +1585,8 @@
     </w:p>
     <w:p>
       <w:pPr>
-        <w:spacing w:before="200" w:after="120"/>
+        <w:keepNext w:val="0"/>
+        <w:spacing w:before="240" w:after="120"/>
       </w:pPr>
       <w:r>
         <w:rPr>
@@ -1128,7 +1611,8 @@
       <w:tr>
         <w:tc>
           <w:tcPr>
-            <w:tcW w:type="dxa" w:w="4680"/>
+            <w:tcW w:type="dxa" w:w="4464"/>
+            <w:vAlign w:val="center"/>
           </w:tcPr>
           <w:p>
             <w:pPr>
@@ -1137,7 +1621,7 @@
             <w:r>
               <w:drawing>
                 <wp:inline xmlns:a="http://schemas.openxmlformats.org/drawingml/2006/main" xmlns:pic="http://schemas.openxmlformats.org/drawingml/2006/picture">
-                  <wp:extent cx="2651760" cy="1341664"/>
+                  <wp:extent cx="2606040" cy="1318532"/>
                   <wp:docPr id="4" name="Picture 4"/>
                   <wp:cNvGraphicFramePr>
                     <a:graphicFrameLocks noChangeAspect="1"/>
@@ -1158,7 +1642,7 @@
                         <pic:spPr>
                           <a:xfrm>
                             <a:off x="0" y="0"/>
-                            <a:ext cx="2651760" cy="1341664"/>
+                            <a:ext cx="2606040" cy="1318532"/>
                           </a:xfrm>
                           <a:prstGeom prst="rect"/>
                         </pic:spPr>
@@ -1172,7 +1656,8 @@
         </w:tc>
         <w:tc>
           <w:tcPr>
-            <w:tcW w:type="dxa" w:w="4680"/>
+            <w:tcW w:type="dxa" w:w="4464"/>
+            <w:vAlign w:val="center"/>
           </w:tcPr>
           <w:p>
             <w:pPr>
@@ -1181,7 +1666,7 @@
             <w:r>
               <w:drawing>
                 <wp:inline xmlns:a="http://schemas.openxmlformats.org/drawingml/2006/main" xmlns:pic="http://schemas.openxmlformats.org/drawingml/2006/picture">
-                  <wp:extent cx="2651760" cy="1692707"/>
+                  <wp:extent cx="2606040" cy="1663522"/>
                   <wp:docPr id="5" name="Picture 5"/>
                   <wp:cNvGraphicFramePr>
                     <a:graphicFrameLocks noChangeAspect="1"/>
@@ -1202,7 +1687,7 @@
                         <pic:spPr>
                           <a:xfrm>
                             <a:off x="0" y="0"/>
-                            <a:ext cx="2651760" cy="1692707"/>
+                            <a:ext cx="2606040" cy="1663522"/>
                           </a:xfrm>
                           <a:prstGeom prst="rect"/>
                         </pic:spPr>
@@ -1219,7 +1704,8 @@
     <w:p/>
     <w:p>
       <w:pPr>
-        <w:spacing w:before="200" w:after="120"/>
+        <w:keepNext/>
+        <w:spacing w:before="160" w:after="120"/>
       </w:pPr>
       <w:r>
         <w:rPr>
@@ -1233,7 +1719,8 @@
     </w:p>
     <w:p>
       <w:pPr>
-        <w:spacing w:line="288" w:lineRule="auto" w:after="160"/>
+        <w:spacing w:line="276" w:lineRule="auto" w:after="160"/>
+        <w:jc w:val="both"/>
       </w:pPr>
       <w:r>
         <w:rPr>
@@ -1241,12 +1728,13 @@
           <w:b w:val="0"/>
           <w:sz w:val="22"/>
         </w:rPr>
-        <w:t>Tata Motors was established in 1945 as TELCO, with initial focus on locomotives and engineering products.</w:t>
+        <w:t>Tata Motors was established in 1945 as Tata Engineering and Locomotive Company Limited. Its initial activities were associated with locomotives and engineering products, building industrial capability for later vehicle manufacturing.</w:t>
       </w:r>
     </w:p>
     <w:p>
       <w:pPr>
-        <w:spacing w:before="200" w:after="120"/>
+        <w:keepNext/>
+        <w:spacing w:before="160" w:after="120"/>
       </w:pPr>
       <w:r>
         <w:rPr>
@@ -1260,7 +1748,8 @@
     </w:p>
     <w:p>
       <w:pPr>
-        <w:spacing w:line="288" w:lineRule="auto" w:after="160"/>
+        <w:spacing w:line="276" w:lineRule="auto" w:after="160"/>
+        <w:jc w:val="both"/>
       </w:pPr>
       <w:r>
         <w:rPr>
@@ -1268,12 +1757,13 @@
           <w:b w:val="0"/>
           <w:sz w:val="22"/>
         </w:rPr>
-        <w:t>The company entered commercial vehicles through collaboration with Daimler-Benz (1954).</w:t>
+        <w:t>The company entered the commercial vehicle sector through collaboration with Daimler-Benz of Germany (1954), beginning organised truck manufacturing in India.</w:t>
       </w:r>
     </w:p>
     <w:p>
       <w:pPr>
-        <w:spacing w:before="200" w:after="120"/>
+        <w:keepNext/>
+        <w:spacing w:before="160" w:after="120"/>
       </w:pPr>
       <w:r>
         <w:rPr>
@@ -1287,7 +1777,8 @@
     </w:p>
     <w:p>
       <w:pPr>
-        <w:spacing w:line="288" w:lineRule="auto" w:after="160"/>
+        <w:spacing w:line="276" w:lineRule="auto" w:after="160"/>
+        <w:jc w:val="both"/>
       </w:pPr>
       <w:r>
         <w:rPr>
@@ -1295,12 +1786,13 @@
           <w:b w:val="0"/>
           <w:sz w:val="22"/>
         </w:rPr>
-        <w:t>Passenger vehicles expanded the business beyond commercial transport. The Tata Indica (1998) became a milestone as an indigenously developed passenger car.</w:t>
+        <w:t>Passenger vehicles helped the company move beyond commercial transport. The Tata Indica (1998) became a significant milestone as an indigenously developed passenger car and strengthened market presence.</w:t>
       </w:r>
     </w:p>
     <w:p>
       <w:pPr>
-        <w:spacing w:before="200" w:after="120"/>
+        <w:keepNext/>
+        <w:spacing w:before="160" w:after="120"/>
       </w:pPr>
       <w:r>
         <w:rPr>
@@ -1314,7 +1806,8 @@
     </w:p>
     <w:p>
       <w:pPr>
-        <w:spacing w:line="288" w:lineRule="auto" w:after="160"/>
+        <w:spacing w:line="276" w:lineRule="auto" w:after="160"/>
+        <w:jc w:val="both"/>
       </w:pPr>
       <w:r>
         <w:rPr>
@@ -1322,12 +1815,13 @@
           <w:b w:val="0"/>
           <w:sz w:val="22"/>
         </w:rPr>
-        <w:t>2004: Daewoo Commercial Vehicle Company (South Korea). 2008: Jaguar Land Rover acquired from Ford — a landmark global acquisition.</w:t>
+        <w:t>In 2004, Tata Motors acquired Daewoo Commercial Vehicle Company in South Korea. In 2008, it acquired Jaguar Land Rover from Ford Motor Company—a landmark acquisition expanding luxury brands and global engineering.</w:t>
       </w:r>
     </w:p>
     <w:p>
       <w:pPr>
-        <w:spacing w:before="200" w:after="120"/>
+        <w:keepNext/>
+        <w:spacing w:before="160" w:after="120"/>
       </w:pPr>
       <w:r>
         <w:rPr>
@@ -1341,7 +1835,8 @@
     </w:p>
     <w:p>
       <w:pPr>
-        <w:spacing w:line="288" w:lineRule="auto" w:after="160"/>
+        <w:spacing w:line="276" w:lineRule="auto" w:after="160"/>
+        <w:jc w:val="both"/>
       </w:pPr>
       <w:r>
         <w:rPr>
@@ -1349,12 +1844,13 @@
           <w:b w:val="0"/>
           <w:sz w:val="22"/>
         </w:rPr>
-        <w:t>Modern lineup includes Tiago, Nexon, Harrier, Safari, Punch, and Curvv with improved safety, design, and technology.</w:t>
+        <w:t>In subsequent years, the company introduced products focused on styling, fuel efficiency, safety, comfort, and technology. Vehicles such as Tiago, Nexon, Harrier, Safari, and Punch strengthened the passenger portfolio. Tata Ace (2005) transformed last-mile logistics.</w:t>
       </w:r>
     </w:p>
     <w:p>
       <w:pPr>
-        <w:spacing w:before="200" w:after="120"/>
+        <w:keepNext/>
+        <w:spacing w:before="160" w:after="120"/>
       </w:pPr>
       <w:r>
         <w:rPr>
@@ -1368,7 +1864,8 @@
     </w:p>
     <w:p>
       <w:pPr>
-        <w:spacing w:line="288" w:lineRule="auto" w:after="160"/>
+        <w:spacing w:line="276" w:lineRule="auto" w:after="160"/>
+        <w:jc w:val="both"/>
       </w:pPr>
       <w:r>
         <w:rPr>
@@ -1376,12 +1873,18 @@
           <w:b w:val="0"/>
           <w:sz w:val="22"/>
         </w:rPr>
-        <w:t>Investments in battery-electric vehicles, ZIPTRON powertrain, charging partnerships, connected features, automation, and sustainable mobility. FY25 milestones include expanded EV/CNG portfolio and new manufacturing capacity.</w:t>
+        <w:t>Tata Motors invested in battery-electric vehicles, electric powertrains, charging partnerships, software-enabled features, and efficient manufacturing. FY2024–25 reporting highlights CNG and EV share growth, hydrogen ICE truck development, automation, and AI-enabled operations.</w:t>
       </w:r>
     </w:p>
     <w:p>
-      <w:pPr>
-        <w:spacing w:before="200" w:after="120"/>
+      <w:r>
+        <w:br w:type="page"/>
+      </w:r>
+    </w:p>
+    <w:p>
+      <w:pPr>
+        <w:keepNext w:val="0"/>
+        <w:spacing w:before="240" w:after="120"/>
       </w:pPr>
       <w:r>
         <w:rPr>
@@ -1406,7 +1909,8 @@
       <w:tr>
         <w:tc>
           <w:tcPr>
-            <w:tcW w:type="dxa" w:w="4680"/>
+            <w:tcW w:type="dxa" w:w="4464"/>
+            <w:vAlign w:val="center"/>
           </w:tcPr>
           <w:p>
             <w:pPr>
@@ -1415,7 +1919,7 @@
             <w:r>
               <w:drawing>
                 <wp:inline xmlns:a="http://schemas.openxmlformats.org/drawingml/2006/main" xmlns:pic="http://schemas.openxmlformats.org/drawingml/2006/picture">
-                  <wp:extent cx="2651760" cy="1878330"/>
+                  <wp:extent cx="2606040" cy="1845945"/>
                   <wp:docPr id="6" name="Picture 6"/>
                   <wp:cNvGraphicFramePr>
                     <a:graphicFrameLocks noChangeAspect="1"/>
@@ -1436,7 +1940,7 @@
                         <pic:spPr>
                           <a:xfrm>
                             <a:off x="0" y="0"/>
-                            <a:ext cx="2651760" cy="1878330"/>
+                            <a:ext cx="2606040" cy="1845945"/>
                           </a:xfrm>
                           <a:prstGeom prst="rect"/>
                         </pic:spPr>
@@ -1450,7 +1954,8 @@
         </w:tc>
         <w:tc>
           <w:tcPr>
-            <w:tcW w:type="dxa" w:w="4680"/>
+            <w:tcW w:type="dxa" w:w="4464"/>
+            <w:vAlign w:val="center"/>
           </w:tcPr>
           <w:p>
             <w:pPr>
@@ -1459,7 +1964,7 @@
             <w:r>
               <w:drawing>
                 <wp:inline xmlns:a="http://schemas.openxmlformats.org/drawingml/2006/main" xmlns:pic="http://schemas.openxmlformats.org/drawingml/2006/picture">
-                  <wp:extent cx="2651760" cy="1864519"/>
+                  <wp:extent cx="2606040" cy="1832372"/>
                   <wp:docPr id="7" name="Picture 7"/>
                   <wp:cNvGraphicFramePr>
                     <a:graphicFrameLocks noChangeAspect="1"/>
@@ -1480,7 +1985,7 @@
                         <pic:spPr>
                           <a:xfrm>
                             <a:off x="0" y="0"/>
-                            <a:ext cx="2651760" cy="1864519"/>
+                            <a:ext cx="2606040" cy="1832372"/>
                           </a:xfrm>
                           <a:prstGeom prst="rect"/>
                         </pic:spPr>
@@ -1497,7 +2002,8 @@
     <w:p/>
     <w:p>
       <w:pPr>
-        <w:spacing w:line="288" w:lineRule="auto" w:after="160"/>
+        <w:spacing w:line="276" w:lineRule="auto" w:after="160"/>
+        <w:jc w:val="both"/>
       </w:pPr>
       <w:r>
         <w:rPr>
@@ -1505,12 +2011,13 @@
           <w:b w:val="0"/>
           <w:sz w:val="22"/>
         </w:rPr>
-        <w:t>Automobile manufacturing involves design, procurement, assembly, inspection, and delivery. The following are established practices relevant to Tata Motors operations (general industry methods; exact procedures vary by plant).</w:t>
+        <w:t>Automobile manufacturing involves multiple coordinated activities, from product design and raw material procurement to assembly, inspection, and delivery. Tata Motors' exact procedures vary by plant, product, and production line. The following methodologies describe established automotive manufacturing practices relevant to its operations; they should not be interpreted as a verified list of systems used identically at every Tata Motors facility.</w:t>
       </w:r>
     </w:p>
     <w:p>
       <w:pPr>
-        <w:spacing w:before="200" w:after="120"/>
+        <w:keepNext/>
+        <w:spacing w:before="160" w:after="120"/>
       </w:pPr>
       <w:r>
         <w:rPr>
@@ -1524,7 +2031,8 @@
     </w:p>
     <w:p>
       <w:pPr>
-        <w:spacing w:line="288" w:lineRule="auto" w:after="160"/>
+        <w:spacing w:line="276" w:lineRule="auto" w:after="160"/>
+        <w:jc w:val="both"/>
       </w:pPr>
       <w:r>
         <w:rPr>
@@ -1532,12 +2040,97 @@
           <w:b w:val="0"/>
           <w:sz w:val="22"/>
         </w:rPr>
-        <w:t>Reduces waste; improves flow of materials and work.</w:t>
+        <w:t>Lean manufacturing aims to reduce waste and improve the flow of materials and work.</w:t>
       </w:r>
     </w:p>
     <w:p>
       <w:pPr>
-        <w:spacing w:before="200" w:after="120"/>
+        <w:pStyle w:val="ListBullet"/>
+        <w:jc w:val="both"/>
+      </w:pPr>
+      <w:r>
+        <w:rPr>
+          <w:rFonts w:ascii="Calibri" w:hAnsi="Calibri" w:eastAsia="Calibri"/>
+          <w:b w:val="0"/>
+          <w:sz w:val="22"/>
+        </w:rPr>
+        <w:t>Eliminating unnecessary movement and waiting time.</w:t>
+      </w:r>
+    </w:p>
+    <w:p>
+      <w:pPr>
+        <w:pStyle w:val="ListBullet"/>
+        <w:jc w:val="both"/>
+      </w:pPr>
+      <w:r>
+        <w:rPr>
+          <w:rFonts w:ascii="Calibri" w:hAnsi="Calibri" w:eastAsia="Calibri"/>
+          <w:b w:val="0"/>
+          <w:sz w:val="22"/>
+        </w:rPr>
+        <w:t>Reducing excess inventory.</w:t>
+      </w:r>
+    </w:p>
+    <w:p>
+      <w:pPr>
+        <w:pStyle w:val="ListBullet"/>
+        <w:jc w:val="both"/>
+      </w:pPr>
+      <w:r>
+        <w:rPr>
+          <w:rFonts w:ascii="Calibri" w:hAnsi="Calibri" w:eastAsia="Calibri"/>
+          <w:b w:val="0"/>
+          <w:sz w:val="22"/>
+        </w:rPr>
+        <w:t>Improving workstation organisation.</w:t>
+      </w:r>
+    </w:p>
+    <w:p>
+      <w:pPr>
+        <w:pStyle w:val="ListBullet"/>
+        <w:jc w:val="both"/>
+      </w:pPr>
+      <w:r>
+        <w:rPr>
+          <w:rFonts w:ascii="Calibri" w:hAnsi="Calibri" w:eastAsia="Calibri"/>
+          <w:b w:val="0"/>
+          <w:sz w:val="22"/>
+        </w:rPr>
+        <w:t>Simplifying manufacturing processes.</w:t>
+      </w:r>
+    </w:p>
+    <w:p>
+      <w:pPr>
+        <w:pStyle w:val="ListBullet"/>
+        <w:jc w:val="both"/>
+      </w:pPr>
+      <w:r>
+        <w:rPr>
+          <w:rFonts w:ascii="Calibri" w:hAnsi="Calibri" w:eastAsia="Calibri"/>
+          <w:b w:val="0"/>
+          <w:sz w:val="22"/>
+        </w:rPr>
+        <w:t>Reducing defects and rework.</w:t>
+      </w:r>
+    </w:p>
+    <w:p>
+      <w:pPr>
+        <w:pStyle w:val="ListBullet"/>
+        <w:jc w:val="both"/>
+      </w:pPr>
+      <w:r>
+        <w:rPr>
+          <w:rFonts w:ascii="Calibri" w:hAnsi="Calibri" w:eastAsia="Calibri"/>
+          <w:b w:val="0"/>
+          <w:sz w:val="22"/>
+        </w:rPr>
+        <w:t>Improving productivity without compromising quality.</w:t>
+      </w:r>
+    </w:p>
+    <w:p>
+      <w:pPr>
+        <w:keepNext/>
+        <w:spacing w:before="160" w:after="120"/>
       </w:pPr>
       <w:r>
         <w:rPr>
@@ -1546,12 +2139,13 @@
           <w:color w:val="003366"/>
           <w:sz w:val="26"/>
         </w:rPr>
-        <w:t>5.2 Just-in-Time (JIT)</w:t>
+        <w:t>5.2 Just-in-Time (JIT) production</w:t>
       </w:r>
     </w:p>
     <w:p>
       <w:pPr>
-        <w:spacing w:line="288" w:lineRule="auto" w:after="160"/>
+        <w:spacing w:line="276" w:lineRule="auto" w:after="160"/>
+        <w:jc w:val="both"/>
       </w:pPr>
       <w:r>
         <w:rPr>
@@ -1559,12 +2153,41 @@
           <w:b w:val="0"/>
           <w:sz w:val="22"/>
         </w:rPr>
-        <w:t>Supplies components when required on the production line.</w:t>
+        <w:t>Just-in-Time production supplies materials and components when required by the production process.</w:t>
       </w:r>
     </w:p>
     <w:p>
       <w:pPr>
-        <w:spacing w:before="200" w:after="120"/>
+        <w:pStyle w:val="ListBullet"/>
+        <w:jc w:val="both"/>
+      </w:pPr>
+      <w:r>
+        <w:rPr>
+          <w:rFonts w:ascii="Calibri" w:hAnsi="Calibri" w:eastAsia="Calibri"/>
+          <w:b w:val="0"/>
+          <w:sz w:val="22"/>
+        </w:rPr>
+        <w:t>Requires reliable suppliers and accurate production schedules.</w:t>
+      </w:r>
+    </w:p>
+    <w:p>
+      <w:pPr>
+        <w:pStyle w:val="ListBullet"/>
+        <w:jc w:val="both"/>
+      </w:pPr>
+      <w:r>
+        <w:rPr>
+          <w:rFonts w:ascii="Calibri" w:hAnsi="Calibri" w:eastAsia="Calibri"/>
+          <w:b w:val="0"/>
+          <w:sz w:val="22"/>
+        </w:rPr>
+        <w:t>Needs coordination between purchasing, stores, and assembly.</w:t>
+      </w:r>
+    </w:p>
+    <w:p>
+      <w:pPr>
+        <w:keepNext/>
+        <w:spacing w:before="160" w:after="120"/>
       </w:pPr>
       <w:r>
         <w:rPr>
@@ -1573,12 +2196,13 @@
           <w:color w:val="003366"/>
           <w:sz w:val="26"/>
         </w:rPr>
-        <w:t>5.3 Kaizen</w:t>
+        <w:t>5.3 Kaizen and continuous improvement</w:t>
       </w:r>
     </w:p>
     <w:p>
       <w:pPr>
-        <w:spacing w:line="288" w:lineRule="auto" w:after="160"/>
+        <w:spacing w:line="276" w:lineRule="auto" w:after="160"/>
+        <w:jc w:val="both"/>
       </w:pPr>
       <w:r>
         <w:rPr>
@@ -1586,12 +2210,13 @@
           <w:b w:val="0"/>
           <w:sz w:val="22"/>
         </w:rPr>
-        <w:t>Continuous incremental improvement by employees and supervisors.</w:t>
+        <w:t>Kaizen focuses on continuous, incremental improvement in safety, quality, productivity, and workflow.</w:t>
       </w:r>
     </w:p>
     <w:p>
       <w:pPr>
-        <w:spacing w:before="200" w:after="120"/>
+        <w:keepNext/>
+        <w:spacing w:before="160" w:after="120"/>
       </w:pPr>
       <w:r>
         <w:rPr>
@@ -1600,12 +2225,13 @@
           <w:color w:val="003366"/>
           <w:sz w:val="26"/>
         </w:rPr>
-        <w:t>5.4 Total Quality Management</w:t>
+        <w:t>5.4 Total Quality Management (TQM)</w:t>
       </w:r>
     </w:p>
     <w:p>
       <w:pPr>
-        <w:spacing w:line="288" w:lineRule="auto" w:after="160"/>
+        <w:spacing w:line="276" w:lineRule="auto" w:after="160"/>
+        <w:jc w:val="both"/>
       </w:pPr>
       <w:r>
         <w:rPr>
@@ -1613,12 +2239,69 @@
           <w:b w:val="0"/>
           <w:sz w:val="22"/>
         </w:rPr>
-        <w:t>Quality across design, production, and service—not only inspection.</w:t>
+        <w:t>TQM emphasises quality across the entire organisation—not only at final inspection.</w:t>
       </w:r>
     </w:p>
     <w:p>
       <w:pPr>
-        <w:spacing w:before="200" w:after="120"/>
+        <w:pStyle w:val="ListBullet"/>
+        <w:jc w:val="both"/>
+      </w:pPr>
+      <w:r>
+        <w:rPr>
+          <w:rFonts w:ascii="Calibri" w:hAnsi="Calibri" w:eastAsia="Calibri"/>
+          <w:b w:val="0"/>
+          <w:sz w:val="22"/>
+        </w:rPr>
+        <w:t>Establishing quality standards.</w:t>
+      </w:r>
+    </w:p>
+    <w:p>
+      <w:pPr>
+        <w:pStyle w:val="ListBullet"/>
+        <w:jc w:val="both"/>
+      </w:pPr>
+      <w:r>
+        <w:rPr>
+          <w:rFonts w:ascii="Calibri" w:hAnsi="Calibri" w:eastAsia="Calibri"/>
+          <w:b w:val="0"/>
+          <w:sz w:val="22"/>
+        </w:rPr>
+        <w:t>Training employees in correct procedures.</w:t>
+      </w:r>
+    </w:p>
+    <w:p>
+      <w:pPr>
+        <w:pStyle w:val="ListBullet"/>
+        <w:jc w:val="both"/>
+      </w:pPr>
+      <w:r>
+        <w:rPr>
+          <w:rFonts w:ascii="Calibri" w:hAnsi="Calibri" w:eastAsia="Calibri"/>
+          <w:b w:val="0"/>
+          <w:sz w:val="22"/>
+        </w:rPr>
+        <w:t>Monitoring production defects.</w:t>
+      </w:r>
+    </w:p>
+    <w:p>
+      <w:pPr>
+        <w:pStyle w:val="ListBullet"/>
+        <w:jc w:val="both"/>
+      </w:pPr>
+      <w:r>
+        <w:rPr>
+          <w:rFonts w:ascii="Calibri" w:hAnsi="Calibri" w:eastAsia="Calibri"/>
+          <w:b w:val="0"/>
+          <w:sz w:val="22"/>
+        </w:rPr>
+        <w:t>Investigating root causes of failures.</w:t>
+      </w:r>
+    </w:p>
+    <w:p>
+      <w:pPr>
+        <w:keepNext/>
+        <w:spacing w:before="160" w:after="120"/>
       </w:pPr>
       <w:r>
         <w:rPr>
@@ -1632,7 +2315,8 @@
     </w:p>
     <w:p>
       <w:pPr>
-        <w:spacing w:line="288" w:lineRule="auto" w:after="160"/>
+        <w:spacing w:line="276" w:lineRule="auto" w:after="160"/>
+        <w:jc w:val="both"/>
       </w:pPr>
       <w:r>
         <w:rPr>
@@ -1640,12 +2324,13 @@
           <w:b w:val="0"/>
           <w:sz w:val="22"/>
         </w:rPr>
-        <w:t>Improves precision and repeatability in welding and assembly.</w:t>
+        <w:t>Automation improves precision, repeatability, and productivity in welding, painting, and assembly operations.</w:t>
       </w:r>
     </w:p>
     <w:p>
       <w:pPr>
-        <w:spacing w:before="200" w:after="120"/>
+        <w:keepNext/>
+        <w:spacing w:before="160" w:after="120"/>
       </w:pPr>
       <w:r>
         <w:rPr>
@@ -1654,12 +2339,13 @@
           <w:color w:val="003366"/>
           <w:sz w:val="26"/>
         </w:rPr>
-        <w:t>5.6 CAD / CAM</w:t>
+        <w:t>5.6 Computer-Aided Design and Manufacturing</w:t>
       </w:r>
     </w:p>
     <w:p>
       <w:pPr>
-        <w:spacing w:line="288" w:lineRule="auto" w:after="160"/>
+        <w:spacing w:line="276" w:lineRule="auto" w:after="160"/>
+        <w:jc w:val="both"/>
       </w:pPr>
       <w:r>
         <w:rPr>
@@ -1667,12 +2353,13 @@
           <w:b w:val="0"/>
           <w:sz w:val="22"/>
         </w:rPr>
-        <w:t>Digital design and manufacturing planning.</w:t>
+        <w:t>CAD supports digital vehicle design; CAM supports planning and execution of manufacturing operations.</w:t>
       </w:r>
     </w:p>
     <w:p>
       <w:pPr>
-        <w:spacing w:before="200" w:after="120"/>
+        <w:keepNext/>
+        <w:spacing w:before="160" w:after="120"/>
       </w:pPr>
       <w:r>
         <w:rPr>
@@ -1686,7 +2373,8 @@
     </w:p>
     <w:p>
       <w:pPr>
-        <w:spacing w:line="288" w:lineRule="auto" w:after="160"/>
+        <w:spacing w:line="276" w:lineRule="auto" w:after="160"/>
+        <w:jc w:val="both"/>
       </w:pPr>
       <w:r>
         <w:rPr>
@@ -1694,12 +2382,55 @@
           <w:b w:val="0"/>
           <w:sz w:val="22"/>
         </w:rPr>
-        <w:t>Vendor quality, inventory, scheduling, and logistics.</w:t>
+        <w:t>Automobile manufacturing depends on suppliers of steel, tyres, electronics, batteries, glass, and seats.</w:t>
       </w:r>
     </w:p>
     <w:p>
       <w:pPr>
-        <w:spacing w:before="200" w:after="120"/>
+        <w:pStyle w:val="ListBullet"/>
+        <w:jc w:val="both"/>
+      </w:pPr>
+      <w:r>
+        <w:rPr>
+          <w:rFonts w:ascii="Calibri" w:hAnsi="Calibri" w:eastAsia="Calibri"/>
+          <w:b w:val="0"/>
+          <w:sz w:val="22"/>
+        </w:rPr>
+        <w:t>Supplier evaluation and purchasing.</w:t>
+      </w:r>
+    </w:p>
+    <w:p>
+      <w:pPr>
+        <w:pStyle w:val="ListBullet"/>
+        <w:jc w:val="both"/>
+      </w:pPr>
+      <w:r>
+        <w:rPr>
+          <w:rFonts w:ascii="Calibri" w:hAnsi="Calibri" w:eastAsia="Calibri"/>
+          <w:b w:val="0"/>
+          <w:sz w:val="22"/>
+        </w:rPr>
+        <w:t>Inventory planning and incoming inspection.</w:t>
+      </w:r>
+    </w:p>
+    <w:p>
+      <w:pPr>
+        <w:pStyle w:val="ListBullet"/>
+        <w:jc w:val="both"/>
+      </w:pPr>
+      <w:r>
+        <w:rPr>
+          <w:rFonts w:ascii="Calibri" w:hAnsi="Calibri" w:eastAsia="Calibri"/>
+          <w:b w:val="0"/>
+          <w:sz w:val="22"/>
+        </w:rPr>
+        <w:t>Production scheduling and logistics coordination.</w:t>
+      </w:r>
+    </w:p>
+    <w:p>
+      <w:pPr>
+        <w:keepNext/>
+        <w:spacing w:before="160" w:after="120"/>
       </w:pPr>
       <w:r>
         <w:rPr>
@@ -1708,12 +2439,13 @@
           <w:color w:val="003366"/>
           <w:sz w:val="26"/>
         </w:rPr>
-        <w:t>5.8 Safety and environment</w:t>
+        <w:t>5.8 Safety and environmental management</w:t>
       </w:r>
     </w:p>
     <w:p>
       <w:pPr>
-        <w:spacing w:line="288" w:lineRule="auto" w:after="160"/>
+        <w:spacing w:line="276" w:lineRule="auto" w:after="160"/>
+        <w:jc w:val="both"/>
       </w:pPr>
       <w:r>
         <w:rPr>
@@ -1721,12 +2453,55 @@
           <w:b w:val="0"/>
           <w:sz w:val="22"/>
         </w:rPr>
-        <w:t>Occupational safety, emissions, waste, and compliance.</w:t>
+        <w:t>Plants manage occupational safety, energy, emissions, waste, water, and chemical handling.</w:t>
       </w:r>
     </w:p>
     <w:p>
       <w:pPr>
-        <w:spacing w:before="200" w:after="120"/>
+        <w:pStyle w:val="ListBullet"/>
+        <w:jc w:val="both"/>
+      </w:pPr>
+      <w:r>
+        <w:rPr>
+          <w:rFonts w:ascii="Calibri" w:hAnsi="Calibri" w:eastAsia="Calibri"/>
+          <w:b w:val="0"/>
+          <w:sz w:val="22"/>
+        </w:rPr>
+        <w:t>Machine guarding and safety training.</w:t>
+      </w:r>
+    </w:p>
+    <w:p>
+      <w:pPr>
+        <w:pStyle w:val="ListBullet"/>
+        <w:jc w:val="both"/>
+      </w:pPr>
+      <w:r>
+        <w:rPr>
+          <w:rFonts w:ascii="Calibri" w:hAnsi="Calibri" w:eastAsia="Calibri"/>
+          <w:b w:val="0"/>
+          <w:sz w:val="22"/>
+        </w:rPr>
+        <w:t>Energy monitoring and waste segregation.</w:t>
+      </w:r>
+    </w:p>
+    <w:p>
+      <w:pPr>
+        <w:pStyle w:val="ListBullet"/>
+        <w:jc w:val="both"/>
+      </w:pPr>
+      <w:r>
+        <w:rPr>
+          <w:rFonts w:ascii="Calibri" w:hAnsi="Calibri" w:eastAsia="Calibri"/>
+          <w:b w:val="0"/>
+          <w:sz w:val="22"/>
+        </w:rPr>
+        <w:t>Wastewater treatment and environmental compliance.</w:t>
+      </w:r>
+    </w:p>
+    <w:p>
+      <w:pPr>
+        <w:keepNext/>
+        <w:spacing w:before="160" w:after="120"/>
       </w:pPr>
       <w:r>
         <w:rPr>
@@ -1735,12 +2510,13 @@
           <w:color w:val="003366"/>
           <w:sz w:val="26"/>
         </w:rPr>
-        <w:t>5.9 EV manufacturing</w:t>
+        <w:t>5.9 Electric vehicle manufacturing</w:t>
       </w:r>
     </w:p>
     <w:p>
       <w:pPr>
-        <w:spacing w:line="288" w:lineRule="auto" w:after="160"/>
+        <w:spacing w:line="276" w:lineRule="auto" w:after="160"/>
+        <w:jc w:val="both"/>
       </w:pPr>
       <w:r>
         <w:rPr>
@@ -1748,12 +2524,55 @@
           <w:b w:val="0"/>
           <w:sz w:val="22"/>
         </w:rPr>
-        <w:t>Battery packs, high-voltage safety, motors, and power electronics.</w:t>
+        <w:t>EV production shares body, paint, and assembly processes with conventional vehicles but adds:</w:t>
       </w:r>
     </w:p>
     <w:p>
       <w:pPr>
-        <w:spacing w:before="200" w:after="120"/>
+        <w:pStyle w:val="ListBullet"/>
+        <w:jc w:val="both"/>
+      </w:pPr>
+      <w:r>
+        <w:rPr>
+          <w:rFonts w:ascii="Calibri" w:hAnsi="Calibri" w:eastAsia="Calibri"/>
+          <w:b w:val="0"/>
+          <w:sz w:val="22"/>
+        </w:rPr>
+        <w:t>Battery pack assembly and thermal management.</w:t>
+      </w:r>
+    </w:p>
+    <w:p>
+      <w:pPr>
+        <w:pStyle w:val="ListBullet"/>
+        <w:jc w:val="both"/>
+      </w:pPr>
+      <w:r>
+        <w:rPr>
+          <w:rFonts w:ascii="Calibri" w:hAnsi="Calibri" w:eastAsia="Calibri"/>
+          <w:b w:val="0"/>
+          <w:sz w:val="22"/>
+        </w:rPr>
+        <w:t>High-voltage components and electrical safety protocols.</w:t>
+      </w:r>
+    </w:p>
+    <w:p>
+      <w:pPr>
+        <w:pStyle w:val="ListBullet"/>
+        <w:jc w:val="both"/>
+      </w:pPr>
+      <w:r>
+        <w:rPr>
+          <w:rFonts w:ascii="Calibri" w:hAnsi="Calibri" w:eastAsia="Calibri"/>
+          <w:b w:val="0"/>
+          <w:sz w:val="22"/>
+        </w:rPr>
+        <w:t>Electric motors and power electronics integration.</w:t>
+      </w:r>
+    </w:p>
+    <w:p>
+      <w:pPr>
+        <w:keepNext/>
+        <w:spacing w:before="160" w:after="120"/>
       </w:pPr>
       <w:r>
         <w:rPr>
@@ -1762,12 +2581,13 @@
           <w:color w:val="003366"/>
           <w:sz w:val="26"/>
         </w:rPr>
-        <w:t>5.10 Quality testing</w:t>
+        <w:t>5.10 Quality inspection and testing</w:t>
       </w:r>
     </w:p>
     <w:p>
       <w:pPr>
-        <w:spacing w:line="288" w:lineRule="auto" w:after="160"/>
+        <w:spacing w:line="276" w:lineRule="auto" w:after="160"/>
+        <w:jc w:val="both"/>
       </w:pPr>
       <w:r>
         <w:rPr>
@@ -1775,7 +2595,63 @@
           <w:b w:val="0"/>
           <w:sz w:val="22"/>
         </w:rPr>
-        <w:t>Body, paint, electrical, powertrain, brake, leak, and road tests.</w:t>
+        <w:t>Before dispatch, manufacturers conduct multiple inspections and tests:</w:t>
+      </w:r>
+    </w:p>
+    <w:p>
+      <w:pPr>
+        <w:pStyle w:val="ListBullet"/>
+        <w:jc w:val="both"/>
+      </w:pPr>
+      <w:r>
+        <w:rPr>
+          <w:rFonts w:ascii="Calibri" w:hAnsi="Calibri" w:eastAsia="Calibri"/>
+          <w:b w:val="0"/>
+          <w:sz w:val="22"/>
+        </w:rPr>
+        <w:t>Body and paint inspection; dimensional checks.</w:t>
+      </w:r>
+    </w:p>
+    <w:p>
+      <w:pPr>
+        <w:pStyle w:val="ListBullet"/>
+        <w:jc w:val="both"/>
+      </w:pPr>
+      <w:r>
+        <w:rPr>
+          <w:rFonts w:ascii="Calibri" w:hAnsi="Calibri" w:eastAsia="Calibri"/>
+          <w:b w:val="0"/>
+          <w:sz w:val="22"/>
+        </w:rPr>
+        <w:t>Electrical system and powertrain testing.</w:t>
+      </w:r>
+    </w:p>
+    <w:p>
+      <w:pPr>
+        <w:pStyle w:val="ListBullet"/>
+        <w:jc w:val="both"/>
+      </w:pPr>
+      <w:r>
+        <w:rPr>
+          <w:rFonts w:ascii="Calibri" w:hAnsi="Calibri" w:eastAsia="Calibri"/>
+          <w:b w:val="0"/>
+          <w:sz w:val="22"/>
+        </w:rPr>
+        <w:t>Brake, steering, leak, and end-of-line functional tests.</w:t>
+      </w:r>
+    </w:p>
+    <w:p>
+      <w:pPr>
+        <w:pStyle w:val="ListBullet"/>
+        <w:jc w:val="both"/>
+      </w:pPr>
+      <w:r>
+        <w:rPr>
+          <w:rFonts w:ascii="Calibri" w:hAnsi="Calibri" w:eastAsia="Calibri"/>
+          <w:b w:val="0"/>
+          <w:sz w:val="22"/>
+        </w:rPr>
+        <w:t>Road testing or prescribed vehicle checks.</w:t>
       </w:r>
     </w:p>
     <w:p>
@@ -1785,7 +2661,8 @@
     </w:p>
     <w:p>
       <w:pPr>
-        <w:spacing w:before="200" w:after="120"/>
+        <w:keepNext w:val="0"/>
+        <w:spacing w:before="240" w:after="120"/>
       </w:pPr>
       <w:r>
         <w:rPr>
@@ -1799,7 +2676,8 @@
     </w:p>
     <w:p>
       <w:pPr>
-        <w:spacing w:line="288" w:lineRule="auto" w:after="160"/>
+        <w:spacing w:line="276" w:lineRule="auto" w:after="160"/>
+        <w:jc w:val="both"/>
       </w:pPr>
       <w:r>
         <w:rPr>
@@ -1807,23 +2685,385 @@
           <w:b w:val="0"/>
           <w:sz w:val="22"/>
         </w:rPr>
-        <w:t>Tata Motors has developed a wide range of vehicles for individual customers, businesses, and public transport operators.</w:t>
+        <w:t>Tata Motors has developed a wide range of vehicles for individual customers, businesses, and public transport operators. The portfolio is summarised in the table below and illustrated with representative product categories.</w:t>
       </w:r>
     </w:p>
     <w:tbl>
       <w:tblPr>
+        <w:tblStyle w:val="TableGrid"/>
         <w:tblW w:type="auto" w:w="0"/>
-        <w:tblLayout w:type="fixed"/>
         <w:tblLook w:firstColumn="1" w:firstRow="1" w:lastColumn="0" w:lastRow="0" w:noHBand="0" w:noVBand="1" w:val="04A0"/>
       </w:tblPr>
       <w:tblGrid>
-        <w:gridCol w:w="3744"/>
-        <w:gridCol w:w="5472"/>
+        <w:gridCol w:w="3120"/>
+        <w:gridCol w:w="3120"/>
+        <w:gridCol w:w="3120"/>
       </w:tblGrid>
       <w:tr>
         <w:tc>
           <w:tcPr>
-            <w:tcW w:type="dxa" w:w="4680"/>
+            <w:tcW w:type="dxa" w:w="2016"/>
+            <w:shd w:fill="1F4E79"/>
+          </w:tcPr>
+          <w:p>
+            <w:pPr>
+              <w:jc w:val="left"/>
+            </w:pPr>
+            <w:r>
+              <w:rPr>
+                <w:rFonts w:ascii="Calibri" w:hAnsi="Calibri" w:eastAsia="Calibri"/>
+                <w:b/>
+                <w:color w:val="FFFFFF"/>
+                <w:sz w:val="22"/>
+              </w:rPr>
+              <w:t>Segment</w:t>
+            </w:r>
+          </w:p>
+        </w:tc>
+        <w:tc>
+          <w:tcPr>
+            <w:tcW w:type="dxa" w:w="2304"/>
+            <w:shd w:fill="1F4E79"/>
+          </w:tcPr>
+          <w:p>
+            <w:pPr>
+              <w:jc w:val="left"/>
+            </w:pPr>
+            <w:r>
+              <w:rPr>
+                <w:rFonts w:ascii="Calibri" w:hAnsi="Calibri" w:eastAsia="Calibri"/>
+                <w:b/>
+                <w:color w:val="FFFFFF"/>
+                <w:sz w:val="22"/>
+              </w:rPr>
+              <w:t>Category</w:t>
+            </w:r>
+          </w:p>
+        </w:tc>
+        <w:tc>
+          <w:tcPr>
+            <w:tcW w:type="dxa" w:w="4896"/>
+            <w:shd w:fill="1F4E79"/>
+          </w:tcPr>
+          <w:p>
+            <w:pPr>
+              <w:jc w:val="left"/>
+            </w:pPr>
+            <w:r>
+              <w:rPr>
+                <w:rFonts w:ascii="Calibri" w:hAnsi="Calibri" w:eastAsia="Calibri"/>
+                <w:b/>
+                <w:color w:val="FFFFFF"/>
+                <w:sz w:val="22"/>
+              </w:rPr>
+              <w:t>Examples</w:t>
+            </w:r>
+          </w:p>
+        </w:tc>
+      </w:tr>
+      <w:tr>
+        <w:tc>
+          <w:tcPr>
+            <w:tcW w:type="dxa" w:w="2016"/>
+          </w:tcPr>
+          <w:p>
+            <w:pPr>
+              <w:jc w:val="left"/>
+            </w:pPr>
+            <w:r>
+              <w:rPr>
+                <w:rFonts w:ascii="Calibri" w:hAnsi="Calibri" w:eastAsia="Calibri"/>
+                <w:b w:val="0"/>
+                <w:sz w:val="20"/>
+              </w:rPr>
+              <w:t>Passenger</w:t>
+            </w:r>
+          </w:p>
+        </w:tc>
+        <w:tc>
+          <w:tcPr>
+            <w:tcW w:type="dxa" w:w="2304"/>
+          </w:tcPr>
+          <w:p>
+            <w:pPr>
+              <w:jc w:val="left"/>
+            </w:pPr>
+            <w:r>
+              <w:rPr>
+                <w:rFonts w:ascii="Calibri" w:hAnsi="Calibri" w:eastAsia="Calibri"/>
+                <w:b w:val="0"/>
+                <w:sz w:val="20"/>
+              </w:rPr>
+              <w:t>Hatch / sedan</w:t>
+            </w:r>
+          </w:p>
+        </w:tc>
+        <w:tc>
+          <w:tcPr>
+            <w:tcW w:type="dxa" w:w="4896"/>
+          </w:tcPr>
+          <w:p>
+            <w:pPr>
+              <w:jc w:val="left"/>
+            </w:pPr>
+            <w:r>
+              <w:rPr>
+                <w:rFonts w:ascii="Calibri" w:hAnsi="Calibri" w:eastAsia="Calibri"/>
+                <w:b w:val="0"/>
+                <w:sz w:val="20"/>
+              </w:rPr>
+              <w:t>Tiago, Altroz, Tigor</w:t>
+            </w:r>
+          </w:p>
+        </w:tc>
+      </w:tr>
+      <w:tr>
+        <w:tc>
+          <w:tcPr>
+            <w:tcW w:type="dxa" w:w="2016"/>
+            <w:shd w:fill="E8F1FA"/>
+          </w:tcPr>
+          <w:p>
+            <w:pPr>
+              <w:jc w:val="left"/>
+            </w:pPr>
+            <w:r>
+              <w:rPr>
+                <w:rFonts w:ascii="Calibri" w:hAnsi="Calibri" w:eastAsia="Calibri"/>
+                <w:b w:val="0"/>
+                <w:sz w:val="20"/>
+              </w:rPr>
+              <w:t>Passenger</w:t>
+            </w:r>
+          </w:p>
+        </w:tc>
+        <w:tc>
+          <w:tcPr>
+            <w:tcW w:type="dxa" w:w="2304"/>
+            <w:shd w:fill="E8F1FA"/>
+          </w:tcPr>
+          <w:p>
+            <w:pPr>
+              <w:jc w:val="left"/>
+            </w:pPr>
+            <w:r>
+              <w:rPr>
+                <w:rFonts w:ascii="Calibri" w:hAnsi="Calibri" w:eastAsia="Calibri"/>
+                <w:b w:val="0"/>
+                <w:sz w:val="20"/>
+              </w:rPr>
+              <w:t>SUV / crossover</w:t>
+            </w:r>
+          </w:p>
+        </w:tc>
+        <w:tc>
+          <w:tcPr>
+            <w:tcW w:type="dxa" w:w="4896"/>
+            <w:shd w:fill="E8F1FA"/>
+          </w:tcPr>
+          <w:p>
+            <w:pPr>
+              <w:jc w:val="left"/>
+            </w:pPr>
+            <w:r>
+              <w:rPr>
+                <w:rFonts w:ascii="Calibri" w:hAnsi="Calibri" w:eastAsia="Calibri"/>
+                <w:b w:val="0"/>
+                <w:sz w:val="20"/>
+              </w:rPr>
+              <w:t>Punch, Nexon, Harrier, Safari, Curvv</w:t>
+            </w:r>
+          </w:p>
+        </w:tc>
+      </w:tr>
+      <w:tr>
+        <w:tc>
+          <w:tcPr>
+            <w:tcW w:type="dxa" w:w="2016"/>
+          </w:tcPr>
+          <w:p>
+            <w:pPr>
+              <w:jc w:val="left"/>
+            </w:pPr>
+            <w:r>
+              <w:rPr>
+                <w:rFonts w:ascii="Calibri" w:hAnsi="Calibri" w:eastAsia="Calibri"/>
+                <w:b w:val="0"/>
+                <w:sz w:val="20"/>
+              </w:rPr>
+              <w:t>Commercial</w:t>
+            </w:r>
+          </w:p>
+        </w:tc>
+        <w:tc>
+          <w:tcPr>
+            <w:tcW w:type="dxa" w:w="2304"/>
+          </w:tcPr>
+          <w:p>
+            <w:pPr>
+              <w:jc w:val="left"/>
+            </w:pPr>
+            <w:r>
+              <w:rPr>
+                <w:rFonts w:ascii="Calibri" w:hAnsi="Calibri" w:eastAsia="Calibri"/>
+                <w:b w:val="0"/>
+                <w:sz w:val="20"/>
+              </w:rPr>
+              <w:t>SCV / LCV / M&amp;HCV</w:t>
+            </w:r>
+          </w:p>
+        </w:tc>
+        <w:tc>
+          <w:tcPr>
+            <w:tcW w:type="dxa" w:w="4896"/>
+          </w:tcPr>
+          <w:p>
+            <w:pPr>
+              <w:jc w:val="left"/>
+            </w:pPr>
+            <w:r>
+              <w:rPr>
+                <w:rFonts w:ascii="Calibri" w:hAnsi="Calibri" w:eastAsia="Calibri"/>
+                <w:b w:val="0"/>
+                <w:sz w:val="20"/>
+              </w:rPr>
+              <w:t>Ace, Intra, Ultra, Prima, Signa</w:t>
+            </w:r>
+          </w:p>
+        </w:tc>
+      </w:tr>
+      <w:tr>
+        <w:tc>
+          <w:tcPr>
+            <w:tcW w:type="dxa" w:w="2016"/>
+            <w:shd w:fill="E8F1FA"/>
+          </w:tcPr>
+          <w:p>
+            <w:pPr>
+              <w:jc w:val="left"/>
+            </w:pPr>
+            <w:r>
+              <w:rPr>
+                <w:rFonts w:ascii="Calibri" w:hAnsi="Calibri" w:eastAsia="Calibri"/>
+                <w:b w:val="0"/>
+                <w:sz w:val="20"/>
+              </w:rPr>
+              <w:t>Commercial</w:t>
+            </w:r>
+          </w:p>
+        </w:tc>
+        <w:tc>
+          <w:tcPr>
+            <w:tcW w:type="dxa" w:w="2304"/>
+            <w:shd w:fill="E8F1FA"/>
+          </w:tcPr>
+          <w:p>
+            <w:pPr>
+              <w:jc w:val="left"/>
+            </w:pPr>
+            <w:r>
+              <w:rPr>
+                <w:rFonts w:ascii="Calibri" w:hAnsi="Calibri" w:eastAsia="Calibri"/>
+                <w:b w:val="0"/>
+                <w:sz w:val="20"/>
+              </w:rPr>
+              <w:t>Buses</w:t>
+            </w:r>
+          </w:p>
+        </w:tc>
+        <w:tc>
+          <w:tcPr>
+            <w:tcW w:type="dxa" w:w="4896"/>
+            <w:shd w:fill="E8F1FA"/>
+          </w:tcPr>
+          <w:p>
+            <w:pPr>
+              <w:jc w:val="left"/>
+            </w:pPr>
+            <w:r>
+              <w:rPr>
+                <w:rFonts w:ascii="Calibri" w:hAnsi="Calibri" w:eastAsia="Calibri"/>
+                <w:b w:val="0"/>
+                <w:sz w:val="20"/>
+              </w:rPr>
+              <w:t>Starbus, electric buses</w:t>
+            </w:r>
+          </w:p>
+        </w:tc>
+      </w:tr>
+      <w:tr>
+        <w:tc>
+          <w:tcPr>
+            <w:tcW w:type="dxa" w:w="2016"/>
+          </w:tcPr>
+          <w:p>
+            <w:pPr>
+              <w:jc w:val="left"/>
+            </w:pPr>
+            <w:r>
+              <w:rPr>
+                <w:rFonts w:ascii="Calibri" w:hAnsi="Calibri" w:eastAsia="Calibri"/>
+                <w:b w:val="0"/>
+                <w:sz w:val="20"/>
+              </w:rPr>
+              <w:t>Electric</w:t>
+            </w:r>
+          </w:p>
+        </w:tc>
+        <w:tc>
+          <w:tcPr>
+            <w:tcW w:type="dxa" w:w="2304"/>
+          </w:tcPr>
+          <w:p>
+            <w:pPr>
+              <w:jc w:val="left"/>
+            </w:pPr>
+            <w:r>
+              <w:rPr>
+                <w:rFonts w:ascii="Calibri" w:hAnsi="Calibri" w:eastAsia="Calibri"/>
+                <w:b w:val="0"/>
+                <w:sz w:val="20"/>
+              </w:rPr>
+              <w:t>Passenger &amp; CV EV</w:t>
+            </w:r>
+          </w:p>
+        </w:tc>
+        <w:tc>
+          <w:tcPr>
+            <w:tcW w:type="dxa" w:w="4896"/>
+          </w:tcPr>
+          <w:p>
+            <w:pPr>
+              <w:jc w:val="left"/>
+            </w:pPr>
+            <w:r>
+              <w:rPr>
+                <w:rFonts w:ascii="Calibri" w:hAnsi="Calibri" w:eastAsia="Calibri"/>
+                <w:b w:val="0"/>
+                <w:sz w:val="20"/>
+              </w:rPr>
+              <w:t>Nexon EV, Tiago EV, Punch EV, Ace EV</w:t>
+            </w:r>
+          </w:p>
+        </w:tc>
+      </w:tr>
+    </w:tbl>
+    <w:p/>
+    <w:tbl>
+      <w:tblPr>
+        <w:tblW w:type="auto" w:w="0"/>
+        <w:jc w:val="center"/>
+        <w:tblLook w:firstColumn="1" w:firstRow="1" w:lastColumn="0" w:lastRow="0" w:noHBand="0" w:noVBand="1" w:val="04A0"/>
+      </w:tblPr>
+      <w:tblGrid>
+        <w:gridCol w:w="4680"/>
+        <w:gridCol w:w="4680"/>
+      </w:tblGrid>
+      <w:tr>
+        <w:tc>
+          <w:tcPr>
+            <w:tcW w:type="dxa" w:w="3600"/>
+            <w:vAlign w:val="center"/>
           </w:tcPr>
           <w:p>
             <w:pPr>
@@ -1832,7 +3072,7 @@
             <w:r>
               <w:drawing>
                 <wp:inline xmlns:a="http://schemas.openxmlformats.org/drawingml/2006/main" xmlns:pic="http://schemas.openxmlformats.org/drawingml/2006/picture">
-                  <wp:extent cx="2194560" cy="700460"/>
+                  <wp:extent cx="2148840" cy="685867"/>
                   <wp:docPr id="8" name="Picture 8"/>
                   <wp:cNvGraphicFramePr>
                     <a:graphicFrameLocks noChangeAspect="1"/>
@@ -1853,7 +3093,7 @@
                         <pic:spPr>
                           <a:xfrm>
                             <a:off x="0" y="0"/>
-                            <a:ext cx="2194560" cy="700460"/>
+                            <a:ext cx="2148840" cy="685867"/>
                           </a:xfrm>
                           <a:prstGeom prst="rect"/>
                         </pic:spPr>
@@ -1867,17 +3107,22 @@
         </w:tc>
         <w:tc>
           <w:tcPr>
-            <w:tcW w:type="dxa" w:w="4680"/>
+            <w:tcW w:type="dxa" w:w="5616"/>
+            <w:vAlign w:val="top"/>
           </w:tcPr>
           <w:p>
+            <w:pPr>
+              <w:jc w:val="both"/>
+            </w:pPr>
             <w:r>
               <w:rPr>
                 <w:rFonts w:ascii="Calibri" w:hAnsi="Calibri" w:eastAsia="Calibri"/>
                 <w:b/>
                 <w:color w:val="1F4E79"/>
-                <w:sz w:val="22"/>
+                <w:sz w:val="24"/>
               </w:rPr>
               <w:t>6.1 Passenger cars and SUVs</w:t>
+              <w:br/>
               <w:br/>
             </w:r>
             <w:r>
@@ -1886,7 +3131,7 @@
                 <w:b w:val="0"/>
                 <w:sz w:val="22"/>
               </w:rPr>
-              <w:t>Designed for personal and family transport. Examples: Tiago, Altroz, Tigor, Punch, Nexon, Harrier, Safari, and Curvv.</w:t>
+              <w:t>Passenger vehicles are designed for personal and family transportation. Tata Motors offers hatchbacks, sedans, and SUVs with emphasis on safety, comfort, and fuel-efficient or electric powertrains. Representative models include Tiago, Altroz, Tigor, Punch, Nexon, Harrier, Safari, and Curvv.</w:t>
             </w:r>
           </w:p>
         </w:tc>
@@ -1896,17 +3141,18 @@
     <w:tbl>
       <w:tblPr>
         <w:tblW w:type="auto" w:w="0"/>
-        <w:tblLayout w:type="fixed"/>
+        <w:jc w:val="center"/>
         <w:tblLook w:firstColumn="1" w:firstRow="1" w:lastColumn="0" w:lastRow="0" w:noHBand="0" w:noVBand="1" w:val="04A0"/>
       </w:tblPr>
       <w:tblGrid>
-        <w:gridCol w:w="3744"/>
-        <w:gridCol w:w="5472"/>
+        <w:gridCol w:w="4680"/>
+        <w:gridCol w:w="4680"/>
       </w:tblGrid>
       <w:tr>
         <w:tc>
           <w:tcPr>
-            <w:tcW w:type="dxa" w:w="4680"/>
+            <w:tcW w:type="dxa" w:w="3600"/>
+            <w:vAlign w:val="center"/>
           </w:tcPr>
           <w:p>
             <w:pPr>
@@ -1915,7 +3161,7 @@
             <w:r>
               <w:drawing>
                 <wp:inline xmlns:a="http://schemas.openxmlformats.org/drawingml/2006/main" xmlns:pic="http://schemas.openxmlformats.org/drawingml/2006/picture">
-                  <wp:extent cx="2194560" cy="628850"/>
+                  <wp:extent cx="2148840" cy="615749"/>
                   <wp:docPr id="9" name="Picture 9"/>
                   <wp:cNvGraphicFramePr>
                     <a:graphicFrameLocks noChangeAspect="1"/>
@@ -1936,7 +3182,7 @@
                         <pic:spPr>
                           <a:xfrm>
                             <a:off x="0" y="0"/>
-                            <a:ext cx="2194560" cy="628850"/>
+                            <a:ext cx="2148840" cy="615749"/>
                           </a:xfrm>
                           <a:prstGeom prst="rect"/>
                         </pic:spPr>
@@ -1950,17 +3196,22 @@
         </w:tc>
         <w:tc>
           <w:tcPr>
-            <w:tcW w:type="dxa" w:w="4680"/>
+            <w:tcW w:type="dxa" w:w="5616"/>
+            <w:vAlign w:val="top"/>
           </w:tcPr>
           <w:p>
+            <w:pPr>
+              <w:jc w:val="both"/>
+            </w:pPr>
             <w:r>
               <w:rPr>
                 <w:rFonts w:ascii="Calibri" w:hAnsi="Calibri" w:eastAsia="Calibri"/>
                 <w:b/>
                 <w:color w:val="1F4E79"/>
-                <w:sz w:val="22"/>
+                <w:sz w:val="24"/>
               </w:rPr>
               <w:t>6.2 Electric vehicles</w:t>
+              <w:br/>
               <w:br/>
             </w:r>
             <w:r>
@@ -1969,7 +3220,7 @@
                 <w:b w:val="0"/>
                 <w:sz w:val="22"/>
               </w:rPr>
-              <w:t>Battery-electric models such as Nexon EV, Tiago EV, Punch EV, and Tigor EV support lower emissions and sustainable mobility.</w:t>
+              <w:t>Electric vehicles use electric motors and rechargeable battery packs. Tata Motors is a leader in India's passenger EV segment with models such as Nexon EV, Tiago EV, Punch EV, and Tigor EV, supported by charging partnerships and evolving battery technology.</w:t>
             </w:r>
           </w:p>
         </w:tc>
@@ -1979,17 +3230,18 @@
     <w:tbl>
       <w:tblPr>
         <w:tblW w:type="auto" w:w="0"/>
-        <w:tblLayout w:type="fixed"/>
+        <w:jc w:val="center"/>
         <w:tblLook w:firstColumn="1" w:firstRow="1" w:lastColumn="0" w:lastRow="0" w:noHBand="0" w:noVBand="1" w:val="04A0"/>
       </w:tblPr>
       <w:tblGrid>
-        <w:gridCol w:w="3744"/>
-        <w:gridCol w:w="5472"/>
+        <w:gridCol w:w="4680"/>
+        <w:gridCol w:w="4680"/>
       </w:tblGrid>
       <w:tr>
         <w:tc>
           <w:tcPr>
-            <w:tcW w:type="dxa" w:w="4680"/>
+            <w:tcW w:type="dxa" w:w="3600"/>
+            <w:vAlign w:val="center"/>
           </w:tcPr>
           <w:p>
             <w:pPr>
@@ -1998,7 +3250,7 @@
             <w:r>
               <w:drawing>
                 <wp:inline xmlns:a="http://schemas.openxmlformats.org/drawingml/2006/main" xmlns:pic="http://schemas.openxmlformats.org/drawingml/2006/picture">
-                  <wp:extent cx="2194560" cy="667777"/>
+                  <wp:extent cx="2148840" cy="653865"/>
                   <wp:docPr id="10" name="Picture 10"/>
                   <wp:cNvGraphicFramePr>
                     <a:graphicFrameLocks noChangeAspect="1"/>
@@ -2019,7 +3271,7 @@
                         <pic:spPr>
                           <a:xfrm>
                             <a:off x="0" y="0"/>
-                            <a:ext cx="2194560" cy="667777"/>
+                            <a:ext cx="2148840" cy="653865"/>
                           </a:xfrm>
                           <a:prstGeom prst="rect"/>
                         </pic:spPr>
@@ -2033,17 +3285,22 @@
         </w:tc>
         <w:tc>
           <w:tcPr>
-            <w:tcW w:type="dxa" w:w="4680"/>
+            <w:tcW w:type="dxa" w:w="5616"/>
+            <w:vAlign w:val="top"/>
           </w:tcPr>
           <w:p>
+            <w:pPr>
+              <w:jc w:val="both"/>
+            </w:pPr>
             <w:r>
               <w:rPr>
                 <w:rFonts w:ascii="Calibri" w:hAnsi="Calibri" w:eastAsia="Calibri"/>
                 <w:b/>
                 <w:color w:val="1F4E79"/>
-                <w:sz w:val="22"/>
+                <w:sz w:val="24"/>
               </w:rPr>
               <w:t>6.3 Commercial trucks</w:t>
+              <w:br/>
               <w:br/>
             </w:r>
             <w:r>
@@ -2052,7 +3309,7 @@
                 <w:b w:val="0"/>
                 <w:sz w:val="22"/>
               </w:rPr>
-              <w:t>Used for goods movement across industries. Examples include Prima, Signa, Ultra, and Intra families.</w:t>
+              <w:t>Trucks support industrial, agricultural, and logistics transport. Tata Motors manufactures light, medium, and heavy commercial vehicles including Ace, Intra, Ultra, Signa, and Prima families for varied payload and distance requirements.</w:t>
             </w:r>
           </w:p>
         </w:tc>
@@ -2062,17 +3319,18 @@
     <w:tbl>
       <w:tblPr>
         <w:tblW w:type="auto" w:w="0"/>
-        <w:tblLayout w:type="fixed"/>
+        <w:jc w:val="center"/>
         <w:tblLook w:firstColumn="1" w:firstRow="1" w:lastColumn="0" w:lastRow="0" w:noHBand="0" w:noVBand="1" w:val="04A0"/>
       </w:tblPr>
       <w:tblGrid>
-        <w:gridCol w:w="3744"/>
-        <w:gridCol w:w="5472"/>
+        <w:gridCol w:w="4680"/>
+        <w:gridCol w:w="4680"/>
       </w:tblGrid>
       <w:tr>
         <w:tc>
           <w:tcPr>
-            <w:tcW w:type="dxa" w:w="4680"/>
+            <w:tcW w:type="dxa" w:w="3600"/>
+            <w:vAlign w:val="center"/>
           </w:tcPr>
           <w:p>
             <w:pPr>
@@ -2081,7 +3339,7 @@
             <w:r>
               <w:drawing>
                 <wp:inline xmlns:a="http://schemas.openxmlformats.org/drawingml/2006/main" xmlns:pic="http://schemas.openxmlformats.org/drawingml/2006/picture">
-                  <wp:extent cx="2194560" cy="673823"/>
+                  <wp:extent cx="2148840" cy="659785"/>
                   <wp:docPr id="11" name="Picture 11"/>
                   <wp:cNvGraphicFramePr>
                     <a:graphicFrameLocks noChangeAspect="1"/>
@@ -2102,7 +3360,7 @@
                         <pic:spPr>
                           <a:xfrm>
                             <a:off x="0" y="0"/>
-                            <a:ext cx="2194560" cy="673823"/>
+                            <a:ext cx="2148840" cy="659785"/>
                           </a:xfrm>
                           <a:prstGeom prst="rect"/>
                         </pic:spPr>
@@ -2116,17 +3374,22 @@
         </w:tc>
         <w:tc>
           <w:tcPr>
-            <w:tcW w:type="dxa" w:w="4680"/>
+            <w:tcW w:type="dxa" w:w="5616"/>
+            <w:vAlign w:val="top"/>
           </w:tcPr>
           <w:p>
+            <w:pPr>
+              <w:jc w:val="both"/>
+            </w:pPr>
             <w:r>
               <w:rPr>
                 <w:rFonts w:ascii="Calibri" w:hAnsi="Calibri" w:eastAsia="Calibri"/>
                 <w:b/>
                 <w:color w:val="1F4E79"/>
-                <w:sz w:val="22"/>
+                <w:sz w:val="24"/>
               </w:rPr>
-              <w:t>6.4 Buses and passenger transport</w:t>
+              <w:t>6.4 Buses and passenger transport vehicles</w:t>
+              <w:br/>
               <w:br/>
             </w:r>
             <w:r>
@@ -2135,7 +3398,7 @@
                 <w:b w:val="0"/>
                 <w:sz w:val="22"/>
               </w:rPr>
-              <w:t>Buses for city, school, staff, and intercity transport, including electric bus solutions.</w:t>
+              <w:t>Buses are used for city service, school transport, staff carriers, and intercity travel. Tata Motors supplies conventional and electric bus solutions for public transport operators and smart-city mobility programmes.</w:t>
             </w:r>
           </w:p>
         </w:tc>
@@ -2144,7 +3407,8 @@
     <w:p/>
     <w:p>
       <w:pPr>
-        <w:spacing w:before="200" w:after="120"/>
+        <w:keepNext/>
+        <w:spacing w:before="160" w:after="120"/>
       </w:pPr>
       <w:r>
         <w:rPr>
@@ -2153,12 +3417,13 @@
           <w:color w:val="003366"/>
           <w:sz w:val="26"/>
         </w:rPr>
-        <w:t>6.5 Relevance for ECE internship</w:t>
+        <w:t>6.5 Research, Development and Electronics (ECE relevance)</w:t>
       </w:r>
     </w:p>
     <w:p>
       <w:pPr>
-        <w:spacing w:line="288" w:lineRule="auto" w:after="160"/>
+        <w:spacing w:line="276" w:lineRule="auto" w:after="160"/>
+        <w:jc w:val="both"/>
       </w:pPr>
       <w:r>
         <w:rPr>
@@ -2166,12 +3431,75 @@
           <w:b w:val="0"/>
           <w:sz w:val="22"/>
         </w:rPr>
-        <w:t>Electronics and Communication Engineering students may learn about wiring harnesses, ECU diagnostics, earthing and safety checks, BMS basics on EV lines, PLC automation, and end-of-line electrical testing during authorised plant training (e.g., Pune, Sanand, Jamshedpur).</w:t>
+        <w:t>Modern automobiles are complex electro-mechanical systems. Electronics and Communication Engineering plays an important role in automotive R&amp;D and production quality at Tata Motors.</w:t>
       </w:r>
     </w:p>
     <w:p>
       <w:pPr>
-        <w:spacing w:before="200" w:after="120"/>
+        <w:spacing w:line="276" w:lineRule="auto" w:after="160"/>
+        <w:jc w:val="both"/>
+      </w:pPr>
+      <w:r>
+        <w:rPr>
+          <w:rFonts w:ascii="Calibri" w:hAnsi="Calibri" w:eastAsia="Calibri"/>
+          <w:b w:val="0"/>
+          <w:sz w:val="22"/>
+        </w:rPr>
+        <w:t>Key domains include engine control units (ECU), body control modules, infotainment and telematics, ADAS sensors, battery management systems (BMS) in EVs, wiring harnesses, in-vehicle networks (CAN, LIN, Ethernet in newer architectures), and over-the-air software updates.</w:t>
+      </w:r>
+    </w:p>
+    <w:p>
+      <w:pPr>
+        <w:spacing w:line="276" w:lineRule="auto" w:after="160"/>
+        <w:jc w:val="both"/>
+      </w:pPr>
+      <w:r>
+        <w:rPr>
+          <w:rFonts w:ascii="Calibri" w:hAnsi="Calibri" w:eastAsia="Calibri"/>
+          <w:b w:val="0"/>
+          <w:sz w:val="22"/>
+        </w:rPr>
+        <w:t>During authorised plant visits or internships, diploma students may observe trim-and-chassis processes, harness routing, earthing safety checks, ECU flashing, heating-element quality, connector inspection, PLC-based automation, robotic welding cells, and end-of-line electrical testing—especially at passenger vehicle plants such as Pune and manufacturing locations such as Sanand and Jamshedpur.</w:t>
+      </w:r>
+    </w:p>
+    <w:p>
+      <w:pPr>
+        <w:keepNext/>
+        <w:spacing w:before="160" w:after="120"/>
+      </w:pPr>
+      <w:r>
+        <w:rPr>
+          <w:rFonts w:ascii="Calibri" w:hAnsi="Calibri" w:eastAsia="Calibri"/>
+          <w:b/>
+          <w:color w:val="003366"/>
+          <w:sz w:val="26"/>
+        </w:rPr>
+        <w:t>6.6 Manufacturing plants in India</w:t>
+      </w:r>
+    </w:p>
+    <w:p>
+      <w:pPr>
+        <w:spacing w:line="276" w:lineRule="auto" w:after="160"/>
+        <w:jc w:val="both"/>
+      </w:pPr>
+      <w:r>
+        <w:rPr>
+          <w:rFonts w:ascii="Calibri" w:hAnsi="Calibri" w:eastAsia="Calibri"/>
+          <w:b w:val="0"/>
+          <w:sz w:val="22"/>
+        </w:rPr>
+        <w:t>Tata Motors operates major manufacturing and assembly facilities in India including Pune (passenger vehicles), Jamshedpur and Lucknow (commercial vehicles), Sanand (passenger and EV-related capacity), and Dharwad. Typical plant flow includes stamping, body shop, paint shop, engine or powertrain assembly (where applicable), final assembly, and quality gates before dispatch.</w:t>
+      </w:r>
+    </w:p>
+    <w:p>
+      <w:r>
+        <w:br w:type="page"/>
+      </w:r>
+    </w:p>
+    <w:p>
+      <w:pPr>
+        <w:keepNext w:val="0"/>
+        <w:spacing w:before="240" w:after="120"/>
       </w:pPr>
       <w:r>
         <w:rPr>
@@ -2185,12 +3513,27 @@
     </w:p>
     <w:p>
       <w:pPr>
+        <w:spacing w:line="276" w:lineRule="auto" w:after="160"/>
+        <w:jc w:val="both"/>
+      </w:pPr>
+      <w:r>
+        <w:rPr>
+          <w:rFonts w:ascii="Calibri" w:hAnsi="Calibri" w:eastAsia="Calibri"/>
+          <w:b w:val="0"/>
+          <w:sz w:val="22"/>
+        </w:rPr>
+        <w:t>Tata Motors operates in an industry affected by intense competition, changing customer preferences, raw material costs, supply chain risks, technology transitions, and environmental regulations. New technologies create opportunities but require investment in engineering, testing, production equipment, and workforce skills.</w:t>
+      </w:r>
+    </w:p>
+    <w:p>
+      <w:pPr>
+        <w:spacing w:before="120" w:after="120"/>
         <w:jc w:val="center"/>
       </w:pPr>
       <w:r>
         <w:drawing>
           <wp:inline xmlns:a="http://schemas.openxmlformats.org/drawingml/2006/main" xmlns:pic="http://schemas.openxmlformats.org/drawingml/2006/picture">
-            <wp:extent cx="5029200" cy="1436914"/>
+            <wp:extent cx="4937760" cy="1410788"/>
             <wp:docPr id="12" name="Picture 12"/>
             <wp:cNvGraphicFramePr>
               <a:graphicFrameLocks noChangeAspect="1"/>
@@ -2211,7 +3554,7 @@
                   <pic:spPr>
                     <a:xfrm>
                       <a:off x="0" y="0"/>
-                      <a:ext cx="5029200" cy="1436914"/>
+                      <a:ext cx="4937760" cy="1410788"/>
                     </a:xfrm>
                     <a:prstGeom prst="rect"/>
                   </pic:spPr>
@@ -2224,7 +3567,22 @@
     </w:p>
     <w:p>
       <w:pPr>
+        <w:jc w:val="center"/>
+      </w:pPr>
+      <w:r>
+        <w:rPr>
+          <w:rFonts w:ascii="Calibri" w:hAnsi="Calibri" w:eastAsia="Calibri"/>
+          <w:b w:val="0"/>
+          <w:color w:val="5A5A5A"/>
+          <w:sz w:val="18"/>
+        </w:rPr>
+        <w:t>Figure 3: Future mobility and innovation</w:t>
+      </w:r>
+    </w:p>
+    <w:p>
+      <w:pPr>
         <w:pStyle w:val="ListBullet"/>
+        <w:jc w:val="both"/>
       </w:pPr>
       <w:r>
         <w:rPr>
@@ -2232,12 +3590,13 @@
           <w:b w:val="0"/>
           <w:sz w:val="22"/>
         </w:rPr>
-        <w:t>Competition and pricing: balance features, affordability, and profitability.</w:t>
+        <w:t>Competition and pricing: Manufacturers must balance product features, affordability, quality, and profitability.</w:t>
       </w:r>
     </w:p>
     <w:p>
       <w:pPr>
         <w:pStyle w:val="ListBullet"/>
+        <w:jc w:val="both"/>
       </w:pPr>
       <w:r>
         <w:rPr>
@@ -2245,12 +3604,13 @@
           <w:b w:val="0"/>
           <w:sz w:val="22"/>
         </w:rPr>
-        <w:t>Supply chain resilience: semiconductors, batteries, and critical components.</w:t>
+        <w:t>Supply chain resilience: Component shortages or delayed deliveries can interrupt production.</w:t>
       </w:r>
     </w:p>
     <w:p>
       <w:pPr>
         <w:pStyle w:val="ListBullet"/>
+        <w:jc w:val="both"/>
       </w:pPr>
       <w:r>
         <w:rPr>
@@ -2258,12 +3618,13 @@
           <w:b w:val="0"/>
           <w:sz w:val="22"/>
         </w:rPr>
-        <w:t>Quality and reliability: reduce defects, rework, and warranty costs.</w:t>
+        <w:t>Quality and reliability: Defects can increase rework, warranty costs, and customer dissatisfaction.</w:t>
       </w:r>
     </w:p>
     <w:p>
       <w:pPr>
         <w:pStyle w:val="ListBullet"/>
+        <w:jc w:val="both"/>
       </w:pPr>
       <w:r>
         <w:rPr>
@@ -2271,12 +3632,13 @@
           <w:b w:val="0"/>
           <w:sz w:val="22"/>
         </w:rPr>
-        <w:t>Electrification: charging infrastructure, battery cost, and customer confidence.</w:t>
+        <w:t>Electrification: Battery cost, charging infrastructure, range, resale value, and customer confidence influence EV adoption.</w:t>
       </w:r>
     </w:p>
     <w:p>
       <w:pPr>
         <w:pStyle w:val="ListBullet"/>
+        <w:jc w:val="both"/>
       </w:pPr>
       <w:r>
         <w:rPr>
@@ -2284,12 +3646,13 @@
           <w:b w:val="0"/>
           <w:sz w:val="22"/>
         </w:rPr>
-        <w:t>Sustainability and compliance: safety and emission regulations.</w:t>
+        <w:t>Sustainability and compliance: Manufacturers must respond to changing safety, emission, and environmental requirements.</w:t>
       </w:r>
     </w:p>
     <w:p>
       <w:pPr>
         <w:pStyle w:val="ListBullet"/>
+        <w:jc w:val="both"/>
       </w:pPr>
       <w:r>
         <w:rPr>
@@ -2297,12 +3660,13 @@
           <w:b w:val="0"/>
           <w:sz w:val="22"/>
         </w:rPr>
-        <w:t>Opportunities: R&amp;D, digitalisation, energy efficiency, and battery recycling.</w:t>
+        <w:t>Future opportunities: Further R&amp;D, process digitalisation, improved energy efficiency, battery recycling, and data-driven quality improvement.</w:t>
       </w:r>
     </w:p>
     <w:p>
       <w:pPr>
-        <w:spacing w:before="200" w:after="120"/>
+        <w:keepNext w:val="0"/>
+        <w:spacing w:before="240" w:after="120"/>
       </w:pPr>
       <w:r>
         <w:rPr>
@@ -2316,7 +3680,8 @@
     </w:p>
     <w:p>
       <w:pPr>
-        <w:spacing w:line="288" w:lineRule="auto" w:after="160"/>
+        <w:spacing w:line="276" w:lineRule="auto" w:after="160"/>
+        <w:jc w:val="both"/>
       </w:pPr>
       <w:r>
         <w:rPr>
@@ -2324,12 +3689,13 @@
           <w:b w:val="0"/>
           <w:sz w:val="22"/>
         </w:rPr>
-        <w:t>Descriptive, document-based research using Tata Motors annual reports, investor presentations, official website, and automotive industry publications.</w:t>
+        <w:t>This report uses a descriptive, document-based research approach. It organises publicly available company information and general automotive manufacturing knowledge to understand Tata Motors' development, products, R&amp;D areas, manufacturing methodologies, and challenges.</w:t>
       </w:r>
     </w:p>
     <w:p>
       <w:pPr>
         <w:pStyle w:val="ListBullet"/>
+        <w:jc w:val="both"/>
       </w:pPr>
       <w:r>
         <w:rPr>
@@ -2337,12 +3703,13 @@
           <w:b w:val="0"/>
           <w:sz w:val="22"/>
         </w:rPr>
-        <w:t>Secondary data: company reports, catalogues, government publications.</w:t>
+        <w:t>Secondary data: Official company information, annual reports, investor materials, product catalogues, government publications, and reputable automotive industry sources.</w:t>
       </w:r>
     </w:p>
     <w:p>
       <w:pPr>
         <w:pStyle w:val="ListBullet"/>
+        <w:jc w:val="both"/>
       </w:pPr>
       <w:r>
         <w:rPr>
@@ -2350,12 +3717,13 @@
           <w:b w:val="0"/>
           <w:sz w:val="22"/>
         </w:rPr>
-        <w:t>Primary data (if performed): authorised plant visit and supervised discussions.</w:t>
+        <w:t>Primary data (if collected): Direct observation, authorised employee interviews, permitted document review, or discussions during an industrial visit.</w:t>
       </w:r>
     </w:p>
     <w:p>
       <w:pPr>
         <w:pStyle w:val="ListBullet"/>
+        <w:jc w:val="both"/>
       </w:pPr>
       <w:r>
         <w:rPr>
@@ -2363,12 +3731,13 @@
           <w:b w:val="0"/>
           <w:sz w:val="22"/>
         </w:rPr>
-        <w:t>Analysis: historical, descriptive, and thematic grouping.</w:t>
+        <w:t>Data analysis: Historical analysis for company development; descriptive analysis for products and processes; thematic analysis for quality, manufacturing, sustainability, and challenges.</w:t>
       </w:r>
     </w:p>
     <w:p>
       <w:pPr>
         <w:pStyle w:val="ListBullet"/>
+        <w:jc w:val="both"/>
       </w:pPr>
       <w:r>
         <w:rPr>
@@ -2376,12 +3745,27 @@
           <w:b w:val="0"/>
           <w:sz w:val="22"/>
         </w:rPr>
-        <w:t>Limitations: confidential plant data is not publicly available.</w:t>
+        <w:t>Verification: Compare information across sources; record publication dates and financial year for quantitative claims.</w:t>
       </w:r>
     </w:p>
     <w:p>
       <w:pPr>
-        <w:spacing w:before="200" w:after="120"/>
+        <w:pStyle w:val="ListBullet"/>
+        <w:jc w:val="both"/>
+      </w:pPr>
+      <w:r>
+        <w:rPr>
+          <w:rFonts w:ascii="Calibri" w:hAnsi="Calibri" w:eastAsia="Calibri"/>
+          <w:b w:val="0"/>
+          <w:sz w:val="22"/>
+        </w:rPr>
+        <w:t>Limitations: Public sources may not disclose confidential plant procedures, detailed production data, or team-level R&amp;D work.</w:t>
+      </w:r>
+    </w:p>
+    <w:p>
+      <w:pPr>
+        <w:keepNext w:val="0"/>
+        <w:spacing w:before="240" w:after="120"/>
       </w:pPr>
       <w:r>
         <w:rPr>
@@ -2395,7 +3779,8 @@
     </w:p>
     <w:p>
       <w:pPr>
-        <w:spacing w:line="288" w:lineRule="auto" w:after="160"/>
+        <w:spacing w:line="276" w:lineRule="auto" w:after="160"/>
+        <w:jc w:val="both"/>
       </w:pPr>
       <w:r>
         <w:rPr>
@@ -2403,12 +3788,27 @@
           <w:b w:val="0"/>
           <w:sz w:val="22"/>
         </w:rPr>
-        <w:t>Tata Motors is a leading Indian automotive company with strong commercial and passenger portfolios, growing electric mobility, and global presence through JLR. Its manufacturing systems and electronics integration make it a valuable organisation for diploma internship and industrial learning.</w:t>
+        <w:t>Tata Motors has grown from a locomotive and engineering company into a diversified automotive group with leadership in Indian commercial vehicles, a strong passenger vehicle portfolio, market-leading electric mobility initiatives, and a global premium business through Jaguar Land Rover.</w:t>
       </w:r>
     </w:p>
     <w:p>
       <w:pPr>
-        <w:spacing w:before="200" w:after="120"/>
+        <w:spacing w:line="276" w:lineRule="auto" w:after="160"/>
+        <w:jc w:val="both"/>
+      </w:pPr>
+      <w:r>
+        <w:rPr>
+          <w:rFonts w:ascii="Calibri" w:hAnsi="Calibri" w:eastAsia="Calibri"/>
+          <w:b w:val="0"/>
+          <w:sz w:val="22"/>
+        </w:rPr>
+        <w:t>Its manufacturing philosophy combines lean production, quality systems, automation, supply chain coordination, and increasing digitalisation. For diploma students—especially in Electronics and Communication Engineering—studying Tata Motors provides practical insight into large-scale manufacturing, vehicle electronics integration, safety culture, and sustainable mobility aligned with national industrial growth.</w:t>
+      </w:r>
+    </w:p>
+    <w:p>
+      <w:pPr>
+        <w:keepNext w:val="0"/>
+        <w:spacing w:before="240" w:after="120"/>
       </w:pPr>
       <w:r>
         <w:rPr>
@@ -2421,55 +3821,53 @@
       </w:r>
     </w:p>
     <w:p>
-      <w:pPr>
-        <w:pStyle w:val="ListBullet"/>
-      </w:pPr>
       <w:r>
         <w:rPr>
           <w:rFonts w:ascii="Calibri" w:hAnsi="Calibri" w:eastAsia="Calibri"/>
           <w:b w:val="0"/>
-          <w:sz w:val="22"/>
+          <w:sz w:val="20"/>
         </w:rPr>
-        <w:t>Tata Motors Integrated Annual Report 2024–25.</w:t>
+        <w:t>[1] Tata Motors Limited, Integrated Annual Report 2024–25.</w:t>
       </w:r>
     </w:p>
     <w:p>
-      <w:pPr>
-        <w:pStyle w:val="ListBullet"/>
-      </w:pPr>
       <w:r>
         <w:rPr>
           <w:rFonts w:ascii="Calibri" w:hAnsi="Calibri" w:eastAsia="Calibri"/>
           <w:b w:val="0"/>
-          <w:sz w:val="22"/>
+          <w:sz w:val="20"/>
         </w:rPr>
-        <w:t>Tata Motors investor presentations and press releases (FY25).</w:t>
+        <w:t>[2] Tata Motors Limited, Q4 FY25 Investor Presentation and press releases.</w:t>
       </w:r>
     </w:p>
     <w:p>
-      <w:pPr>
-        <w:pStyle w:val="ListBullet"/>
-      </w:pPr>
       <w:r>
         <w:rPr>
           <w:rFonts w:ascii="Calibri" w:hAnsi="Calibri" w:eastAsia="Calibri"/>
           <w:b w:val="0"/>
-          <w:sz w:val="22"/>
+          <w:sz w:val="20"/>
         </w:rPr>
-        <w:t>https://www.tatamotors.com</w:t>
+        <w:t>[3] Tata Motors Limited, Corporate website — www.tatamotors.com</w:t>
       </w:r>
     </w:p>
     <w:p>
-      <w:pPr>
-        <w:pStyle w:val="ListBullet"/>
-      </w:pPr>
       <w:r>
         <w:rPr>
           <w:rFonts w:ascii="Calibri" w:hAnsi="Calibri" w:eastAsia="Calibri"/>
           <w:b w:val="0"/>
-          <w:sz w:val="22"/>
+          <w:sz w:val="20"/>
         </w:rPr>
-        <w:t>https://joinus.tatamotors.com/student-programmes/</w:t>
+        <w:t>[4] Tata Motors Careers, Student Programmes — joinus.tatamotors.com</w:t>
+      </w:r>
+    </w:p>
+    <w:p>
+      <w:r>
+        <w:rPr>
+          <w:rFonts w:ascii="Calibri" w:hAnsi="Calibri" w:eastAsia="Calibri"/>
+          <w:b w:val="0"/>
+          <w:sz w:val="20"/>
+        </w:rPr>
+        <w:t>[5] Government of India automotive sector publications (industry context).</w:t>
       </w:r>
     </w:p>
     <w:sectPr>

</xml_diff>

<commit_message>
Generate PDF from Word via LibreOffice for identical layout
- Remove separate FPDF builder; export DOCX to PDF directly
- Ensures PDF matches Word content, images, and alignment

Co-authored-by: Sumit Kaktwan <Sumit211995@users.noreply.github.com>
</commit_message>
<xml_diff>
--- a/tata-motors-project/output/TATA_Motors_Diploma_Project.docx
+++ b/tata-motors-project/output/TATA_Motors_Diploma_Project.docx
@@ -487,7 +487,7 @@
           <w:b w:val="0"/>
           <w:sz w:val="22"/>
         </w:rPr>
-        <w:t>3. Company Overview</w:t>
+        <w:t>3. Company Overview (segments, achievements, R&amp;D, sustainability)</w:t>
       </w:r>
     </w:p>
     <w:p>
@@ -609,6 +609,74 @@
       </w:r>
     </w:p>
     <w:p>
+      <w:pPr>
+        <w:spacing w:line="276" w:lineRule="auto" w:after="160"/>
+        <w:jc w:val="both"/>
+      </w:pPr>
+      <w:r>
+        <w:rPr>
+          <w:rFonts w:ascii="Calibri" w:hAnsi="Calibri" w:eastAsia="Calibri"/>
+          <w:b w:val="0"/>
+          <w:sz w:val="22"/>
+        </w:rPr>
+        <w:t>India's passenger vehicle industry crossed record volumes in FY25, with SUVs accounting for a large share of customer demand. Tata Motors responded with a refreshed portfolio, higher safety positioning, and growth in CNG and electric powertrains. On the commercial side, the company continued to focus on fleet uptime, total cost of ownership, and digital services for logistics customers. This combination of scale, engineering depth, and brand trust makes Tata Motors a significant case study for diploma-level industrial research.</w:t>
+      </w:r>
+    </w:p>
+    <w:p>
+      <w:pPr>
+        <w:spacing w:before="120" w:after="120"/>
+        <w:jc w:val="center"/>
+      </w:pPr>
+      <w:r>
+        <w:drawing>
+          <wp:inline xmlns:a="http://schemas.openxmlformats.org/drawingml/2006/main" xmlns:pic="http://schemas.openxmlformats.org/drawingml/2006/picture">
+            <wp:extent cx="4937760" cy="2125112"/>
+            <wp:docPr id="2" name="Picture 2"/>
+            <wp:cNvGraphicFramePr>
+              <a:graphicFrameLocks noChangeAspect="1"/>
+            </wp:cNvGraphicFramePr>
+            <a:graphic>
+              <a:graphicData uri="http://schemas.openxmlformats.org/drawingml/2006/picture">
+                <pic:pic>
+                  <pic:nvPicPr>
+                    <pic:cNvPr id="0" name="market_highlights.png"/>
+                    <pic:cNvPicPr/>
+                  </pic:nvPicPr>
+                  <pic:blipFill>
+                    <a:blip r:embed="rId10"/>
+                    <a:stretch>
+                      <a:fillRect/>
+                    </a:stretch>
+                  </pic:blipFill>
+                  <pic:spPr>
+                    <a:xfrm>
+                      <a:off x="0" y="0"/>
+                      <a:ext cx="4937760" cy="2125112"/>
+                    </a:xfrm>
+                    <a:prstGeom prst="rect"/>
+                  </pic:spPr>
+                </pic:pic>
+              </a:graphicData>
+            </a:graphic>
+          </wp:inline>
+        </w:drawing>
+      </w:r>
+    </w:p>
+    <w:p>
+      <w:pPr>
+        <w:jc w:val="center"/>
+      </w:pPr>
+      <w:r>
+        <w:rPr>
+          <w:rFonts w:ascii="Calibri" w:hAnsi="Calibri" w:eastAsia="Calibri"/>
+          <w:b w:val="0"/>
+          <w:color w:val="5A5A5A"/>
+          <w:sz w:val="18"/>
+        </w:rPr>
+        <w:t>Figure ES-1: Market position highlights (FY25 public messaging)</w:t>
+      </w:r>
+    </w:p>
+    <w:p>
       <w:r>
         <w:br w:type="page"/>
       </w:r>
@@ -672,6 +740,20 @@
     </w:p>
     <w:p>
       <w:pPr>
+        <w:spacing w:line="276" w:lineRule="auto" w:after="160"/>
+        <w:jc w:val="both"/>
+      </w:pPr>
+      <w:r>
+        <w:rPr>
+          <w:rFonts w:ascii="Calibri" w:hAnsi="Calibri" w:eastAsia="Calibri"/>
+          <w:b w:val="0"/>
+          <w:sz w:val="22"/>
+        </w:rPr>
+        <w:t>The Indian automotive sector is linked to steel, plastics, electronics, tyres, and logistics industries. Policy emphasis on emission norms (BS VI), vehicle safety, and electric mobility has accelerated product development cycles. Tata Motors has adapted through platform strategies (such as multi-powertrain architectures), localised supply chains, and investment in vehicle electronics—areas directly relevant to Electronics and Communication Engineering students seeking industrial exposure.</w:t>
+      </w:r>
+    </w:p>
+    <w:p>
+      <w:pPr>
         <w:keepNext w:val="0"/>
         <w:spacing w:before="240" w:after="120"/>
       </w:pPr>
@@ -729,6 +811,20 @@
     </w:p>
     <w:p>
       <w:pPr>
+        <w:spacing w:line="276" w:lineRule="auto" w:after="160"/>
+        <w:jc w:val="both"/>
+      </w:pPr>
+      <w:r>
+        <w:rPr>
+          <w:rFonts w:ascii="Calibri" w:hAnsi="Calibri" w:eastAsia="Calibri"/>
+          <w:b w:val="0"/>
+          <w:sz w:val="22"/>
+        </w:rPr>
+        <w:t>The Tata Group, founded in 1868, operates across multiple sectors including steel, IT, hospitality, and aviation. Tata Motors benefits from group-level values emphasising ethics, community impact, and long-term nation building. The company's passenger and commercial businesses support millions of customers—from rural last-mile entrepreneurs using Ace mini-trucks to urban families choosing SUVs with higher safety ratings. After-sales service networks and spare-parts availability are important parts of the business model, especially for commercial fleet operators.</w:t>
+      </w:r>
+    </w:p>
+    <w:p>
+      <w:pPr>
         <w:spacing w:before="120" w:after="120"/>
         <w:jc w:val="center"/>
       </w:pPr>
@@ -736,7 +832,7 @@
         <w:drawing>
           <wp:inline xmlns:a="http://schemas.openxmlformats.org/drawingml/2006/main" xmlns:pic="http://schemas.openxmlformats.org/drawingml/2006/picture">
             <wp:extent cx="5120640" cy="2862342"/>
-            <wp:docPr id="2" name="Picture 2"/>
+            <wp:docPr id="3" name="Picture 3"/>
             <wp:cNvGraphicFramePr>
               <a:graphicFrameLocks noChangeAspect="1"/>
             </wp:cNvGraphicFramePr>
@@ -748,7 +844,7 @@
                     <pic:cNvPicPr/>
                   </pic:nvPicPr>
                   <pic:blipFill>
-                    <a:blip r:embed="rId10"/>
+                    <a:blip r:embed="rId11"/>
                     <a:stretch>
                       <a:fillRect/>
                     </a:stretch>
@@ -826,6 +922,20 @@
     </w:p>
     <w:p>
       <w:pPr>
+        <w:spacing w:line="276" w:lineRule="auto" w:after="160"/>
+        <w:jc w:val="both"/>
+      </w:pPr>
+      <w:r>
+        <w:rPr>
+          <w:rFonts w:ascii="Calibri" w:hAnsi="Calibri" w:eastAsia="Calibri"/>
+          <w:b w:val="0"/>
+          <w:sz w:val="22"/>
+        </w:rPr>
+        <w:t>Tata Motors competes with domestic and global OEMs in India. Success depends on product freshness, financing options, dealer experience, and perceived reliability. The company has invested in design studios, crash-test capability, connected-car features, and EV charging partnerships. Public investor materials describe Tata CV as a profit-leading commercial business in many periods, Tata PV as a top-three passenger OEM, and Tata EV as the leading passenger electric brand in India by volume in several reporting quarters.</w:t>
+      </w:r>
+    </w:p>
+    <w:p>
+      <w:pPr>
         <w:spacing w:before="120" w:after="120"/>
         <w:jc w:val="center"/>
       </w:pPr>
@@ -833,7 +943,7 @@
         <w:drawing>
           <wp:inline xmlns:a="http://schemas.openxmlformats.org/drawingml/2006/main" xmlns:pic="http://schemas.openxmlformats.org/drawingml/2006/picture">
             <wp:extent cx="5303520" cy="2725744"/>
-            <wp:docPr id="3" name="Picture 3"/>
+            <wp:docPr id="4" name="Picture 4"/>
             <wp:cNvGraphicFramePr>
               <a:graphicFrameLocks noChangeAspect="1"/>
             </wp:cNvGraphicFramePr>
@@ -845,7 +955,7 @@
                     <pic:cNvPicPr/>
                   </pic:nvPicPr>
                   <pic:blipFill>
-                    <a:blip r:embed="rId11"/>
+                    <a:blip r:embed="rId12"/>
                     <a:stretch>
                       <a:fillRect/>
                     </a:stretch>
@@ -880,6 +990,60 @@
     </w:p>
     <w:p>
       <w:pPr>
+        <w:spacing w:before="120" w:after="120"/>
+        <w:jc w:val="center"/>
+      </w:pPr>
+      <w:r>
+        <w:drawing>
+          <wp:inline xmlns:a="http://schemas.openxmlformats.org/drawingml/2006/main" xmlns:pic="http://schemas.openxmlformats.org/drawingml/2006/picture">
+            <wp:extent cx="4937760" cy="2733477"/>
+            <wp:docPr id="5" name="Picture 5"/>
+            <wp:cNvGraphicFramePr>
+              <a:graphicFrameLocks noChangeAspect="1"/>
+            </wp:cNvGraphicFramePr>
+            <a:graphic>
+              <a:graphicData uri="http://schemas.openxmlformats.org/drawingml/2006/picture">
+                <pic:pic>
+                  <pic:nvPicPr>
+                    <pic:cNvPr id="0" name="business_segments.png"/>
+                    <pic:cNvPicPr/>
+                  </pic:nvPicPr>
+                  <pic:blipFill>
+                    <a:blip r:embed="rId13"/>
+                    <a:stretch>
+                      <a:fillRect/>
+                    </a:stretch>
+                  </pic:blipFill>
+                  <pic:spPr>
+                    <a:xfrm>
+                      <a:off x="0" y="0"/>
+                      <a:ext cx="4937760" cy="2733477"/>
+                    </a:xfrm>
+                    <a:prstGeom prst="rect"/>
+                  </pic:spPr>
+                </pic:pic>
+              </a:graphicData>
+            </a:graphic>
+          </wp:inline>
+        </w:drawing>
+      </w:r>
+    </w:p>
+    <w:p>
+      <w:pPr>
+        <w:jc w:val="center"/>
+      </w:pPr>
+      <w:r>
+        <w:rPr>
+          <w:rFonts w:ascii="Calibri" w:hAnsi="Calibri" w:eastAsia="Calibri"/>
+          <w:b w:val="0"/>
+          <w:color w:val="5A5A5A"/>
+          <w:sz w:val="18"/>
+        </w:rPr>
+        <w:t>Figure 3: Major business segments (illustrative)</w:t>
+      </w:r>
+    </w:p>
+    <w:p>
+      <w:pPr>
         <w:keepNext/>
         <w:spacing w:before="160" w:after="120"/>
       </w:pPr>
@@ -895,6 +1059,20 @@
     </w:p>
     <w:p>
       <w:pPr>
+        <w:spacing w:line="276" w:lineRule="auto" w:after="160"/>
+        <w:jc w:val="both"/>
+      </w:pPr>
+      <w:r>
+        <w:rPr>
+          <w:rFonts w:ascii="Calibri" w:hAnsi="Calibri" w:eastAsia="Calibri"/>
+          <w:b w:val="0"/>
+          <w:sz w:val="22"/>
+        </w:rPr>
+        <w:t>Tata Commercial Vehicles serves construction, mining, e-commerce logistics, agriculture, and long-haul freight. Product lines span small commercial vehicles (SCV) for intra-city delivery, light and medium trucks for regional distribution, and heavy trucks for bulk cargo. Buses connect towns, factories, and schools. Service networks and financing partnerships influence fleet purchase decisions as much as upfront vehicle price.</w:t>
+      </w:r>
+    </w:p>
+    <w:p>
+      <w:pPr>
         <w:pStyle w:val="ListBullet"/>
         <w:jc w:val="both"/>
       </w:pPr>
@@ -980,6 +1158,20 @@
     </w:p>
     <w:p>
       <w:pPr>
+        <w:spacing w:line="276" w:lineRule="auto" w:after="160"/>
+        <w:jc w:val="both"/>
+      </w:pPr>
+      <w:r>
+        <w:rPr>
+          <w:rFonts w:ascii="Calibri" w:hAnsi="Calibri" w:eastAsia="Calibri"/>
+          <w:b w:val="0"/>
+          <w:sz w:val="22"/>
+        </w:rPr>
+        <w:t>Tata Passenger Vehicles targets first-time buyers, young families, and SUV-oriented customers. The portfolio uses shared platforms to improve development speed while offering distinct designs. Safety marketing (including independent crash-test results on selected models) has become a differentiator. Retail experience, digital configurators, and test-drive programmes support conversion in competitive metro and tier-2 markets.</w:t>
+      </w:r>
+    </w:p>
+    <w:p>
+      <w:pPr>
         <w:pStyle w:val="ListBullet"/>
         <w:jc w:val="both"/>
       </w:pPr>
@@ -1051,6 +1243,20 @@
     </w:p>
     <w:p>
       <w:pPr>
+        <w:spacing w:line="276" w:lineRule="auto" w:after="160"/>
+        <w:jc w:val="both"/>
+      </w:pPr>
+      <w:r>
+        <w:rPr>
+          <w:rFonts w:ascii="Calibri" w:hAnsi="Calibri" w:eastAsia="Calibri"/>
+          <w:b w:val="0"/>
+          <w:sz w:val="22"/>
+        </w:rPr>
+        <w:t>Tata's electric mobility strategy includes passenger EVs, fleet solutions, and charging ecosystem partnerships. ZIPTRON and acti.ev branding communicate technology generations to customers. Range anxiety, charging time, and battery warranty terms remain key purchase factors; the company addresses them through product updates and service packages. Commercial EV buses support state transport undertakings and smart-city projects.</w:t>
+      </w:r>
+    </w:p>
+    <w:p>
+      <w:pPr>
         <w:pStyle w:val="ListBullet"/>
         <w:jc w:val="both"/>
       </w:pPr>
@@ -1118,6 +1324,274 @@
           <w:sz w:val="22"/>
         </w:rPr>
         <w:t>Acquired in 2008, Jaguar Land Rover is Tata Motors' global premium automotive business with luxury brands, advanced engineering, and manufacturing primarily in the United Kingdom and other international locations.</w:t>
+      </w:r>
+    </w:p>
+    <w:p>
+      <w:pPr>
+        <w:keepNext/>
+        <w:spacing w:before="160" w:after="120"/>
+      </w:pPr>
+      <w:r>
+        <w:rPr>
+          <w:rFonts w:ascii="Calibri" w:hAnsi="Calibri" w:eastAsia="Calibri"/>
+          <w:b/>
+          <w:color w:val="003366"/>
+          <w:sz w:val="26"/>
+        </w:rPr>
+        <w:t>3.5 Achievements and business progress (FY2024–25)</w:t>
+      </w:r>
+    </w:p>
+    <w:p>
+      <w:pPr>
+        <w:spacing w:line="276" w:lineRule="auto" w:after="160"/>
+        <w:jc w:val="both"/>
+      </w:pPr>
+      <w:r>
+        <w:rPr>
+          <w:rFonts w:ascii="Calibri" w:hAnsi="Calibri" w:eastAsia="Calibri"/>
+          <w:b w:val="0"/>
+          <w:sz w:val="22"/>
+        </w:rPr>
+        <w:t>Public reports for the financial year 2024–25 highlight several achievements for Tata Motors' automotive businesses. The passenger vehicle business crossed 6 million cumulative sales, reflecting decades of customer adoption across economic cycles. The electric vehicle business surpassed 200,000 cumulative EV sales, with Tata EVs collectively travelling billions of kilometres and contributing to lower tailpipe emissions in Indian cities.</w:t>
+      </w:r>
+    </w:p>
+    <w:p>
+      <w:pPr>
+        <w:spacing w:line="276" w:lineRule="auto" w:after="160"/>
+        <w:jc w:val="both"/>
+      </w:pPr>
+      <w:r>
+        <w:rPr>
+          <w:rFonts w:ascii="Calibri" w:hAnsi="Calibri" w:eastAsia="Calibri"/>
+          <w:b w:val="0"/>
+          <w:sz w:val="22"/>
+        </w:rPr>
+        <w:t>The company increased the share of CNG and electric vehicles within its passenger portfolio, supporting customers who want lower running costs or cleaner powertrains. Product launches and refreshes—including SUVs and technologies such as turbocharged CNG—helped maintain competitiveness. Commercial vehicle operations focused on market share, dealer profitability, and electric buses for urban transport. Manufacturing investments included scaling Sanand and commencing work on a new Tamil Nadu facility to support future volume.</w:t>
+      </w:r>
+    </w:p>
+    <w:p>
+      <w:pPr>
+        <w:keepNext/>
+        <w:spacing w:before="160" w:after="120"/>
+      </w:pPr>
+      <w:r>
+        <w:rPr>
+          <w:rFonts w:ascii="Calibri" w:hAnsi="Calibri" w:eastAsia="Calibri"/>
+          <w:b/>
+          <w:color w:val="003366"/>
+          <w:sz w:val="26"/>
+        </w:rPr>
+        <w:t>3.6 Research, development and innovation</w:t>
+      </w:r>
+    </w:p>
+    <w:p>
+      <w:pPr>
+        <w:spacing w:line="276" w:lineRule="auto" w:after="160"/>
+        <w:jc w:val="both"/>
+      </w:pPr>
+      <w:r>
+        <w:rPr>
+          <w:rFonts w:ascii="Calibri" w:hAnsi="Calibri" w:eastAsia="Calibri"/>
+          <w:b w:val="0"/>
+          <w:sz w:val="22"/>
+        </w:rPr>
+        <w:t>Research and development at Tata Motors spans vehicle platforms, powertrains, materials, electronics, and digital features. Engineers work on crash safety, noise-vibration-harshness (NVH), aerodynamics, thermal management, and durability testing. Electric vehicle R&amp;D includes battery chemistry partnerships, battery management software, motor control, and charging communication standards.</w:t>
+      </w:r>
+    </w:p>
+    <w:p>
+      <w:pPr>
+        <w:spacing w:line="276" w:lineRule="auto" w:after="160"/>
+        <w:jc w:val="both"/>
+      </w:pPr>
+      <w:r>
+        <w:rPr>
+          <w:rFonts w:ascii="Calibri" w:hAnsi="Calibri" w:eastAsia="Calibri"/>
+          <w:b w:val="0"/>
+          <w:sz w:val="22"/>
+        </w:rPr>
+        <w:t>Connected vehicle programmes add telematics, remote diagnostics, and over-the-air updates where supported. Commercial vehicle R&amp;D addresses payload efficiency, fuel economy, driver comfort, and fleet telematics. Jaguar Land Rover contributes premium automotive technology and global homologation experience. For diploma students, R&amp;D is visible not only in laboratories but also through pilot builds, prototype testing, and collaboration between design, manufacturing, and quality teams.</w:t>
+      </w:r>
+    </w:p>
+    <w:p>
+      <w:pPr>
+        <w:keepNext/>
+        <w:spacing w:before="160" w:after="120"/>
+      </w:pPr>
+      <w:r>
+        <w:rPr>
+          <w:rFonts w:ascii="Calibri" w:hAnsi="Calibri" w:eastAsia="Calibri"/>
+          <w:b/>
+          <w:color w:val="003366"/>
+          <w:sz w:val="26"/>
+        </w:rPr>
+        <w:t>3.7 Sustainability and future mobility</w:t>
+      </w:r>
+    </w:p>
+    <w:p>
+      <w:pPr>
+        <w:spacing w:line="276" w:lineRule="auto" w:after="160"/>
+        <w:jc w:val="both"/>
+      </w:pPr>
+      <w:r>
+        <w:rPr>
+          <w:rFonts w:ascii="Calibri" w:hAnsi="Calibri" w:eastAsia="Calibri"/>
+          <w:b w:val="0"/>
+          <w:sz w:val="22"/>
+        </w:rPr>
+        <w:t>Sustainability is a strategic theme for Tata Motors. The company promotes safer vehicles (including higher safety ratings on selected passenger models), cleaner powertrains (CNG, EV, and research into hydrogen internal combustion for commercial applications), and responsible manufacturing (energy use, waste, water, and emissions at plants).</w:t>
+      </w:r>
+    </w:p>
+    <w:p>
+      <w:pPr>
+        <w:spacing w:line="276" w:lineRule="auto" w:after="160"/>
+        <w:jc w:val="both"/>
+      </w:pPr>
+      <w:r>
+        <w:rPr>
+          <w:rFonts w:ascii="Calibri" w:hAnsi="Calibri" w:eastAsia="Calibri"/>
+          <w:b w:val="0"/>
+          <w:sz w:val="22"/>
+        </w:rPr>
+        <w:t>Electric buses and passenger EVs support urban air-quality goals. Battery lifecycle management—including recycling and second-life applications—is an emerging focus across the industry. Tata Motors communicates progress through integrated reporting aligned with environmental, social, and governance (ESG) expectations of investors and regulators.</w:t>
+      </w:r>
+    </w:p>
+    <w:p>
+      <w:pPr>
+        <w:spacing w:before="120" w:after="120"/>
+        <w:jc w:val="center"/>
+      </w:pPr>
+      <w:r>
+        <w:drawing>
+          <wp:inline xmlns:a="http://schemas.openxmlformats.org/drawingml/2006/main" xmlns:pic="http://schemas.openxmlformats.org/drawingml/2006/picture">
+            <wp:extent cx="4754880" cy="2083599"/>
+            <wp:docPr id="6" name="Picture 6"/>
+            <wp:cNvGraphicFramePr>
+              <a:graphicFrameLocks noChangeAspect="1"/>
+            </wp:cNvGraphicFramePr>
+            <a:graphic>
+              <a:graphicData uri="http://schemas.openxmlformats.org/drawingml/2006/picture">
+                <pic:pic>
+                  <pic:nvPicPr>
+                    <pic:cNvPr id="0" name="ev_ecosystem.png"/>
+                    <pic:cNvPicPr/>
+                  </pic:nvPicPr>
+                  <pic:blipFill>
+                    <a:blip r:embed="rId14"/>
+                    <a:stretch>
+                      <a:fillRect/>
+                    </a:stretch>
+                  </pic:blipFill>
+                  <pic:spPr>
+                    <a:xfrm>
+                      <a:off x="0" y="0"/>
+                      <a:ext cx="4754880" cy="2083599"/>
+                    </a:xfrm>
+                    <a:prstGeom prst="rect"/>
+                  </pic:spPr>
+                </pic:pic>
+              </a:graphicData>
+            </a:graphic>
+          </wp:inline>
+        </w:drawing>
+      </w:r>
+    </w:p>
+    <w:p>
+      <w:pPr>
+        <w:jc w:val="center"/>
+      </w:pPr>
+      <w:r>
+        <w:rPr>
+          <w:rFonts w:ascii="Calibri" w:hAnsi="Calibri" w:eastAsia="Calibri"/>
+          <w:b w:val="0"/>
+          <w:color w:val="5A5A5A"/>
+          <w:sz w:val="18"/>
+        </w:rPr>
+        <w:t>Figure 4: Electric mobility value chain</w:t>
+      </w:r>
+    </w:p>
+    <w:p>
+      <w:pPr>
+        <w:keepNext/>
+        <w:spacing w:before="160" w:after="120"/>
+      </w:pPr>
+      <w:r>
+        <w:rPr>
+          <w:rFonts w:ascii="Calibri" w:hAnsi="Calibri" w:eastAsia="Calibri"/>
+          <w:b/>
+          <w:color w:val="003366"/>
+          <w:sz w:val="26"/>
+        </w:rPr>
+        <w:t>3.8 Core strengths</w:t>
+      </w:r>
+    </w:p>
+    <w:p>
+      <w:pPr>
+        <w:pStyle w:val="ListBullet"/>
+        <w:jc w:val="both"/>
+      </w:pPr>
+      <w:r>
+        <w:rPr>
+          <w:rFonts w:ascii="Calibri" w:hAnsi="Calibri" w:eastAsia="Calibri"/>
+          <w:b w:val="0"/>
+          <w:sz w:val="22"/>
+        </w:rPr>
+        <w:t>Strong brand trust associated with the Tata Group.</w:t>
+      </w:r>
+    </w:p>
+    <w:p>
+      <w:pPr>
+        <w:pStyle w:val="ListBullet"/>
+        <w:jc w:val="both"/>
+      </w:pPr>
+      <w:r>
+        <w:rPr>
+          <w:rFonts w:ascii="Calibri" w:hAnsi="Calibri" w:eastAsia="Calibri"/>
+          <w:b w:val="0"/>
+          <w:sz w:val="22"/>
+        </w:rPr>
+        <w:t>Wide portfolio covering passenger, commercial, and electric segments.</w:t>
+      </w:r>
+    </w:p>
+    <w:p>
+      <w:pPr>
+        <w:pStyle w:val="ListBullet"/>
+        <w:jc w:val="both"/>
+      </w:pPr>
+      <w:r>
+        <w:rPr>
+          <w:rFonts w:ascii="Calibri" w:hAnsi="Calibri" w:eastAsia="Calibri"/>
+          <w:b w:val="0"/>
+          <w:sz w:val="22"/>
+        </w:rPr>
+        <w:t>Extensive manufacturing and service footprint across India.</w:t>
+      </w:r>
+    </w:p>
+    <w:p>
+      <w:pPr>
+        <w:pStyle w:val="ListBullet"/>
+        <w:jc w:val="both"/>
+      </w:pPr>
+      <w:r>
+        <w:rPr>
+          <w:rFonts w:ascii="Calibri" w:hAnsi="Calibri" w:eastAsia="Calibri"/>
+          <w:b w:val="0"/>
+          <w:sz w:val="22"/>
+        </w:rPr>
+        <w:t>Growing capability in EVs and alternative fuels.</w:t>
+      </w:r>
+    </w:p>
+    <w:p>
+      <w:pPr>
+        <w:pStyle w:val="ListBullet"/>
+        <w:jc w:val="both"/>
+      </w:pPr>
+      <w:r>
+        <w:rPr>
+          <w:rFonts w:ascii="Calibri" w:hAnsi="Calibri" w:eastAsia="Calibri"/>
+          <w:b w:val="0"/>
+          <w:sz w:val="22"/>
+        </w:rPr>
+        <w:t>International presence and technology access through Jaguar Land Rover.</w:t>
       </w:r>
     </w:p>
     <w:p>
@@ -1622,7 +2096,7 @@
               <w:drawing>
                 <wp:inline xmlns:a="http://schemas.openxmlformats.org/drawingml/2006/main" xmlns:pic="http://schemas.openxmlformats.org/drawingml/2006/picture">
                   <wp:extent cx="2606040" cy="1318532"/>
-                  <wp:docPr id="4" name="Picture 4"/>
+                  <wp:docPr id="7" name="Picture 7"/>
                   <wp:cNvGraphicFramePr>
                     <a:graphicFrameLocks noChangeAspect="1"/>
                   </wp:cNvGraphicFramePr>
@@ -1634,7 +2108,7 @@
                           <pic:cNvPicPr/>
                         </pic:nvPicPr>
                         <pic:blipFill>
-                          <a:blip r:embed="rId12"/>
+                          <a:blip r:embed="rId15"/>
                           <a:stretch>
                             <a:fillRect/>
                           </a:stretch>
@@ -1667,7 +2141,7 @@
               <w:drawing>
                 <wp:inline xmlns:a="http://schemas.openxmlformats.org/drawingml/2006/main" xmlns:pic="http://schemas.openxmlformats.org/drawingml/2006/picture">
                   <wp:extent cx="2606040" cy="1663522"/>
-                  <wp:docPr id="5" name="Picture 5"/>
+                  <wp:docPr id="8" name="Picture 8"/>
                   <wp:cNvGraphicFramePr>
                     <a:graphicFrameLocks noChangeAspect="1"/>
                   </wp:cNvGraphicFramePr>
@@ -1679,7 +2153,7 @@
                           <pic:cNvPicPr/>
                         </pic:nvPicPr>
                         <pic:blipFill>
-                          <a:blip r:embed="rId13"/>
+                          <a:blip r:embed="rId16"/>
                           <a:stretch>
                             <a:fillRect/>
                           </a:stretch>
@@ -1704,6 +2178,60 @@
     <w:p/>
     <w:p>
       <w:pPr>
+        <w:spacing w:before="120" w:after="120"/>
+        <w:jc w:val="center"/>
+      </w:pPr>
+      <w:r>
+        <w:drawing>
+          <wp:inline xmlns:a="http://schemas.openxmlformats.org/drawingml/2006/main" xmlns:pic="http://schemas.openxmlformats.org/drawingml/2006/picture">
+            <wp:extent cx="5120640" cy="1504037"/>
+            <wp:docPr id="9" name="Picture 9"/>
+            <wp:cNvGraphicFramePr>
+              <a:graphicFrameLocks noChangeAspect="1"/>
+            </wp:cNvGraphicFramePr>
+            <a:graphic>
+              <a:graphicData uri="http://schemas.openxmlformats.org/drawingml/2006/picture">
+                <pic:pic>
+                  <pic:nvPicPr>
+                    <pic:cNvPr id="0" name="history_timeline.png"/>
+                    <pic:cNvPicPr/>
+                  </pic:nvPicPr>
+                  <pic:blipFill>
+                    <a:blip r:embed="rId17"/>
+                    <a:stretch>
+                      <a:fillRect/>
+                    </a:stretch>
+                  </pic:blipFill>
+                  <pic:spPr>
+                    <a:xfrm>
+                      <a:off x="0" y="0"/>
+                      <a:ext cx="5120640" cy="1504037"/>
+                    </a:xfrm>
+                    <a:prstGeom prst="rect"/>
+                  </pic:spPr>
+                </pic:pic>
+              </a:graphicData>
+            </a:graphic>
+          </wp:inline>
+        </w:drawing>
+      </w:r>
+    </w:p>
+    <w:p>
+      <w:pPr>
+        <w:jc w:val="center"/>
+      </w:pPr>
+      <w:r>
+        <w:rPr>
+          <w:rFonts w:ascii="Calibri" w:hAnsi="Calibri" w:eastAsia="Calibri"/>
+          <w:b w:val="0"/>
+          <w:color w:val="5A5A5A"/>
+          <w:sz w:val="18"/>
+        </w:rPr>
+        <w:t>Figure 5: Historical milestone timeline</w:t>
+      </w:r>
+    </w:p>
+    <w:p>
+      <w:pPr>
         <w:keepNext/>
         <w:spacing w:before="160" w:after="120"/>
       </w:pPr>
@@ -1728,7 +2256,7 @@
           <w:b w:val="0"/>
           <w:sz w:val="22"/>
         </w:rPr>
-        <w:t>Tata Motors was established in 1945 as Tata Engineering and Locomotive Company Limited. Its initial activities were associated with locomotives and engineering products, building industrial capability for later vehicle manufacturing.</w:t>
+        <w:t>Tata Motors was established in 1945 as Tata Engineering and Locomotive Company Limited. Its initial activities were associated with locomotives and engineering products, building industrial capability for later vehicle manufacturing. Post-independence industrial growth in India created demand for domestic commercial transport and engineering goods, which shaped the company's early priorities.</w:t>
       </w:r>
     </w:p>
     <w:p>
@@ -1757,7 +2285,7 @@
           <w:b w:val="0"/>
           <w:sz w:val="22"/>
         </w:rPr>
-        <w:t>The company entered the commercial vehicle sector through collaboration with Daimler-Benz of Germany (1954), beginning organised truck manufacturing in India.</w:t>
+        <w:t>The company entered the commercial vehicle sector through collaboration with Daimler-Benz of Germany (1954), beginning organised truck manufacturing in India. This partnership transferred know-how for chassis, engines, and assembly methods. Commercial vehicles later became the backbone of Tata Motors' revenue and brand recognition among fleet operators.</w:t>
       </w:r>
     </w:p>
     <w:p>
@@ -1786,7 +2314,7 @@
           <w:b w:val="0"/>
           <w:sz w:val="22"/>
         </w:rPr>
-        <w:t>Passenger vehicles helped the company move beyond commercial transport. The Tata Indica (1998) became a significant milestone as an indigenously developed passenger car and strengthened market presence.</w:t>
+        <w:t>Passenger vehicles helped the company move beyond commercial transport. The Tata Sierra (1991) signalled SUV ambition, while the Tata Indica (1998) became a milestone as an indigenously developed passenger car. Indica demonstrated that India could design and engineer a full passenger car platform, strengthening confidence in local R&amp;D.</w:t>
       </w:r>
     </w:p>
     <w:p>
@@ -1815,7 +2343,7 @@
           <w:b w:val="0"/>
           <w:sz w:val="22"/>
         </w:rPr>
-        <w:t>In 2004, Tata Motors acquired Daewoo Commercial Vehicle Company in South Korea. In 2008, it acquired Jaguar Land Rover from Ford Motor Company—a landmark acquisition expanding luxury brands and global engineering.</w:t>
+        <w:t>In 2004, Tata Motors acquired Daewoo Commercial Vehicle Company in South Korea, gaining international CV presence. In 2008, it acquired Jaguar Land Rover from Ford Motor Company—a landmark deal adding luxury brands, global distribution, and advanced powertrain and aluminium-body expertise. JLR remains a distinct premium automotive business within the group.</w:t>
       </w:r>
     </w:p>
     <w:p>
@@ -1844,7 +2372,7 @@
           <w:b w:val="0"/>
           <w:sz w:val="22"/>
         </w:rPr>
-        <w:t>In subsequent years, the company introduced products focused on styling, fuel efficiency, safety, comfort, and technology. Vehicles such as Tiago, Nexon, Harrier, Safari, and Punch strengthened the passenger portfolio. Tata Ace (2005) transformed last-mile logistics.</w:t>
+        <w:t>Subsequent launches focused on styling, fuel efficiency, safety, comfort, and technology. IMPACT design language shaped Tiago and Tigor; SUVs such as Nexon, Harrier, Safari, and Punch targeted India's shift toward higher seating position and road presence. Tata Ace (2005) created the mini-truck category for entrepreneurs; Ultra and Prima strengthened structured logistics.</w:t>
       </w:r>
     </w:p>
     <w:p>
@@ -1873,7 +2401,7 @@
           <w:b w:val="0"/>
           <w:sz w:val="22"/>
         </w:rPr>
-        <w:t>Tata Motors invested in battery-electric vehicles, electric powertrains, charging partnerships, software-enabled features, and efficient manufacturing. FY2024–25 reporting highlights CNG and EV share growth, hydrogen ICE truck development, automation, and AI-enabled operations.</w:t>
+        <w:t>Tata Motors invested in battery-electric vehicles, ZIPTRON powertrain (2019 Nexon EV), acti.ev platforms, charging partnerships, and connected features. FY2024–25 reporting highlights higher CNG+EV mix, hydrogen ICE truck demonstration, Sanand ramp-up, Tamil Nadu plant groundwork, and use of automation and data analytics in manufacturing.</w:t>
       </w:r>
     </w:p>
     <w:p>
@@ -1920,7 +2448,7 @@
               <w:drawing>
                 <wp:inline xmlns:a="http://schemas.openxmlformats.org/drawingml/2006/main" xmlns:pic="http://schemas.openxmlformats.org/drawingml/2006/picture">
                   <wp:extent cx="2606040" cy="1845945"/>
-                  <wp:docPr id="6" name="Picture 6"/>
+                  <wp:docPr id="10" name="Picture 10"/>
                   <wp:cNvGraphicFramePr>
                     <a:graphicFrameLocks noChangeAspect="1"/>
                   </wp:cNvGraphicFramePr>
@@ -1932,7 +2460,7 @@
                           <pic:cNvPicPr/>
                         </pic:nvPicPr>
                         <pic:blipFill>
-                          <a:blip r:embed="rId14"/>
+                          <a:blip r:embed="rId18"/>
                           <a:stretch>
                             <a:fillRect/>
                           </a:stretch>
@@ -1965,7 +2493,7 @@
               <w:drawing>
                 <wp:inline xmlns:a="http://schemas.openxmlformats.org/drawingml/2006/main" xmlns:pic="http://schemas.openxmlformats.org/drawingml/2006/picture">
                   <wp:extent cx="2606040" cy="1832372"/>
-                  <wp:docPr id="7" name="Picture 7"/>
+                  <wp:docPr id="11" name="Picture 11"/>
                   <wp:cNvGraphicFramePr>
                     <a:graphicFrameLocks noChangeAspect="1"/>
                   </wp:cNvGraphicFramePr>
@@ -1977,7 +2505,7 @@
                           <pic:cNvPicPr/>
                         </pic:nvPicPr>
                         <pic:blipFill>
-                          <a:blip r:embed="rId15"/>
+                          <a:blip r:embed="rId19"/>
                           <a:stretch>
                             <a:fillRect/>
                           </a:stretch>
@@ -2012,6 +2540,60 @@
           <w:sz w:val="22"/>
         </w:rPr>
         <w:t>Automobile manufacturing involves multiple coordinated activities, from product design and raw material procurement to assembly, inspection, and delivery. Tata Motors' exact procedures vary by plant, product, and production line. The following methodologies describe established automotive manufacturing practices relevant to its operations; they should not be interpreted as a verified list of systems used identically at every Tata Motors facility.</w:t>
+      </w:r>
+    </w:p>
+    <w:p>
+      <w:pPr>
+        <w:spacing w:before="120" w:after="120"/>
+        <w:jc w:val="center"/>
+      </w:pPr>
+      <w:r>
+        <w:drawing>
+          <wp:inline xmlns:a="http://schemas.openxmlformats.org/drawingml/2006/main" xmlns:pic="http://schemas.openxmlformats.org/drawingml/2006/picture">
+            <wp:extent cx="5120640" cy="1241367"/>
+            <wp:docPr id="12" name="Picture 12"/>
+            <wp:cNvGraphicFramePr>
+              <a:graphicFrameLocks noChangeAspect="1"/>
+            </wp:cNvGraphicFramePr>
+            <a:graphic>
+              <a:graphicData uri="http://schemas.openxmlformats.org/drawingml/2006/picture">
+                <pic:pic>
+                  <pic:nvPicPr>
+                    <pic:cNvPr id="0" name="manufacturing_flow.png"/>
+                    <pic:cNvPicPr/>
+                  </pic:nvPicPr>
+                  <pic:blipFill>
+                    <a:blip r:embed="rId20"/>
+                    <a:stretch>
+                      <a:fillRect/>
+                    </a:stretch>
+                  </pic:blipFill>
+                  <pic:spPr>
+                    <a:xfrm>
+                      <a:off x="0" y="0"/>
+                      <a:ext cx="5120640" cy="1241367"/>
+                    </a:xfrm>
+                    <a:prstGeom prst="rect"/>
+                  </pic:spPr>
+                </pic:pic>
+              </a:graphicData>
+            </a:graphic>
+          </wp:inline>
+        </w:drawing>
+      </w:r>
+    </w:p>
+    <w:p>
+      <w:pPr>
+        <w:jc w:val="center"/>
+      </w:pPr>
+      <w:r>
+        <w:rPr>
+          <w:rFonts w:ascii="Calibri" w:hAnsi="Calibri" w:eastAsia="Calibri"/>
+          <w:b w:val="0"/>
+          <w:color w:val="5A5A5A"/>
+          <w:sz w:val="18"/>
+        </w:rPr>
+        <w:t>Figure 6: Typical automobile manufacturing flow</w:t>
       </w:r>
     </w:p>
     <w:p>
@@ -3073,7 +3655,7 @@
               <w:drawing>
                 <wp:inline xmlns:a="http://schemas.openxmlformats.org/drawingml/2006/main" xmlns:pic="http://schemas.openxmlformats.org/drawingml/2006/picture">
                   <wp:extent cx="2148840" cy="685867"/>
-                  <wp:docPr id="8" name="Picture 8"/>
+                  <wp:docPr id="13" name="Picture 13"/>
                   <wp:cNvGraphicFramePr>
                     <a:graphicFrameLocks noChangeAspect="1"/>
                   </wp:cNvGraphicFramePr>
@@ -3085,7 +3667,7 @@
                           <pic:cNvPicPr/>
                         </pic:nvPicPr>
                         <pic:blipFill>
-                          <a:blip r:embed="rId16"/>
+                          <a:blip r:embed="rId21"/>
                           <a:stretch>
                             <a:fillRect/>
                           </a:stretch>
@@ -3131,7 +3713,7 @@
                 <w:b w:val="0"/>
                 <w:sz w:val="22"/>
               </w:rPr>
-              <w:t>Passenger vehicles are designed for personal and family transportation. Tata Motors offers hatchbacks, sedans, and SUVs with emphasis on safety, comfort, and fuel-efficient or electric powertrains. Representative models include Tiago, Altroz, Tigor, Punch, Nexon, Harrier, Safari, and Curvv.</w:t>
+              <w:t>Passenger vehicles are designed for personal and family transportation. Tata Motors offers hatchbacks, sedans, and SUVs with emphasis on safety, comfort, and fuel-efficient or electric powertrains. Representative models include Tiago, Altroz, Tigor, Punch, Nexon, Harrier, Safari, and Curvv. Features often include touchscreen infotainment, connected services, multiple airbags on selected variants, and choice of petrol, diesel, CNG, or electric powertrains depending on model.</w:t>
             </w:r>
           </w:p>
         </w:tc>
@@ -3162,7 +3744,7 @@
               <w:drawing>
                 <wp:inline xmlns:a="http://schemas.openxmlformats.org/drawingml/2006/main" xmlns:pic="http://schemas.openxmlformats.org/drawingml/2006/picture">
                   <wp:extent cx="2148840" cy="615749"/>
-                  <wp:docPr id="9" name="Picture 9"/>
+                  <wp:docPr id="14" name="Picture 14"/>
                   <wp:cNvGraphicFramePr>
                     <a:graphicFrameLocks noChangeAspect="1"/>
                   </wp:cNvGraphicFramePr>
@@ -3174,7 +3756,7 @@
                           <pic:cNvPicPr/>
                         </pic:nvPicPr>
                         <pic:blipFill>
-                          <a:blip r:embed="rId17"/>
+                          <a:blip r:embed="rId22"/>
                           <a:stretch>
                             <a:fillRect/>
                           </a:stretch>
@@ -3220,7 +3802,7 @@
                 <w:b w:val="0"/>
                 <w:sz w:val="22"/>
               </w:rPr>
-              <w:t>Electric vehicles use electric motors and rechargeable battery packs. Tata Motors is a leader in India's passenger EV segment with models such as Nexon EV, Tiago EV, Punch EV, and Tigor EV, supported by charging partnerships and evolving battery technology.</w:t>
+              <w:t>Electric vehicles use electric motors and rechargeable battery packs instead of conventional fuel tanks and exhaust systems. Tata Motors leads India's passenger EV segment by volume in many reporting periods, with Nexon EV, Tiago EV, Punch EV, and Tigor EV. Customers evaluate range, charging time, battery warranty, and resale value; the company addresses these through ZIPTRON technology updates and service programmes.</w:t>
             </w:r>
           </w:p>
         </w:tc>
@@ -3251,7 +3833,7 @@
               <w:drawing>
                 <wp:inline xmlns:a="http://schemas.openxmlformats.org/drawingml/2006/main" xmlns:pic="http://schemas.openxmlformats.org/drawingml/2006/picture">
                   <wp:extent cx="2148840" cy="653865"/>
-                  <wp:docPr id="10" name="Picture 10"/>
+                  <wp:docPr id="15" name="Picture 15"/>
                   <wp:cNvGraphicFramePr>
                     <a:graphicFrameLocks noChangeAspect="1"/>
                   </wp:cNvGraphicFramePr>
@@ -3263,7 +3845,7 @@
                           <pic:cNvPicPr/>
                         </pic:nvPicPr>
                         <pic:blipFill>
-                          <a:blip r:embed="rId18"/>
+                          <a:blip r:embed="rId23"/>
                           <a:stretch>
                             <a:fillRect/>
                           </a:stretch>
@@ -3340,7 +3922,7 @@
               <w:drawing>
                 <wp:inline xmlns:a="http://schemas.openxmlformats.org/drawingml/2006/main" xmlns:pic="http://schemas.openxmlformats.org/drawingml/2006/picture">
                   <wp:extent cx="2148840" cy="659785"/>
-                  <wp:docPr id="11" name="Picture 11"/>
+                  <wp:docPr id="16" name="Picture 16"/>
                   <wp:cNvGraphicFramePr>
                     <a:graphicFrameLocks noChangeAspect="1"/>
                   </wp:cNvGraphicFramePr>
@@ -3352,7 +3934,7 @@
                           <pic:cNvPicPr/>
                         </pic:nvPicPr>
                         <pic:blipFill>
-                          <a:blip r:embed="rId19"/>
+                          <a:blip r:embed="rId24"/>
                           <a:stretch>
                             <a:fillRect/>
                           </a:stretch>
@@ -3431,7 +4013,7 @@
           <w:b w:val="0"/>
           <w:sz w:val="22"/>
         </w:rPr>
-        <w:t>Modern automobiles are complex electro-mechanical systems. Electronics and Communication Engineering plays an important role in automotive R&amp;D and production quality at Tata Motors.</w:t>
+        <w:t>Modern automobiles are complex electro-mechanical systems. Electronics and Communication Engineering plays an important role in automotive R&amp;D and production quality at Tata Motors. A single vehicle may contain dozens of electronic control units coordinating engine or motor torque, braking, lighting, climate control, instrument cluster, infotainment, and safety features.</w:t>
       </w:r>
     </w:p>
     <w:p>
@@ -3445,7 +4027,7 @@
           <w:b w:val="0"/>
           <w:sz w:val="22"/>
         </w:rPr>
-        <w:t>Key domains include engine control units (ECU), body control modules, infotainment and telematics, ADAS sensors, battery management systems (BMS) in EVs, wiring harnesses, in-vehicle networks (CAN, LIN, Ethernet in newer architectures), and over-the-air software updates.</w:t>
+        <w:t>Key domains include engine control units (ECU), body control modules, infotainment and telematics, ADAS sensors, battery management systems (BMS) in EVs, wiring harnesses, in-vehicle networks (CAN, LIN, Ethernet in newer architectures), and over-the-air software updates. Poor harness routing or weak earthing can cause intermittent faults; therefore production plants enforce standard work instructions, torque tools, and electrical tests.</w:t>
       </w:r>
     </w:p>
     <w:p>
@@ -3459,7 +4041,145 @@
           <w:b w:val="0"/>
           <w:sz w:val="22"/>
         </w:rPr>
-        <w:t>During authorised plant visits or internships, diploma students may observe trim-and-chassis processes, harness routing, earthing safety checks, ECU flashing, heating-element quality, connector inspection, PLC-based automation, robotic welding cells, and end-of-line electrical testing—especially at passenger vehicle plants such as Pune and manufacturing locations such as Sanand and Jamshedpur.</w:t>
+        <w:t>During authorised plant visits or internships, diploma students may observe trim-and-chassis (TCF) processes, harness routing, earthing safety checks, ECU flashing, heating-element quality, connector inspection, PLC-based automation, robotic welding cells, and end-of-line electrical testing—especially at passenger vehicle plants such as Pune and manufacturing locations such as Sanand and Jamshedpur. Documenting these observations with diagrams and safety rules strengthens the college internship report.</w:t>
+      </w:r>
+    </w:p>
+    <w:p>
+      <w:pPr>
+        <w:pStyle w:val="ListBullet"/>
+        <w:jc w:val="both"/>
+      </w:pPr>
+      <w:r>
+        <w:rPr>
+          <w:rFonts w:ascii="Calibri" w:hAnsi="Calibri" w:eastAsia="Calibri"/>
+          <w:b w:val="0"/>
+          <w:sz w:val="22"/>
+        </w:rPr>
+        <w:t>Embedded controllers (ECU, BCM, BMS) and firmware flashing procedures.</w:t>
+      </w:r>
+    </w:p>
+    <w:p>
+      <w:pPr>
+        <w:pStyle w:val="ListBullet"/>
+        <w:jc w:val="both"/>
+      </w:pPr>
+      <w:r>
+        <w:rPr>
+          <w:rFonts w:ascii="Calibri" w:hAnsi="Calibri" w:eastAsia="Calibri"/>
+          <w:b w:val="0"/>
+          <w:sz w:val="22"/>
+        </w:rPr>
+        <w:t>Sensors for speed, temperature, pressure, and advanced driver assistance on higher trims.</w:t>
+      </w:r>
+    </w:p>
+    <w:p>
+      <w:pPr>
+        <w:pStyle w:val="ListBullet"/>
+        <w:jc w:val="both"/>
+      </w:pPr>
+      <w:r>
+        <w:rPr>
+          <w:rFonts w:ascii="Calibri" w:hAnsi="Calibri" w:eastAsia="Calibri"/>
+          <w:b w:val="0"/>
+          <w:sz w:val="22"/>
+        </w:rPr>
+        <w:t>Wiring harness routing, clipping, continuity, and high-voltage isolation on EV lines.</w:t>
+      </w:r>
+    </w:p>
+    <w:p>
+      <w:pPr>
+        <w:pStyle w:val="ListBullet"/>
+        <w:jc w:val="both"/>
+      </w:pPr>
+      <w:r>
+        <w:rPr>
+          <w:rFonts w:ascii="Calibri" w:hAnsi="Calibri" w:eastAsia="Calibri"/>
+          <w:b w:val="0"/>
+          <w:sz w:val="22"/>
+        </w:rPr>
+        <w:t>In-vehicle networks: CAN, LIN, and Ethernet-based architectures in newer vehicles.</w:t>
+      </w:r>
+    </w:p>
+    <w:p>
+      <w:pPr>
+        <w:pStyle w:val="ListBullet"/>
+        <w:jc w:val="both"/>
+      </w:pPr>
+      <w:r>
+        <w:rPr>
+          <w:rFonts w:ascii="Calibri" w:hAnsi="Calibri" w:eastAsia="Calibri"/>
+          <w:b w:val="0"/>
+          <w:sz w:val="22"/>
+        </w:rPr>
+        <w:t>Production testers, oscilloscopes, and automated end-of-line electrical checks.</w:t>
+      </w:r>
+    </w:p>
+    <w:p>
+      <w:pPr>
+        <w:pStyle w:val="ListBullet"/>
+        <w:jc w:val="both"/>
+      </w:pPr>
+      <w:r>
+        <w:rPr>
+          <w:rFonts w:ascii="Calibri" w:hAnsi="Calibri" w:eastAsia="Calibri"/>
+          <w:b w:val="0"/>
+          <w:sz w:val="22"/>
+        </w:rPr>
+        <w:t>PLC and robot integration in body shop and paint shop automation.</w:t>
+      </w:r>
+    </w:p>
+    <w:p>
+      <w:pPr>
+        <w:spacing w:before="120" w:after="120"/>
+        <w:jc w:val="center"/>
+      </w:pPr>
+      <w:r>
+        <w:drawing>
+          <wp:inline xmlns:a="http://schemas.openxmlformats.org/drawingml/2006/main" xmlns:pic="http://schemas.openxmlformats.org/drawingml/2006/picture">
+            <wp:extent cx="4572000" cy="2835797"/>
+            <wp:docPr id="17" name="Picture 17"/>
+            <wp:cNvGraphicFramePr>
+              <a:graphicFrameLocks noChangeAspect="1"/>
+            </wp:cNvGraphicFramePr>
+            <a:graphic>
+              <a:graphicData uri="http://schemas.openxmlformats.org/drawingml/2006/picture">
+                <pic:pic>
+                  <pic:nvPicPr>
+                    <pic:cNvPr id="0" name="ece_automotive.png"/>
+                    <pic:cNvPicPr/>
+                  </pic:nvPicPr>
+                  <pic:blipFill>
+                    <a:blip r:embed="rId25"/>
+                    <a:stretch>
+                      <a:fillRect/>
+                    </a:stretch>
+                  </pic:blipFill>
+                  <pic:spPr>
+                    <a:xfrm>
+                      <a:off x="0" y="0"/>
+                      <a:ext cx="4572000" cy="2835797"/>
+                    </a:xfrm>
+                    <a:prstGeom prst="rect"/>
+                  </pic:spPr>
+                </pic:pic>
+              </a:graphicData>
+            </a:graphic>
+          </wp:inline>
+        </w:drawing>
+      </w:r>
+    </w:p>
+    <w:p>
+      <w:pPr>
+        <w:jc w:val="center"/>
+      </w:pPr>
+      <w:r>
+        <w:rPr>
+          <w:rFonts w:ascii="Calibri" w:hAnsi="Calibri" w:eastAsia="Calibri"/>
+          <w:b w:val="0"/>
+          <w:color w:val="5A5A5A"/>
+          <w:sz w:val="18"/>
+        </w:rPr>
+        <w:t>Figure 7: Electronics integration in vehicles</w:t>
       </w:r>
     </w:p>
     <w:p>
@@ -3488,7 +4208,172 @@
           <w:b w:val="0"/>
           <w:sz w:val="22"/>
         </w:rPr>
-        <w:t>Tata Motors operates major manufacturing and assembly facilities in India including Pune (passenger vehicles), Jamshedpur and Lucknow (commercial vehicles), Sanand (passenger and EV-related capacity), and Dharwad. Typical plant flow includes stamping, body shop, paint shop, engine or powertrain assembly (where applicable), final assembly, and quality gates before dispatch.</w:t>
+        <w:t>Tata Motors operates major manufacturing and assembly facilities in India including Pune (passenger vehicles), Jamshedpur and Lucknow (commercial vehicles), Sanand (passenger and EV-related capacity), and Dharwad. Plants are organised into shops: press shop (stamping panels), body shop (welding and framing), paint shop (corrosion protection and aesthetics), engine or battery assembly (where applicable), trim and final assembly, and vehicle testing.</w:t>
+      </w:r>
+    </w:p>
+    <w:p>
+      <w:pPr>
+        <w:spacing w:line="276" w:lineRule="auto" w:after="160"/>
+        <w:jc w:val="both"/>
+      </w:pPr>
+      <w:r>
+        <w:rPr>
+          <w:rFonts w:ascii="Calibri" w:hAnsi="Calibri" w:eastAsia="Calibri"/>
+          <w:b w:val="0"/>
+          <w:sz w:val="22"/>
+        </w:rPr>
+        <w:t>Material flow uses conveyors, AGVs, and kitting stations aligned with takt time. Quality gates stop defects from propagating downstream. Environmental controls in paint shops and strict high-voltage procedures in EV lines protect workers and product integrity. Capacity expansions—such as Sanand scale-up and the Tamil Nadu greenfield—support new models and export ambitions.</w:t>
+      </w:r>
+    </w:p>
+    <w:p>
+      <w:pPr>
+        <w:spacing w:before="120" w:after="120"/>
+        <w:jc w:val="center"/>
+      </w:pPr>
+      <w:r>
+        <w:drawing>
+          <wp:inline xmlns:a="http://schemas.openxmlformats.org/drawingml/2006/main" xmlns:pic="http://schemas.openxmlformats.org/drawingml/2006/picture">
+            <wp:extent cx="4389120" cy="5025224"/>
+            <wp:docPr id="18" name="Picture 18"/>
+            <wp:cNvGraphicFramePr>
+              <a:graphicFrameLocks noChangeAspect="1"/>
+            </wp:cNvGraphicFramePr>
+            <a:graphic>
+              <a:graphicData uri="http://schemas.openxmlformats.org/drawingml/2006/picture">
+                <pic:pic>
+                  <pic:nvPicPr>
+                    <pic:cNvPr id="0" name="india_plants_map.png"/>
+                    <pic:cNvPicPr/>
+                  </pic:nvPicPr>
+                  <pic:blipFill>
+                    <a:blip r:embed="rId26"/>
+                    <a:stretch>
+                      <a:fillRect/>
+                    </a:stretch>
+                  </pic:blipFill>
+                  <pic:spPr>
+                    <a:xfrm>
+                      <a:off x="0" y="0"/>
+                      <a:ext cx="4389120" cy="5025224"/>
+                    </a:xfrm>
+                    <a:prstGeom prst="rect"/>
+                  </pic:spPr>
+                </pic:pic>
+              </a:graphicData>
+            </a:graphic>
+          </wp:inline>
+        </w:drawing>
+      </w:r>
+    </w:p>
+    <w:p>
+      <w:pPr>
+        <w:jc w:val="center"/>
+      </w:pPr>
+      <w:r>
+        <w:rPr>
+          <w:rFonts w:ascii="Calibri" w:hAnsi="Calibri" w:eastAsia="Calibri"/>
+          <w:b w:val="0"/>
+          <w:color w:val="5A5A5A"/>
+          <w:sz w:val="18"/>
+        </w:rPr>
+        <w:t>Figure 8: Major locations in India (schematic)</w:t>
+      </w:r>
+    </w:p>
+    <w:p>
+      <w:pPr>
+        <w:keepNext/>
+        <w:spacing w:before="160" w:after="120"/>
+      </w:pPr>
+      <w:r>
+        <w:rPr>
+          <w:rFonts w:ascii="Calibri" w:hAnsi="Calibri" w:eastAsia="Calibri"/>
+          <w:b/>
+          <w:color w:val="003366"/>
+          <w:sz w:val="26"/>
+        </w:rPr>
+        <w:t>6.7 Internship and student programmes</w:t>
+      </w:r>
+    </w:p>
+    <w:p>
+      <w:pPr>
+        <w:spacing w:line="276" w:lineRule="auto" w:after="160"/>
+        <w:jc w:val="both"/>
+      </w:pPr>
+      <w:r>
+        <w:rPr>
+          <w:rFonts w:ascii="Calibri" w:hAnsi="Calibri" w:eastAsia="Calibri"/>
+          <w:b w:val="0"/>
+          <w:sz w:val="22"/>
+        </w:rPr>
+        <w:t>Tata Motors offers structured engagement with students through campus programmes, internships, and graduate engineer trainee (GET) pathways. The company's careers portal describes induction, domain training, and exposure to real business problems under experienced mentors. Manufacturing internships may cover production planning, quality audits, lean projects, and shop-floor problem solving.</w:t>
+      </w:r>
+    </w:p>
+    <w:p>
+      <w:pPr>
+        <w:spacing w:line="276" w:lineRule="auto" w:after="160"/>
+        <w:jc w:val="both"/>
+      </w:pPr>
+      <w:r>
+        <w:rPr>
+          <w:rFonts w:ascii="Calibri" w:hAnsi="Calibri" w:eastAsia="Calibri"/>
+          <w:b w:val="0"/>
+          <w:sz w:val="22"/>
+        </w:rPr>
+        <w:t>For Electronics and Communication Engineering, value lies in understanding how design intent becomes a reliable vehicle: wiring diagrams, connector torque specs, ECU calibration, test limits, and traceability records. Students should approach internships with safety discipline, curiosity about cross-functional workflows, and willingness to document observations for college reports. Institutes typically coordinate visits through formal MoUs with company HR or training departments.</w:t>
+      </w:r>
+    </w:p>
+    <w:p>
+      <w:pPr>
+        <w:spacing w:before="120" w:after="120"/>
+        <w:jc w:val="center"/>
+      </w:pPr>
+      <w:r>
+        <w:drawing>
+          <wp:inline xmlns:a="http://schemas.openxmlformats.org/drawingml/2006/main" xmlns:pic="http://schemas.openxmlformats.org/drawingml/2006/picture">
+            <wp:extent cx="4754880" cy="2617855"/>
+            <wp:docPr id="19" name="Picture 19"/>
+            <wp:cNvGraphicFramePr>
+              <a:graphicFrameLocks noChangeAspect="1"/>
+            </wp:cNvGraphicFramePr>
+            <a:graphic>
+              <a:graphicData uri="http://schemas.openxmlformats.org/drawingml/2006/picture">
+                <pic:pic>
+                  <pic:nvPicPr>
+                    <pic:cNvPr id="0" name="internship_value.png"/>
+                    <pic:cNvPicPr/>
+                  </pic:nvPicPr>
+                  <pic:blipFill>
+                    <a:blip r:embed="rId27"/>
+                    <a:stretch>
+                      <a:fillRect/>
+                    </a:stretch>
+                  </pic:blipFill>
+                  <pic:spPr>
+                    <a:xfrm>
+                      <a:off x="0" y="0"/>
+                      <a:ext cx="4754880" cy="2617855"/>
+                    </a:xfrm>
+                    <a:prstGeom prst="rect"/>
+                  </pic:spPr>
+                </pic:pic>
+              </a:graphicData>
+            </a:graphic>
+          </wp:inline>
+        </w:drawing>
+      </w:r>
+    </w:p>
+    <w:p>
+      <w:pPr>
+        <w:jc w:val="center"/>
+      </w:pPr>
+      <w:r>
+        <w:rPr>
+          <w:rFonts w:ascii="Calibri" w:hAnsi="Calibri" w:eastAsia="Calibri"/>
+          <w:b w:val="0"/>
+          <w:color w:val="5A5A5A"/>
+          <w:sz w:val="18"/>
+        </w:rPr>
+        <w:t>Figure 9: Internship learning areas for diploma students</w:t>
       </w:r>
     </w:p>
     <w:p>
@@ -3534,7 +4419,7 @@
         <w:drawing>
           <wp:inline xmlns:a="http://schemas.openxmlformats.org/drawingml/2006/main" xmlns:pic="http://schemas.openxmlformats.org/drawingml/2006/picture">
             <wp:extent cx="4937760" cy="1410788"/>
-            <wp:docPr id="12" name="Picture 12"/>
+            <wp:docPr id="20" name="Picture 20"/>
             <wp:cNvGraphicFramePr>
               <a:graphicFrameLocks noChangeAspect="1"/>
             </wp:cNvGraphicFramePr>
@@ -3546,7 +4431,7 @@
                     <pic:cNvPicPr/>
                   </pic:nvPicPr>
                   <pic:blipFill>
-                    <a:blip r:embed="rId20"/>
+                    <a:blip r:embed="rId28"/>
                     <a:stretch>
                       <a:fillRect/>
                     </a:stretch>
@@ -3802,7 +4687,21 @@
           <w:b w:val="0"/>
           <w:sz w:val="22"/>
         </w:rPr>
-        <w:t>Its manufacturing philosophy combines lean production, quality systems, automation, supply chain coordination, and increasing digitalisation. For diploma students—especially in Electronics and Communication Engineering—studying Tata Motors provides practical insight into large-scale manufacturing, vehicle electronics integration, safety culture, and sustainable mobility aligned with national industrial growth.</w:t>
+        <w:t>Its manufacturing philosophy combines lean production, quality systems, automation, supply chain coordination, and increasing digitalisation. Product development increasingly blends mechanical engineering with software, electronics, and connectivity—exactly the intersection where diploma ECE students can contribute and learn.</w:t>
+      </w:r>
+    </w:p>
+    <w:p>
+      <w:pPr>
+        <w:spacing w:line="276" w:lineRule="auto" w:after="160"/>
+        <w:jc w:val="both"/>
+      </w:pPr>
+      <w:r>
+        <w:rPr>
+          <w:rFonts w:ascii="Calibri" w:hAnsi="Calibri" w:eastAsia="Calibri"/>
+          <w:b w:val="0"/>
+          <w:sz w:val="22"/>
+        </w:rPr>
+        <w:t>Completing this company research report supports internship readiness: it builds vocabulary for interviews, explains business segments recruiters expect candidates to know, and connects classroom topics (digital electronics, microcontrollers, communication protocols) to shop-floor reality. Tata Motors remains a strong reference organisation for students who want to serve India's industrial growth while building a technical career in automotive or allied industries.</w:t>
       </w:r>
     </w:p>
     <w:p>

</xml_diff>